<commit_message>
WC/2024/227: 9A — intervals interleaved at the end of each sequence; Part B.4 collected as a table
Co-Authored-By: Claude Fable 5.1 <noreply@anthropic.com>
Claude-Session: https://claude.ai/code/session_01PbSZiMB1koFR46V5hQyVcy
</commit_message>
<xml_diff>
--- a/wc2024227/drafts/second-amended-9A/2026-10_SECOND_AMENDED_9A_FINAL.docx
+++ b/wc2024227/drafts/second-amended-9A/2026-10_SECOND_AMENDED_9A_FINAL.docx
@@ -611,7 +611,7 @@
           <w:sz w:val="20"/>
           <w:szCs w:val="20"/>
         </w:rPr>
-        <w:t xml:space="preserve">The Respondent does not allege that access to the database was restored to the Appellant at any time before 18 June 2024. [¶ 55] The duty at (a) remained on the position throughout that period.</w:t>
+        <w:t xml:space="preserve">The Respondent does not allege that access to the database was restored to the Appellant at any time before 18 June 2024. [¶ 55] From 18 July 2023 to 18 June 2024 is eleven months. Nothing is alleged to have happened in that time to restore access. The duty at (a) remained on the position throughout that period.</w:t>
       </w:r>
     </w:p>
     <w:p>
@@ -965,19 +965,10 @@
       <w:r>
         <w:rPr>
           <w:rFonts w:ascii="Arial" w:hAnsi="Arial" w:cs="Arial"/>
-          <w:b/>
-          <w:sz w:val="20"/>
-          <w:szCs w:val="20"/>
-        </w:rPr>
-        <w:t xml:space="preserve">(h) What arrived at the console: the Integrated Respiratory Service, 15 to 20 May 2024. </w:t>
-      </w:r>
-      <w:r>
-        <w:rPr>
-          <w:rFonts w:ascii="Arial" w:hAnsi="Arial" w:cs="Arial"/>
-          <w:sz w:val="20"/>
-          <w:szCs w:val="20"/>
-        </w:rPr>
-        <w:t xml:space="preserve">On 15 May 2024 at 11:47 am an Administration Officer of the Integrated Respiratory Service wrote to Logan Switch, marked of High importance: "Could you please amend your number registry/directory to show #8768 belongs to the Integrated Respiratory Service... We are not Respiratory Medical OPD and we do not have any doctors working out of this area." [¶ 89]</w:t>
+          <w:sz w:val="20"/>
+          <w:szCs w:val="20"/>
+        </w:rPr>
+        <w:t xml:space="preserve">So the sequence at the console was: the first report on 3 May 2024, a second on 8 May (the fifth calendar day after the first), nine occasions in all, no communication to the Switchboard staff about them for five days, eighteen hours and fourteen minutes, and then a new process on 9 May (the sixth day). [¶¶ 56 to 69]</w:t>
       </w:r>
     </w:p>
     <w:p>
@@ -987,10 +978,19 @@
       <w:r>
         <w:rPr>
           <w:rFonts w:ascii="Arial" w:hAnsi="Arial" w:cs="Arial"/>
-          <w:sz w:val="20"/>
-          <w:szCs w:val="20"/>
-        </w:rPr>
-        <w:t xml:space="preserve">The Respondent does not allege that any response was made to that email before 20 May 2024. [¶ 90]</w:t>
+          <w:b/>
+          <w:sz w:val="20"/>
+          <w:szCs w:val="20"/>
+        </w:rPr>
+        <w:t xml:space="preserve">(h) What arrived at the console: the Integrated Respiratory Service, 15 to 20 May 2024. </w:t>
+      </w:r>
+      <w:r>
+        <w:rPr>
+          <w:rFonts w:ascii="Arial" w:hAnsi="Arial" w:cs="Arial"/>
+          <w:sz w:val="20"/>
+          <w:szCs w:val="20"/>
+        </w:rPr>
+        <w:t xml:space="preserve">On 15 May 2024 at 11:47 am an Administration Officer of the Integrated Respiratory Service wrote to Logan Switch, marked of High importance: "Could you please amend your number registry/directory to show #8768 belongs to the Integrated Respiratory Service... We are not Respiratory Medical OPD and we do not have any doctors working out of this area." [¶ 89]</w:t>
       </w:r>
     </w:p>
     <w:p>
@@ -1003,7 +1003,7 @@
           <w:sz w:val="20"/>
           <w:szCs w:val="20"/>
         </w:rPr>
-        <w:t xml:space="preserve">On 20 May at 11:03 am she wrote again, marked of High importance: "Just a courtesy reminder, we continue to get calls put through to us for Respiratory Medical Outpatients... we can not help patients or other clinical staff with OPD issues." [¶¶ 91 to 92]</w:t>
+        <w:t xml:space="preserve">The Respondent does not allege that any response was made to that email before 20 May 2024. [¶ 90]</w:t>
       </w:r>
     </w:p>
     <w:p>
@@ -1016,7 +1016,7 @@
           <w:sz w:val="20"/>
           <w:szCs w:val="20"/>
         </w:rPr>
-        <w:t xml:space="preserve">The Respondent does not allege that any response was made to that email before 2:05 pm that day. [¶ 93]</w:t>
+        <w:t xml:space="preserve">On 20 May at 11:03 am she wrote again, marked of High importance: "Just a courtesy reminder, we continue to get calls put through to us for Respiratory Medical Outpatients... we can not help patients or other clinical staff with OPD issues." [¶¶ 91 to 92]</w:t>
       </w:r>
     </w:p>
     <w:p>
@@ -1029,7 +1029,7 @@
           <w:sz w:val="20"/>
           <w:szCs w:val="20"/>
         </w:rPr>
-        <w:t xml:space="preserve">At 2:05 pm, from the Logan Switch account and within the office hours stated to all Switchboard staff on 17 May 2024, the Appellant wrote identifying the cause as modifications made to the document "Outpatients Department - Clinic contact Details" on 22 February 2024, and recommending a modification and review of that document. [¶¶ 94 to 96] That email was sent three hours and two minutes after the Service's second email, and five days, two hours and eighteen minutes after its first. [¶¶ 97 to 98]</w:t>
+        <w:t xml:space="preserve">The Respondent does not allege that any response was made to that email before 2:05 pm that day. [¶ 93]</w:t>
       </w:r>
     </w:p>
     <w:p>
@@ -1042,7 +1042,7 @@
           <w:sz w:val="20"/>
           <w:szCs w:val="20"/>
         </w:rPr>
-        <w:t xml:space="preserve">The Respondent does not allege that the Appellant was rostered to work after 2:05 pm that day. [¶ 99] The reply at 4:30 pm stated: "Thank you for bringing this to my attention however this task was being actioned. I had discussed with Richard this morning about the update of outpatients respiratory/medical." [¶¶ 100, 104] It was sent two hours and twenty-five minutes after the Appellant's email, and two hours after the conclusion of the office hours stated to all Switchboard staff on 17 May 2024. [¶¶ 102 to 103]</w:t>
+        <w:t xml:space="preserve">At 2:05 pm, from the Logan Switch account and within the office hours stated to all Switchboard staff on 17 May 2024, the Appellant wrote identifying the cause as modifications made to the document "Outpatients Department - Clinic contact Details" on 22 February 2024, and recommending a modification and review of that document. [¶¶ 94 to 96] That email was sent three hours and two minutes after the Service's second email, and five days, two hours and eighteen minutes after its first. [¶¶ 97 to 98]</w:t>
       </w:r>
     </w:p>
     <w:p>
@@ -1055,7 +1055,7 @@
           <w:sz w:val="20"/>
           <w:szCs w:val="20"/>
         </w:rPr>
-        <w:t xml:space="preserve">The Respondent's amended List of Documents records no document created on 20 May 2024 recording that discussion, and no communication sent by either named person to the Service on that day; and the Respondent does not allege that the other named person communicated with the Service on that day. [¶¶ 105 to 108]</w:t>
+        <w:t xml:space="preserve">The Respondent does not allege that the Appellant was rostered to work after 2:05 pm that day. [¶ 99] The reply at 4:30 pm stated: "Thank you for bringing this to my attention however this task was being actioned. I had discussed with Richard this morning about the update of outpatients respiratory/medical." [¶¶ 100, 104] It was sent two hours and twenty-five minutes after the Appellant's email, and two hours after the conclusion of the office hours stated to all Switchboard staff on 17 May 2024. [¶¶ 102 to 103]</w:t>
       </w:r>
     </w:p>
     <w:p>
@@ -1068,7 +1068,7 @@
           <w:sz w:val="20"/>
           <w:szCs w:val="20"/>
         </w:rPr>
-        <w:t xml:space="preserve">The Respondent does not allege that the contact-details document was amended on or before 20 May 2024, or that the Switchboard staff were notified of the modifications made to it on 22 February 2024. [¶¶ 109 to 110]</w:t>
+        <w:t xml:space="preserve">The Respondent's amended List of Documents records no document created on 20 May 2024 recording that discussion, and no communication sent by either named person to the Service on that day; and the Respondent does not allege that the other named person communicated with the Service on that day. [¶¶ 105 to 108]</w:t>
       </w:r>
     </w:p>
     <w:p>
@@ -1078,19 +1078,10 @@
       <w:r>
         <w:rPr>
           <w:rFonts w:ascii="Arial" w:hAnsi="Arial" w:cs="Arial"/>
-          <w:b/>
-          <w:sz w:val="20"/>
-          <w:szCs w:val="20"/>
-        </w:rPr>
-        <w:t xml:space="preserve">(i) The office hours of the manager to whom the position reports. </w:t>
-      </w:r>
-      <w:r>
-        <w:rPr>
-          <w:rFonts w:ascii="Arial" w:hAnsi="Arial" w:cs="Arial"/>
-          <w:sz w:val="20"/>
-          <w:szCs w:val="20"/>
-        </w:rPr>
-        <w:t xml:space="preserve">The position reports to the Switchboard Manager, and the role description names that person as the contact for the position. [¶¶ 3 to 4]</w:t>
+          <w:sz w:val="20"/>
+          <w:szCs w:val="20"/>
+        </w:rPr>
+        <w:t xml:space="preserve">The Respondent does not allege that the contact-details document was amended on or before 20 May 2024, or that the Switchboard staff were notified of the modifications made to it on 22 February 2024. [¶¶ 109 to 110]</w:t>
       </w:r>
     </w:p>
     <w:p>
@@ -1103,7 +1094,7 @@
           <w:sz w:val="20"/>
           <w:szCs w:val="20"/>
         </w:rPr>
-        <w:t xml:space="preserve">On 23 August 2023 at 2:18 pm she wrote to Logan Switch with the subject "What's Chloe's Hours?!": "I am fulltime and work flex hours - You may have noticed recently I am starting at different times in the morning and finish at different times in the afternoon", and "My hours would range from starting between 6-9am and finishing 2-5pm." [¶¶ 70 to 72]</w:t>
+        <w:t xml:space="preserve">So the sequence was: the Service's first email on 15 May 2024; its second on 20 May, the fifth calendar day; the Appellant's escalation five days, two hours and eighteen minutes after the first email and three hours and two minutes after the second; and the reply two hours and twenty-five minutes after that, two hours after the stated office hours had ended. In that time the Respondent alleges no response to the Service, no amendment of the document, and no notice to the staff of the change made to it on 22 February 2024. [¶¶ 90, 93, 97 to 98, 102 to 103, 105 to 110]</w:t>
       </w:r>
     </w:p>
     <w:p>
@@ -1113,10 +1104,19 @@
       <w:r>
         <w:rPr>
           <w:rFonts w:ascii="Arial" w:hAnsi="Arial" w:cs="Arial"/>
-          <w:sz w:val="20"/>
-          <w:szCs w:val="20"/>
-        </w:rPr>
-        <w:t xml:space="preserve">The Respondent does not allege that fixed office hours were stated to the Switchboard staff at any time between 23 August 2023 and 17 May 2024. [¶ 73]</w:t>
+          <w:b/>
+          <w:sz w:val="20"/>
+          <w:szCs w:val="20"/>
+        </w:rPr>
+        <w:t xml:space="preserve">(i) The office hours of the manager to whom the position reports. </w:t>
+      </w:r>
+      <w:r>
+        <w:rPr>
+          <w:rFonts w:ascii="Arial" w:hAnsi="Arial" w:cs="Arial"/>
+          <w:sz w:val="20"/>
+          <w:szCs w:val="20"/>
+        </w:rPr>
+        <w:t xml:space="preserve">The position reports to the Switchboard Manager, and the role description names that person as the contact for the position. [¶¶ 3 to 4]</w:t>
       </w:r>
     </w:p>
     <w:p>
@@ -1129,7 +1129,7 @@
           <w:sz w:val="20"/>
           <w:szCs w:val="20"/>
         </w:rPr>
-        <w:t xml:space="preserve">On 15 May 2024 at 1:15 pm the Appellant wrote to the Manager and Logan Switch, copied to the Switchboard staff, the Director and LBH_HR, asking that she share her office hours so the department could be aware of her regular schedule, noting inconsistency in arrival and departure times, and asking that "any directives and changes within the department is made in consultation with the team". [¶¶ 74 to 75]</w:t>
+        <w:t xml:space="preserve">On 23 August 2023 at 2:18 pm she wrote to Logan Switch with the subject "What's Chloe's Hours?!": "I am fulltime and work flex hours - You may have noticed recently I am starting at different times in the morning and finish at different times in the afternoon", and "My hours would range from starting between 6-9am and finishing 2-5pm." [¶¶ 70 to 72]</w:t>
       </w:r>
     </w:p>
     <w:p>
@@ -1142,7 +1142,7 @@
           <w:sz w:val="20"/>
           <w:szCs w:val="20"/>
         </w:rPr>
-        <w:t xml:space="preserve">At 6:23 pm the Director replied, copied to the Manager and marked of High importance, stating that his email "did not demonstrate our iCARE2 value of Respect and did not comply with our Code of conduct", and asked him to retract it. [¶¶ 76 to 77]</w:t>
+        <w:t xml:space="preserve">The Respondent does not allege that fixed office hours were stated to the Switchboard staff at any time between 23 August 2023 and 17 May 2024. [¶ 73] That is nine months.</w:t>
       </w:r>
     </w:p>
     <w:p>
@@ -1155,7 +1155,7 @@
           <w:sz w:val="20"/>
           <w:szCs w:val="20"/>
         </w:rPr>
-        <w:t xml:space="preserve">At 7:09 pm the Appellant replied that "Requesting clarity on business hours is a reasonable" request. [¶ 78]</w:t>
+        <w:t xml:space="preserve">On 15 May 2024 at 1:15 pm the Appellant wrote to the Manager and Logan Switch, copied to the Switchboard staff, the Director and LBH_HR, asking that she share her office hours so the department could be aware of her regular schedule, noting inconsistency in arrival and departure times, and asking that "any directives and changes within the department is made in consultation with the team". [¶¶ 74 to 75]</w:t>
       </w:r>
     </w:p>
     <w:p>
@@ -1168,7 +1168,7 @@
           <w:sz w:val="20"/>
           <w:szCs w:val="20"/>
         </w:rPr>
-        <w:t xml:space="preserve">On 17 May 2024 at 9:30 am the Manager wrote to the whole department, headed "Switchboard Manager - On call and Hours", stating that her hours "can vary", that "I will be in later between 0800-830am. Otherwise my hours are from 06:30-14:30", that "I will not be in the office until around 11am on Monday 20.05.2024", and that "Moving forward so communication is clear for the team, I will be sending an email to switch to advise of any change to my office hours for the week". [¶¶ 81 to 84, 113] Those stated office hours concluded at 2:30 pm. [¶ 88]</w:t>
+        <w:t xml:space="preserve">At 6:23 pm the Director replied, copied to the Manager and marked of High importance, stating that his email "did not demonstrate our iCARE2 value of Respect and did not comply with our Code of conduct", and asked him to retract it. [¶¶ 76 to 77]</w:t>
       </w:r>
     </w:p>
     <w:p>
@@ -1181,7 +1181,7 @@
           <w:sz w:val="20"/>
           <w:szCs w:val="20"/>
         </w:rPr>
-        <w:t xml:space="preserve">On 21 May 2024 at 2:53 pm the Director replied that she would follow up on the issues raised, and asked "can I ask was there one or more particular changes and/or directives where you had concerns about consultation and communication?" [¶¶ 79 to 80]</w:t>
+        <w:t xml:space="preserve">At 7:09 pm the Appellant replied that "Requesting clarity on business hours is a reasonable" request. [¶ 78]</w:t>
       </w:r>
     </w:p>
     <w:p>
@@ -1194,7 +1194,7 @@
           <w:sz w:val="20"/>
           <w:szCs w:val="20"/>
         </w:rPr>
-        <w:t xml:space="preserve">On 18 June 2024 at 8:58 am the Manager wrote to Logan Switch: "I am taking today off, and hopefully will be back tomorrow", and "I am sorry I haven't been there for you all over the past week." [¶¶ 85 to 87]</w:t>
+        <w:t xml:space="preserve">On 17 May 2024 at 9:30 am the Manager wrote to the whole department, headed "Switchboard Manager - On call and Hours", stating that her hours "can vary", that "I will be in later between 0800-830am. Otherwise my hours are from 06:30-14:30", that "I will not be in the office until around 11am on Monday 20.05.2024", and that "Moving forward so communication is clear for the team, I will be sending an email to switch to advise of any change to my office hours for the week". [¶¶ 81 to 84, 113] Those stated office hours concluded at 2:30 pm. [¶ 88]</w:t>
       </w:r>
     </w:p>
     <w:p>
@@ -1204,19 +1204,10 @@
       <w:r>
         <w:rPr>
           <w:rFonts w:ascii="Arial" w:hAnsi="Arial" w:cs="Arial"/>
-          <w:b/>
-          <w:sz w:val="20"/>
-          <w:szCs w:val="20"/>
-        </w:rPr>
-        <w:t xml:space="preserve">(j) The Communication Book, 6 June 2023. </w:t>
-      </w:r>
-      <w:r>
-        <w:rPr>
-          <w:rFonts w:ascii="Arial" w:hAnsi="Arial" w:cs="Arial"/>
-          <w:sz w:val="20"/>
-          <w:szCs w:val="20"/>
-        </w:rPr>
-        <w:t xml:space="preserve">A key responsibility of the position is to maintain discretion and exercise judgement where necessary to resolve problems within the scope of the role, in situations where precedence has not been set and procedures are not defined. [¶ 9]</w:t>
+          <w:sz w:val="20"/>
+          <w:szCs w:val="20"/>
+        </w:rPr>
+        <w:t xml:space="preserve">On 21 May 2024 at 2:53 pm the Director replied that she would follow up on the issues raised, and asked "can I ask was there one or more particular changes and/or directives where you had concerns about consultation and communication?" [¶¶ 79 to 80]</w:t>
       </w:r>
     </w:p>
     <w:p>
@@ -1229,7 +1220,7 @@
           <w:sz w:val="20"/>
           <w:szCs w:val="20"/>
         </w:rPr>
-        <w:t xml:space="preserve">At 9:57 am on 6 June 2023 the Switchboard Manager wrote to Logan Switch that the book "is not used to simply put your point across or make any indirect comments towards the team". [¶¶ 148 to 149]</w:t>
+        <w:t xml:space="preserve">On 18 June 2024 at 8:58 am the Manager wrote to Logan Switch: "I am taking today off, and hopefully will be back tomorrow", and "I am sorry I haven't been there for you all over the past week." [¶¶ 85 to 87]</w:t>
       </w:r>
     </w:p>
     <w:p>
@@ -1239,10 +1230,19 @@
       <w:r>
         <w:rPr>
           <w:rFonts w:ascii="Arial" w:hAnsi="Arial" w:cs="Arial"/>
-          <w:sz w:val="20"/>
-          <w:szCs w:val="20"/>
-        </w:rPr>
-        <w:t xml:space="preserve">At 4:05 pm she wrote to the Director: "I was not aware of who put this entry in at the time but I took it out last week", and that she felt it was being used as a "burn book" more than a professional tool. [¶¶ 145 to 147]</w:t>
+          <w:b/>
+          <w:sz w:val="20"/>
+          <w:szCs w:val="20"/>
+        </w:rPr>
+        <w:t xml:space="preserve">(j) The Communication Book, 6 June 2023. </w:t>
+      </w:r>
+      <w:r>
+        <w:rPr>
+          <w:rFonts w:ascii="Arial" w:hAnsi="Arial" w:cs="Arial"/>
+          <w:sz w:val="20"/>
+          <w:szCs w:val="20"/>
+        </w:rPr>
+        <w:t xml:space="preserve">A key responsibility of the position is to maintain discretion and exercise judgement where necessary to resolve problems within the scope of the role, in situations where precedence has not been set and procedures are not defined. [¶ 9]</w:t>
       </w:r>
     </w:p>
     <w:p>
@@ -1255,7 +1255,7 @@
           <w:sz w:val="20"/>
           <w:szCs w:val="20"/>
         </w:rPr>
-        <w:t xml:space="preserve">The Respondent's pleading admits that pages were removed on or around 6 June 2023, and says the event was reported to the Director by email that day. [¶¶ 143 to 144]</w:t>
+        <w:t xml:space="preserve">At 9:57 am on 6 June 2023 the Switchboard Manager wrote to Logan Switch that the book "is not used to simply put your point across or make any indirect comments towards the team". [¶¶ 148 to 149]</w:t>
       </w:r>
     </w:p>
     <w:p>
@@ -1268,7 +1268,7 @@
           <w:sz w:val="20"/>
           <w:szCs w:val="20"/>
         </w:rPr>
-        <w:t xml:space="preserve">On 18 February 2026 it admitted that a page was removed from the workplace communications book, and did not admit that the page contained the Appellant's handwriting "because the respondent does not have a copy of the page". [¶ 288]</w:t>
+        <w:t xml:space="preserve">At 4:05 pm she wrote to the Director: "I was not aware of who put this entry in at the time but I took it out last week", and that she felt it was being used as a "burn book" more than a professional tool. [¶¶ 145 to 147]</w:t>
       </w:r>
     </w:p>
     <w:p>
@@ -1281,7 +1281,7 @@
           <w:sz w:val="20"/>
           <w:szCs w:val="20"/>
         </w:rPr>
-        <w:t xml:space="preserve">The Respondent does not identify the entry removed or its author, does not allege that the removed page has been located or that any copy exists, does not allege that any entry made by the Appellant remains in the book, and does not allege that the book ceased to be in its possession during his employment. [¶¶ 150 to 153]</w:t>
+        <w:t xml:space="preserve">The Respondent's pleading admits that pages were removed on or around 6 June 2023, and says the event was reported to the Director by email that day. [¶¶ 143 to 144]</w:t>
       </w:r>
     </w:p>
     <w:p>
@@ -1294,7 +1294,7 @@
           <w:sz w:val="20"/>
           <w:szCs w:val="20"/>
         </w:rPr>
-        <w:t xml:space="preserve">The Respondent has admitted that it does not have a copy of the removed page. [¶ 288]</w:t>
+        <w:t xml:space="preserve">On 18 February 2026 it admitted that a page was removed from the workplace communications book, and did not admit that the page contained the Appellant's handwriting "because the respondent does not have a copy of the page". [¶ 288]</w:t>
       </w:r>
     </w:p>
     <w:p>
@@ -1304,19 +1304,10 @@
       <w:r>
         <w:rPr>
           <w:rFonts w:ascii="Arial" w:hAnsi="Arial" w:cs="Arial"/>
-          <w:b/>
-          <w:sz w:val="20"/>
-          <w:szCs w:val="20"/>
-        </w:rPr>
-        <w:t xml:space="preserve">(k) The matters raised in August and September 2023, and the response. </w:t>
-      </w:r>
-      <w:r>
-        <w:rPr>
-          <w:rFonts w:ascii="Arial" w:hAnsi="Arial" w:cs="Arial"/>
-          <w:sz w:val="20"/>
-          <w:szCs w:val="20"/>
-        </w:rPr>
-        <w:t xml:space="preserve">On 7 August 2023 at 12:21 pm the Appellant wrote to the Manager, the Director, Ms Conaghan and Ms Smith, marked of High importance, asking to "formally adhoc an additional 2 shifts per fortnight" under clause 11.7 of the agreement, and: "Please give me some space and stop with any further communication as I have had enough of it." [¶¶ 26 to 27, 155]</w:t>
+          <w:sz w:val="20"/>
+          <w:szCs w:val="20"/>
+        </w:rPr>
+        <w:t xml:space="preserve">The Respondent does not identify the entry removed or its author, does not allege that the removed page has been located or that any copy exists, does not allege that any entry made by the Appellant remains in the book, and does not allege that the book ceased to be in its possession during his employment. [¶¶ 150 to 153]</w:t>
       </w:r>
     </w:p>
     <w:p>
@@ -1329,7 +1320,7 @@
           <w:sz w:val="20"/>
           <w:szCs w:val="20"/>
         </w:rPr>
-        <w:t xml:space="preserve">At 1:43 pm the Manager replied, apologising for the rostered shift and confirming it was a rostering error, and asking "Would you like me to roster you off tomorrow Tuesday 8th 0700-1500 to give you the required rest period". [¶¶ 156 to 157]</w:t>
+        <w:t xml:space="preserve">The Respondent has admitted that it does not have a copy of the removed page. [¶ 288]</w:t>
       </w:r>
     </w:p>
     <w:p>
@@ -1339,10 +1330,19 @@
       <w:r>
         <w:rPr>
           <w:rFonts w:ascii="Arial" w:hAnsi="Arial" w:cs="Arial"/>
-          <w:sz w:val="20"/>
-          <w:szCs w:val="20"/>
-        </w:rPr>
-        <w:t xml:space="preserve">At 3:13 pm the Director replied. [¶ 158]</w:t>
+          <w:b/>
+          <w:sz w:val="20"/>
+          <w:szCs w:val="20"/>
+        </w:rPr>
+        <w:t xml:space="preserve">(k) The matters raised in August and September 2023, and the response. </w:t>
+      </w:r>
+      <w:r>
+        <w:rPr>
+          <w:rFonts w:ascii="Arial" w:hAnsi="Arial" w:cs="Arial"/>
+          <w:sz w:val="20"/>
+          <w:szCs w:val="20"/>
+        </w:rPr>
+        <w:t xml:space="preserve">On 7 August 2023 at 12:21 pm the Appellant wrote to the Manager, the Director, Ms Conaghan and Ms Smith, marked of High importance, asking to "formally adhoc an additional 2 shifts per fortnight" under clause 11.7 of the agreement, and: "Please give me some space and stop with any further communication as I have had enough of it." [¶¶ 26 to 27, 155]</w:t>
       </w:r>
     </w:p>
     <w:p>
@@ -1355,7 +1355,7 @@
           <w:sz w:val="20"/>
           <w:szCs w:val="20"/>
         </w:rPr>
-        <w:t xml:space="preserve">On 8 August 2023 at 4:15 pm the Director wrote regarding an additional shift to replace the shift not worked due to a rostering error. [¶ 28]</w:t>
+        <w:t xml:space="preserve">At 1:43 pm the Manager replied, apologising for the rostered shift and confirming it was a rostering error, and asking "Would you like me to roster you off tomorrow Tuesday 8th 0700-1500 to give you the required rest period". [¶¶ 156 to 157]</w:t>
       </w:r>
     </w:p>
     <w:p>
@@ -1368,7 +1368,7 @@
           <w:sz w:val="20"/>
           <w:szCs w:val="20"/>
         </w:rPr>
-        <w:t xml:space="preserve">On 29 August 2023 she sent HR Policy E12, and on 4 September 2023 the Appellant replied. [¶¶ 160 to 161]</w:t>
+        <w:t xml:space="preserve">At 3:13 pm the Director replied. [¶ 158]</w:t>
       </w:r>
     </w:p>
     <w:p>
@@ -1381,7 +1381,7 @@
           <w:sz w:val="20"/>
           <w:szCs w:val="20"/>
         </w:rPr>
-        <w:t xml:space="preserve">On 31 August 2023 he provided a written application headed "Request to Increase Working Hours to Full Time Rotational Roster", expressing willingness to take on additional night shifts. [¶¶ 30 to 31]</w:t>
+        <w:t xml:space="preserve">On 8 August 2023 at 4:15 pm the Director wrote regarding an additional shift to replace the shift not worked due to a rostering error. [¶ 28]</w:t>
       </w:r>
     </w:p>
     <w:p>
@@ -1394,7 +1394,7 @@
           <w:sz w:val="20"/>
           <w:szCs w:val="20"/>
         </w:rPr>
-        <w:t xml:space="preserve">On 4 September 2023 he confirmed that he was able and willing to work any roster presented to him including the full 24-hour rotational schedule, that he had no issues with shift work, and attached a draft roster spreadsheet. [¶¶ 33 to 35]</w:t>
+        <w:t xml:space="preserve">On 29 August 2023 she sent HR Policy E12, and on 4 September 2023 the Appellant replied. [¶¶ 160 to 161]</w:t>
       </w:r>
     </w:p>
     <w:p>
@@ -1407,7 +1407,7 @@
           <w:sz w:val="20"/>
           <w:szCs w:val="20"/>
         </w:rPr>
-        <w:t xml:space="preserve">On 27 September 2023 the Manager wrote with the subject "Approved - Permanent Full Time FTE", stating she was happy for him to commence full-time hours from 16 October 2023. [¶¶ 36 to 38]</w:t>
+        <w:t xml:space="preserve">On 31 August 2023 he provided a written application headed "Request to Increase Working Hours to Full Time Rotational Roster", expressing willingness to take on additional night shifts. [¶¶ 30 to 31]</w:t>
       </w:r>
     </w:p>
     <w:p>
@@ -1420,7 +1420,7 @@
           <w:sz w:val="20"/>
           <w:szCs w:val="20"/>
         </w:rPr>
-        <w:t xml:space="preserve">On 8 August 2023 he had confirmed that he would work the replacement shift and was looking to pick up another. [¶ 29] On 8 September 2023 the Director wrote that she was "glad to hear things seem to be going well with Chloe" and glad that he had applied for the additional shifts through the recent EOI. [¶ 36]</w:t>
+        <w:t xml:space="preserve">On 4 September 2023 he confirmed that he was able and willing to work any roster presented to him including the full 24-hour rotational schedule, that he had no issues with shift work, and attached a draft roster spreadsheet. [¶¶ 33 to 35]</w:t>
       </w:r>
     </w:p>
     <w:p>
@@ -1430,19 +1430,10 @@
       <w:r>
         <w:rPr>
           <w:rFonts w:ascii="Arial" w:hAnsi="Arial" w:cs="Arial"/>
-          <w:b/>
-          <w:sz w:val="20"/>
-          <w:szCs w:val="20"/>
-        </w:rPr>
-        <w:t xml:space="preserve">(l) The special pandemic leave application, February 2024 - the sequence. </w:t>
-      </w:r>
-      <w:r>
-        <w:rPr>
-          <w:rFonts w:ascii="Arial" w:hAnsi="Arial" w:cs="Arial"/>
-          <w:sz w:val="20"/>
-          <w:szCs w:val="20"/>
-        </w:rPr>
-        <w:t xml:space="preserve">On 20 February 2024 the Appellant messaged the Manager that he had tested positive for COVID-19. She replied that he was eligible for up to five days' paid leave on photo evidence of the test, and "requested that you send it to her so she could submit it in MyHR". [¶ 136] He sent it to her as she asked. She then asked him to submit the Special Pandemic Leave request through myHR himself and attach a statutory declaration or photo evidence of his test. [¶ 132] The myHR submissions report records the initiator of that request as the Appellant [¶¶ 140 to 141], and the Respondent does not allege that any other Switchboard employee was required to submit such a request personally through myHR in February 2024. [¶ 142] The leave request history for Process Reference 15480560 records him creating a draft at 11:24:48 that morning and submitting the request at 11:41:27. [¶¶ 114 to 115] So the material was provided to the Manager once, as requested, and then had to be submitted by him through the system: once that morning, and, after two declines, twice more.</w:t>
+          <w:sz w:val="20"/>
+          <w:szCs w:val="20"/>
+        </w:rPr>
+        <w:t xml:space="preserve">On 27 September 2023 the Manager wrote with the subject "Approved - Permanent Full Time FTE", stating she was happy for him to commence full-time hours from 16 October 2023. [¶¶ 36 to 38]</w:t>
       </w:r>
     </w:p>
     <w:p>
@@ -1455,7 +1446,7 @@
           <w:sz w:val="20"/>
           <w:szCs w:val="20"/>
         </w:rPr>
-        <w:t xml:space="preserve">It records the request being declined at 12:23:43 on 21 February 2024; submitted again at 06:07:32 on 28 February; declined again at 09:06:07 on 29 February; submitted a third time at 11:07:28 that morning; and approved at 11:21:03. [¶¶ 116 to 120]</w:t>
+        <w:t xml:space="preserve">On 8 August 2023 he had confirmed that he would work the replacement shift and was looking to pick up another. [¶ 29] On 8 September 2023 the Director wrote that she was "glad to hear things seem to be going well with Chloe" and glad that he had applied for the additional shifts through the recent EOI. [¶ 36]</w:t>
       </w:r>
     </w:p>
     <w:p>
@@ -1465,10 +1456,19 @@
       <w:r>
         <w:rPr>
           <w:rFonts w:ascii="Arial" w:hAnsi="Arial" w:cs="Arial"/>
-          <w:sz w:val="20"/>
-          <w:szCs w:val="20"/>
-        </w:rPr>
-        <w:t xml:space="preserve">It records the Appellant as having submitted the request on three occasions and the Manager as having declined it on two, and records the Director as approving it at 16:05:08 on 1 March 2024. [¶¶ 121 to 123] The approval followed the third submission by thirteen minutes and thirty-five seconds; the interval from draft to final approval was ten days, four hours, forty minutes and twenty seconds. [¶¶ 124 to 125] Two reasons for the declines appear on the record and they are not the same. The review decision records that on 21 February the Manager messaged that she had to decline because the minimum period for COVID leave was five days for a positive staff member, that she noted the statutory declaration provided was sufficient evidence, and that she asked him to resubmit his leave days. [¶¶ 137 to 138]</w:t>
+          <w:b/>
+          <w:sz w:val="20"/>
+          <w:szCs w:val="20"/>
+        </w:rPr>
+        <w:t xml:space="preserve">(l) The special pandemic leave application, February 2024 - the sequence. </w:t>
+      </w:r>
+      <w:r>
+        <w:rPr>
+          <w:rFonts w:ascii="Arial" w:hAnsi="Arial" w:cs="Arial"/>
+          <w:sz w:val="20"/>
+          <w:szCs w:val="20"/>
+        </w:rPr>
+        <w:t xml:space="preserve">On 20 February 2024 the Appellant messaged the Manager that he had tested positive for COVID-19. She replied that he was eligible for up to five days' paid leave on photo evidence of the test, and "requested that you send it to her so she could submit it in MyHR". [¶ 136] He sent it to her as she asked. She then asked him to submit the Special Pandemic Leave request through myHR himself and attach a statutory declaration or photo evidence of his test. [¶ 132] The myHR submissions report records the initiator of that request as the Appellant [¶¶ 140 to 141], and the Respondent does not allege that any other Switchboard employee was required to submit such a request personally through myHR in February 2024. [¶ 142] The leave request history for Process Reference 15480560 records him creating a draft at 11:24:48 that morning and submitting the request at 11:41:27. [¶¶ 114 to 115] So the material was provided to the Manager once, as requested, and then had to be submitted by him through the system: once that morning, and, after two declines, twice more.</w:t>
       </w:r>
     </w:p>
     <w:p>
@@ -1481,7 +1481,7 @@
           <w:sz w:val="20"/>
           <w:szCs w:val="20"/>
         </w:rPr>
-        <w:t xml:space="preserve">It records the Appellant messaging that he was confused about why his amended request was declined, and that he had done everything as required. [¶ 139]</w:t>
+        <w:t xml:space="preserve">It records the request being declined at 12:23:43 on 21 February 2024; submitted again at 06:07:32 on 28 February; declined again at 09:06:07 on 29 February; submitted a third time at 11:07:28 that morning; and approved at 11:21:03. [¶¶ 116 to 120]</w:t>
       </w:r>
     </w:p>
     <w:p>
@@ -1494,7 +1494,46 @@
           <w:sz w:val="20"/>
           <w:szCs w:val="20"/>
         </w:rPr>
+        <w:t xml:space="preserve">It records the Appellant as having submitted the request on three occasions and the Manager as having declined it on two, and records the Director as approving it at 16:05:08 on 1 March 2024. [¶¶ 121 to 123] The approval followed the third submission by thirteen minutes and thirty-five seconds; the interval from draft to final approval was ten days, four hours, forty minutes and twenty seconds. [¶¶ 124 to 125] Two reasons for the declines appear on the record and they are not the same. The review decision records that on 21 February the Manager messaged that she had to decline because the minimum period for COVID leave was five days for a positive staff member, that she noted the statutory declaration provided was sufficient evidence, and that she asked him to resubmit his leave days. [¶¶ 137 to 138]</w:t>
+      </w:r>
+    </w:p>
+    <w:p>
+      <w:pPr>
+        <w:spacing w:before="0" w:after="100" w:line="264" w:lineRule="auto"/>
+      </w:pPr>
+      <w:r>
+        <w:rPr>
+          <w:rFonts w:ascii="Arial" w:hAnsi="Arial" w:cs="Arial"/>
+          <w:sz w:val="20"/>
+          <w:szCs w:val="20"/>
+        </w:rPr>
+        <w:t xml:space="preserve">It records the Appellant messaging that he was confused about why his amended request was declined, and that he had done everything as required. [¶ 139]</w:t>
+      </w:r>
+    </w:p>
+    <w:p>
+      <w:pPr>
+        <w:spacing w:before="0" w:after="100" w:line="264" w:lineRule="auto"/>
+      </w:pPr>
+      <w:r>
+        <w:rPr>
+          <w:rFonts w:ascii="Arial" w:hAnsi="Arial" w:cs="Arial"/>
+          <w:sz w:val="20"/>
+          <w:szCs w:val="20"/>
+        </w:rPr>
         <w:t xml:space="preserve">The Respondent pleads that she declined the application because on her assessment the required statutory declaration was not attached; that "a review indicates that in fact, the attachments were present on the appellant's submission"; and that this was human error on the background of high work demands. [¶¶ 133 to 135]</w:t>
+      </w:r>
+    </w:p>
+    <w:p>
+      <w:pPr>
+        <w:spacing w:before="0" w:after="100" w:line="264" w:lineRule="auto"/>
+      </w:pPr>
+      <w:r>
+        <w:rPr>
+          <w:rFonts w:ascii="Arial" w:hAnsi="Arial" w:cs="Arial"/>
+          <w:sz w:val="20"/>
+          <w:szCs w:val="20"/>
+        </w:rPr>
+        <w:t xml:space="preserve">So the request was made on 20 February 2024 and finally approved on 1 March 2024: ten days, four hours, forty minutes and twenty seconds from draft to final approval, with two declines and three submissions in between. The third submission was approved in thirteen minutes and thirty-five seconds. [¶¶ 114 to 125]</w:t>
       </w:r>
     </w:p>
     <w:p>
@@ -2028,7 +2067,7 @@
           <w:sz w:val="20"/>
           <w:szCs w:val="20"/>
         </w:rPr>
-        <w:t xml:space="preserve">The shift of 9 February 2024 was not corrected on that payslip. On Payroll's account it "was amended with an exemption for the Validation of Claims form on the 30.06.2025 and is on Payslip 07", for the pay period 9 to 22 June 2025, pay date 2 July 2025: after the date of injury, after the Respondent's review decision of 24 October 2024, and after this appeal was commenced, with an exemption from the form the Manager had asked the Appellant to sign on 28 May 2024. [¶¶ 196 to 197] The Respondent's pleading and its outlines of evidence (Part B.6) describe the pay issues as "corrected" and "remedied in a timely manner" [¶ 207] without stating these dates.</w:t>
+        <w:t xml:space="preserve">The shift of 9 February 2024 was not corrected on that payslip. On Payroll's account it "was amended with an exemption for the Validation of Claims form on the 30.06.2025 and is on Payslip 07", for the pay period 9 to 22 June 2025, pay date 2 July 2025. That was 425 days after Payroll's direction of 3 May 2024 (the amendment itself being dated 30 June 2025); after the date of injury; after the Respondent's review decision of 24 October 2024; and after this appeal was commenced. It was made with an exemption from the form the Manager had asked the Appellant to sign on 28 May 2024. [¶¶ 196 to 197] The Respondent's pleading and its outlines of evidence (Part B.6) describe the pay issues as "corrected" and "remedied in a timely manner" [¶ 207] without stating these dates.</w:t>
       </w:r>
     </w:p>
     <w:p>
@@ -2817,6 +2856,19 @@
       <w:r>
         <w:rPr>
           <w:rFonts w:ascii="Arial" w:hAnsi="Arial" w:cs="Arial"/>
+          <w:sz w:val="20"/>
+          <w:szCs w:val="20"/>
+        </w:rPr>
+        <w:t xml:space="preserve">So the enquiry of 8 April 2024 was answered on 1 May 2024, 23 days later, with a refusal. In between were the acknowledgment of 9 April, the escalation to Human Resources, and the Appellant's email of 24 April; no other response is alleged. [¶¶ 242 to 250]</w:t>
+      </w:r>
+    </w:p>
+    <w:p>
+      <w:pPr>
+        <w:spacing w:before="0" w:after="100" w:line="264" w:lineRule="auto"/>
+      </w:pPr>
+      <w:r>
+        <w:rPr>
+          <w:rFonts w:ascii="Arial" w:hAnsi="Arial" w:cs="Arial"/>
           <w:b/>
           <w:sz w:val="20"/>
           <w:szCs w:val="20"/>
@@ -3242,131 +3294,971 @@
           <w:sz w:val="20"/>
           <w:szCs w:val="20"/>
         </w:rPr>
-        <w:t xml:space="preserve">The following intervals are worked out from dates and times admitted by the Respondent. They are arithmetic only. They do not depend on whether any statement in a document is true.</w:t>
+        <w:t xml:space="preserve">The intervals below are worked out from dates and times admitted by the Respondent. They are arithmetic only. They do not depend on whether any statement in a document is true. Each is pleaded in its place in Part B.2; this table collects them.</w:t>
       </w:r>
     </w:p>
+    <w:tbl>
+      <w:tblPr>
+        <w:tblW w:w="9638" w:type="dxa"/>
+        <w:tblBorders>
+          <w:top w:val="single" w:sz="4"/>
+          <w:left w:val="single" w:sz="4"/>
+          <w:bottom w:val="single" w:sz="4"/>
+          <w:right w:val="single" w:sz="4"/>
+          <w:insideH w:val="single" w:sz="4"/>
+          <w:insideV w:val="single" w:sz="4"/>
+        </w:tblBorders>
+      </w:tblPr>
+      <w:tblGrid>
+        <w:gridCol w:w="4700"/>
+        <w:gridCol w:w="1900"/>
+        <w:gridCol w:w="1700"/>
+        <w:gridCol w:w="1338"/>
+      </w:tblGrid>
+      <w:tr>
+        <w:trPr>
+          <w:tblHeader/>
+        </w:trPr>
+        <w:tc>
+          <w:tcPr>
+            <w:shd w:val="clear" w:color="auto" w:fill="E9E9E9"/>
+          </w:tcPr>
+          <w:p>
+            <w:pPr>
+              <w:spacing w:after="0"/>
+            </w:pPr>
+            <w:r>
+              <w:rPr>
+                <w:rFonts w:ascii="Arial" w:hAnsi="Arial" w:cs="Arial"/>
+                <w:b/>
+                <w:sz w:val="17"/>
+                <w:szCs w:val="17"/>
+              </w:rPr>
+              <w:t xml:space="preserve">Interval</w:t>
+            </w:r>
+          </w:p>
+        </w:tc>
+        <w:tc>
+          <w:tcPr>
+            <w:shd w:val="clear" w:color="auto" w:fill="E9E9E9"/>
+          </w:tcPr>
+          <w:p>
+            <w:pPr>
+              <w:spacing w:after="0"/>
+            </w:pPr>
+            <w:r>
+              <w:rPr>
+                <w:rFonts w:ascii="Arial" w:hAnsi="Arial" w:cs="Arial"/>
+                <w:b/>
+                <w:sz w:val="17"/>
+                <w:szCs w:val="17"/>
+              </w:rPr>
+              <w:t xml:space="preserve">Length</w:t>
+            </w:r>
+          </w:p>
+        </w:tc>
+        <w:tc>
+          <w:tcPr>
+            <w:shd w:val="clear" w:color="auto" w:fill="E9E9E9"/>
+          </w:tcPr>
+          <w:p>
+            <w:pPr>
+              <w:spacing w:after="0"/>
+            </w:pPr>
+            <w:r>
+              <w:rPr>
+                <w:rFonts w:ascii="Arial" w:hAnsi="Arial" w:cs="Arial"/>
+                <w:b/>
+                <w:sz w:val="17"/>
+                <w:szCs w:val="17"/>
+              </w:rPr>
+              <w:t xml:space="preserve">Where pleaded</w:t>
+            </w:r>
+          </w:p>
+        </w:tc>
+        <w:tc>
+          <w:tcPr>
+            <w:shd w:val="clear" w:color="auto" w:fill="E9E9E9"/>
+          </w:tcPr>
+          <w:p>
+            <w:pPr>
+              <w:spacing w:after="0"/>
+            </w:pPr>
+            <w:r>
+              <w:rPr>
+                <w:rFonts w:ascii="Arial" w:hAnsi="Arial" w:cs="Arial"/>
+                <w:b/>
+                <w:sz w:val="17"/>
+                <w:szCs w:val="17"/>
+              </w:rPr>
+              <w:t xml:space="preserve">Facts</w:t>
+            </w:r>
+          </w:p>
+        </w:tc>
+      </w:tr>
+      <w:tr>
+        <w:tc>
+          <w:tcPr/>
+          <w:p>
+            <w:pPr>
+              <w:spacing w:after="0"/>
+            </w:pPr>
+            <w:r>
+              <w:rPr>
+                <w:rFonts w:ascii="Arial" w:hAnsi="Arial" w:cs="Arial"/>
+                <w:sz w:val="17"/>
+                <w:szCs w:val="17"/>
+              </w:rPr>
+              <w:t xml:space="preserve">MASPER Registrar's first report, 3 May 2024 at 3:06 pm, to the first reply, 9 May 2024 at 9:20 am (her second report was sent on the fifth calendar day; the reply on the sixth)</w:t>
+            </w:r>
+          </w:p>
+        </w:tc>
+        <w:tc>
+          <w:tcPr/>
+          <w:p>
+            <w:pPr>
+              <w:spacing w:after="0"/>
+            </w:pPr>
+            <w:r>
+              <w:rPr>
+                <w:rFonts w:ascii="Arial" w:hAnsi="Arial" w:cs="Arial"/>
+                <w:sz w:val="17"/>
+                <w:szCs w:val="17"/>
+              </w:rPr>
+              <w:t xml:space="preserve">5 days, 18 hours, 14 minutes</w:t>
+            </w:r>
+          </w:p>
+        </w:tc>
+        <w:tc>
+          <w:tcPr/>
+          <w:p>
+            <w:pPr>
+              <w:spacing w:after="0"/>
+            </w:pPr>
+            <w:r>
+              <w:rPr>
+                <w:rFonts w:ascii="Arial" w:hAnsi="Arial" w:cs="Arial"/>
+                <w:sz w:val="17"/>
+                <w:szCs w:val="17"/>
+              </w:rPr>
+              <w:t xml:space="preserve">Stressor 1(g)</w:t>
+            </w:r>
+          </w:p>
+        </w:tc>
+        <w:tc>
+          <w:tcPr/>
+          <w:p>
+            <w:pPr>
+              <w:spacing w:after="0"/>
+            </w:pPr>
+            <w:r>
+              <w:rPr>
+                <w:rFonts w:ascii="Arial" w:hAnsi="Arial" w:cs="Arial"/>
+                <w:sz w:val="17"/>
+                <w:szCs w:val="17"/>
+              </w:rPr>
+              <w:t xml:space="preserve">¶¶ 62 to 64</w:t>
+            </w:r>
+          </w:p>
+        </w:tc>
+      </w:tr>
+      <w:tr>
+        <w:tc>
+          <w:tcPr/>
+          <w:p>
+            <w:pPr>
+              <w:spacing w:after="0"/>
+            </w:pPr>
+            <w:r>
+              <w:rPr>
+                <w:rFonts w:ascii="Arial" w:hAnsi="Arial" w:cs="Arial"/>
+                <w:sz w:val="17"/>
+                <w:szCs w:val="17"/>
+              </w:rPr>
+              <w:t xml:space="preserve">Integrated Respiratory Service's first email, 15 May 2024 at 11:47 am, to its second, 20 May 2024 at 11:03 am</w:t>
+            </w:r>
+          </w:p>
+        </w:tc>
+        <w:tc>
+          <w:tcPr/>
+          <w:p>
+            <w:pPr>
+              <w:spacing w:after="0"/>
+            </w:pPr>
+            <w:r>
+              <w:rPr>
+                <w:rFonts w:ascii="Arial" w:hAnsi="Arial" w:cs="Arial"/>
+                <w:sz w:val="17"/>
+                <w:szCs w:val="17"/>
+              </w:rPr>
+              <w:t xml:space="preserve">the fifth calendar day</w:t>
+            </w:r>
+          </w:p>
+        </w:tc>
+        <w:tc>
+          <w:tcPr/>
+          <w:p>
+            <w:pPr>
+              <w:spacing w:after="0"/>
+            </w:pPr>
+            <w:r>
+              <w:rPr>
+                <w:rFonts w:ascii="Arial" w:hAnsi="Arial" w:cs="Arial"/>
+                <w:sz w:val="17"/>
+                <w:szCs w:val="17"/>
+              </w:rPr>
+              <w:t xml:space="preserve">Stressor 1(h)</w:t>
+            </w:r>
+          </w:p>
+        </w:tc>
+        <w:tc>
+          <w:tcPr/>
+          <w:p>
+            <w:pPr>
+              <w:spacing w:after="0"/>
+            </w:pPr>
+            <w:r>
+              <w:rPr>
+                <w:rFonts w:ascii="Arial" w:hAnsi="Arial" w:cs="Arial"/>
+                <w:sz w:val="17"/>
+                <w:szCs w:val="17"/>
+              </w:rPr>
+              <w:t xml:space="preserve">¶ 92</w:t>
+            </w:r>
+          </w:p>
+        </w:tc>
+      </w:tr>
+      <w:tr>
+        <w:tc>
+          <w:tcPr/>
+          <w:p>
+            <w:pPr>
+              <w:spacing w:after="0"/>
+            </w:pPr>
+            <w:r>
+              <w:rPr>
+                <w:rFonts w:ascii="Arial" w:hAnsi="Arial" w:cs="Arial"/>
+                <w:sz w:val="17"/>
+                <w:szCs w:val="17"/>
+              </w:rPr>
+              <w:t xml:space="preserve">That first email to the Appellant's escalation, 20 May 2024 at 2:05 pm</w:t>
+            </w:r>
+          </w:p>
+        </w:tc>
+        <w:tc>
+          <w:tcPr/>
+          <w:p>
+            <w:pPr>
+              <w:spacing w:after="0"/>
+            </w:pPr>
+            <w:r>
+              <w:rPr>
+                <w:rFonts w:ascii="Arial" w:hAnsi="Arial" w:cs="Arial"/>
+                <w:sz w:val="17"/>
+                <w:szCs w:val="17"/>
+              </w:rPr>
+              <w:t xml:space="preserve">5 days, 2 hours, 18 minutes</w:t>
+            </w:r>
+          </w:p>
+        </w:tc>
+        <w:tc>
+          <w:tcPr/>
+          <w:p>
+            <w:pPr>
+              <w:spacing w:after="0"/>
+            </w:pPr>
+            <w:r>
+              <w:rPr>
+                <w:rFonts w:ascii="Arial" w:hAnsi="Arial" w:cs="Arial"/>
+                <w:sz w:val="17"/>
+                <w:szCs w:val="17"/>
+              </w:rPr>
+              <w:t xml:space="preserve">Stressor 1(h)</w:t>
+            </w:r>
+          </w:p>
+        </w:tc>
+        <w:tc>
+          <w:tcPr/>
+          <w:p>
+            <w:pPr>
+              <w:spacing w:after="0"/>
+            </w:pPr>
+            <w:r>
+              <w:rPr>
+                <w:rFonts w:ascii="Arial" w:hAnsi="Arial" w:cs="Arial"/>
+                <w:sz w:val="17"/>
+                <w:szCs w:val="17"/>
+              </w:rPr>
+              <w:t xml:space="preserve">¶¶ 97 to 98</w:t>
+            </w:r>
+          </w:p>
+        </w:tc>
+      </w:tr>
+      <w:tr>
+        <w:tc>
+          <w:tcPr/>
+          <w:p>
+            <w:pPr>
+              <w:spacing w:after="0"/>
+            </w:pPr>
+            <w:r>
+              <w:rPr>
+                <w:rFonts w:ascii="Arial" w:hAnsi="Arial" w:cs="Arial"/>
+                <w:sz w:val="17"/>
+                <w:szCs w:val="17"/>
+              </w:rPr>
+              <w:t xml:space="preserve">The Service's second email to that escalation</w:t>
+            </w:r>
+          </w:p>
+        </w:tc>
+        <w:tc>
+          <w:tcPr/>
+          <w:p>
+            <w:pPr>
+              <w:spacing w:after="0"/>
+            </w:pPr>
+            <w:r>
+              <w:rPr>
+                <w:rFonts w:ascii="Arial" w:hAnsi="Arial" w:cs="Arial"/>
+                <w:sz w:val="17"/>
+                <w:szCs w:val="17"/>
+              </w:rPr>
+              <w:t xml:space="preserve">3 hours, 2 minutes</w:t>
+            </w:r>
+          </w:p>
+        </w:tc>
+        <w:tc>
+          <w:tcPr/>
+          <w:p>
+            <w:pPr>
+              <w:spacing w:after="0"/>
+            </w:pPr>
+            <w:r>
+              <w:rPr>
+                <w:rFonts w:ascii="Arial" w:hAnsi="Arial" w:cs="Arial"/>
+                <w:sz w:val="17"/>
+                <w:szCs w:val="17"/>
+              </w:rPr>
+              <w:t xml:space="preserve">Stressor 1(h)</w:t>
+            </w:r>
+          </w:p>
+        </w:tc>
+        <w:tc>
+          <w:tcPr/>
+          <w:p>
+            <w:pPr>
+              <w:spacing w:after="0"/>
+            </w:pPr>
+            <w:r>
+              <w:rPr>
+                <w:rFonts w:ascii="Arial" w:hAnsi="Arial" w:cs="Arial"/>
+                <w:sz w:val="17"/>
+                <w:szCs w:val="17"/>
+              </w:rPr>
+              <w:t xml:space="preserve">¶ 97</w:t>
+            </w:r>
+          </w:p>
+        </w:tc>
+      </w:tr>
+      <w:tr>
+        <w:tc>
+          <w:tcPr/>
+          <w:p>
+            <w:pPr>
+              <w:spacing w:after="0"/>
+            </w:pPr>
+            <w:r>
+              <w:rPr>
+                <w:rFonts w:ascii="Arial" w:hAnsi="Arial" w:cs="Arial"/>
+                <w:sz w:val="17"/>
+                <w:szCs w:val="17"/>
+              </w:rPr>
+              <w:t xml:space="preserve">The escalation to the reply at 4:30 pm, two hours after the office hours stated to all Switchboard staff on 17 May 2024 had ended</w:t>
+            </w:r>
+          </w:p>
+        </w:tc>
+        <w:tc>
+          <w:tcPr/>
+          <w:p>
+            <w:pPr>
+              <w:spacing w:after="0"/>
+            </w:pPr>
+            <w:r>
+              <w:rPr>
+                <w:rFonts w:ascii="Arial" w:hAnsi="Arial" w:cs="Arial"/>
+                <w:sz w:val="17"/>
+                <w:szCs w:val="17"/>
+              </w:rPr>
+              <w:t xml:space="preserve">2 hours, 25 minutes</w:t>
+            </w:r>
+          </w:p>
+        </w:tc>
+        <w:tc>
+          <w:tcPr/>
+          <w:p>
+            <w:pPr>
+              <w:spacing w:after="0"/>
+            </w:pPr>
+            <w:r>
+              <w:rPr>
+                <w:rFonts w:ascii="Arial" w:hAnsi="Arial" w:cs="Arial"/>
+                <w:sz w:val="17"/>
+                <w:szCs w:val="17"/>
+              </w:rPr>
+              <w:t xml:space="preserve">Stressor 1(h)</w:t>
+            </w:r>
+          </w:p>
+        </w:tc>
+        <w:tc>
+          <w:tcPr/>
+          <w:p>
+            <w:pPr>
+              <w:spacing w:after="0"/>
+            </w:pPr>
+            <w:r>
+              <w:rPr>
+                <w:rFonts w:ascii="Arial" w:hAnsi="Arial" w:cs="Arial"/>
+                <w:sz w:val="17"/>
+                <w:szCs w:val="17"/>
+              </w:rPr>
+              <w:t xml:space="preserve">¶¶ 102 to 103</w:t>
+            </w:r>
+          </w:p>
+        </w:tc>
+      </w:tr>
+      <w:tr>
+        <w:tc>
+          <w:tcPr/>
+          <w:p>
+            <w:pPr>
+              <w:spacing w:after="0"/>
+            </w:pPr>
+            <w:r>
+              <w:rPr>
+                <w:rFonts w:ascii="Arial" w:hAnsi="Arial" w:cs="Arial"/>
+                <w:sz w:val="17"/>
+                <w:szCs w:val="17"/>
+              </w:rPr>
+              <w:t xml:space="preserve">The Appellant's fatigue enquiry, 8 April 2024, to the response, 1 May 2024; no response alleged in between</w:t>
+            </w:r>
+          </w:p>
+        </w:tc>
+        <w:tc>
+          <w:tcPr/>
+          <w:p>
+            <w:pPr>
+              <w:spacing w:after="0"/>
+            </w:pPr>
+            <w:r>
+              <w:rPr>
+                <w:rFonts w:ascii="Arial" w:hAnsi="Arial" w:cs="Arial"/>
+                <w:sz w:val="17"/>
+                <w:szCs w:val="17"/>
+              </w:rPr>
+              <w:t xml:space="preserve">23 days</w:t>
+            </w:r>
+          </w:p>
+        </w:tc>
+        <w:tc>
+          <w:tcPr/>
+          <w:p>
+            <w:pPr>
+              <w:spacing w:after="0"/>
+            </w:pPr>
+            <w:r>
+              <w:rPr>
+                <w:rFonts w:ascii="Arial" w:hAnsi="Arial" w:cs="Arial"/>
+                <w:sz w:val="17"/>
+                <w:szCs w:val="17"/>
+              </w:rPr>
+              <w:t xml:space="preserve">Stressor 3(j)</w:t>
+            </w:r>
+          </w:p>
+        </w:tc>
+        <w:tc>
+          <w:tcPr/>
+          <w:p>
+            <w:pPr>
+              <w:spacing w:after="0"/>
+            </w:pPr>
+            <w:r>
+              <w:rPr>
+                <w:rFonts w:ascii="Arial" w:hAnsi="Arial" w:cs="Arial"/>
+                <w:sz w:val="17"/>
+                <w:szCs w:val="17"/>
+              </w:rPr>
+              <w:t xml:space="preserve">¶¶ 249 to 250</w:t>
+            </w:r>
+          </w:p>
+        </w:tc>
+      </w:tr>
+      <w:tr>
+        <w:tc>
+          <w:tcPr/>
+          <w:p>
+            <w:pPr>
+              <w:spacing w:after="0"/>
+            </w:pPr>
+            <w:r>
+              <w:rPr>
+                <w:rFonts w:ascii="Arial" w:hAnsi="Arial" w:cs="Arial"/>
+                <w:sz w:val="17"/>
+                <w:szCs w:val="17"/>
+              </w:rPr>
+              <w:t xml:space="preserve">Third submission of the special pandemic leave request, 29 February 2024 at 11:07:28, to its approval at 11:21:03</w:t>
+            </w:r>
+          </w:p>
+        </w:tc>
+        <w:tc>
+          <w:tcPr/>
+          <w:p>
+            <w:pPr>
+              <w:spacing w:after="0"/>
+            </w:pPr>
+            <w:r>
+              <w:rPr>
+                <w:rFonts w:ascii="Arial" w:hAnsi="Arial" w:cs="Arial"/>
+                <w:sz w:val="17"/>
+                <w:szCs w:val="17"/>
+              </w:rPr>
+              <w:t xml:space="preserve">13 minutes, 35 seconds</w:t>
+            </w:r>
+          </w:p>
+        </w:tc>
+        <w:tc>
+          <w:tcPr/>
+          <w:p>
+            <w:pPr>
+              <w:spacing w:after="0"/>
+            </w:pPr>
+            <w:r>
+              <w:rPr>
+                <w:rFonts w:ascii="Arial" w:hAnsi="Arial" w:cs="Arial"/>
+                <w:sz w:val="17"/>
+                <w:szCs w:val="17"/>
+              </w:rPr>
+              <w:t xml:space="preserve">Stressor 1(l), 2(f)</w:t>
+            </w:r>
+          </w:p>
+        </w:tc>
+        <w:tc>
+          <w:tcPr/>
+          <w:p>
+            <w:pPr>
+              <w:spacing w:after="0"/>
+            </w:pPr>
+            <w:r>
+              <w:rPr>
+                <w:rFonts w:ascii="Arial" w:hAnsi="Arial" w:cs="Arial"/>
+                <w:sz w:val="17"/>
+                <w:szCs w:val="17"/>
+              </w:rPr>
+              <w:t xml:space="preserve">¶ 124</w:t>
+            </w:r>
+          </w:p>
+        </w:tc>
+      </w:tr>
+      <w:tr>
+        <w:tc>
+          <w:tcPr/>
+          <w:p>
+            <w:pPr>
+              <w:spacing w:after="0"/>
+            </w:pPr>
+            <w:r>
+              <w:rPr>
+                <w:rFonts w:ascii="Arial" w:hAnsi="Arial" w:cs="Arial"/>
+                <w:sz w:val="17"/>
+                <w:szCs w:val="17"/>
+              </w:rPr>
+              <w:t xml:space="preserve">Creation of the draft, 20 February 2024, to final approval, 1 March 2024</w:t>
+            </w:r>
+          </w:p>
+        </w:tc>
+        <w:tc>
+          <w:tcPr/>
+          <w:p>
+            <w:pPr>
+              <w:spacing w:after="0"/>
+            </w:pPr>
+            <w:r>
+              <w:rPr>
+                <w:rFonts w:ascii="Arial" w:hAnsi="Arial" w:cs="Arial"/>
+                <w:sz w:val="17"/>
+                <w:szCs w:val="17"/>
+              </w:rPr>
+              <w:t xml:space="preserve">10 days, 4 hours, 40 minutes, 20 seconds</w:t>
+            </w:r>
+          </w:p>
+        </w:tc>
+        <w:tc>
+          <w:tcPr/>
+          <w:p>
+            <w:pPr>
+              <w:spacing w:after="0"/>
+            </w:pPr>
+            <w:r>
+              <w:rPr>
+                <w:rFonts w:ascii="Arial" w:hAnsi="Arial" w:cs="Arial"/>
+                <w:sz w:val="17"/>
+                <w:szCs w:val="17"/>
+              </w:rPr>
+              <w:t xml:space="preserve">Stressor 1(l), 2(f)</w:t>
+            </w:r>
+          </w:p>
+        </w:tc>
+        <w:tc>
+          <w:tcPr/>
+          <w:p>
+            <w:pPr>
+              <w:spacing w:after="0"/>
+            </w:pPr>
+            <w:r>
+              <w:rPr>
+                <w:rFonts w:ascii="Arial" w:hAnsi="Arial" w:cs="Arial"/>
+                <w:sz w:val="17"/>
+                <w:szCs w:val="17"/>
+              </w:rPr>
+              <w:t xml:space="preserve">¶ 125</w:t>
+            </w:r>
+          </w:p>
+        </w:tc>
+      </w:tr>
+      <w:tr>
+        <w:tc>
+          <w:tcPr/>
+          <w:p>
+            <w:pPr>
+              <w:spacing w:after="0"/>
+            </w:pPr>
+            <w:r>
+              <w:rPr>
+                <w:rFonts w:ascii="Arial" w:hAnsi="Arial" w:cs="Arial"/>
+                <w:sz w:val="17"/>
+                <w:szCs w:val="17"/>
+              </w:rPr>
+              <w:t xml:space="preserve">Removal of database access, 18 July 2023, to 18 June 2024; no restoration alleged</w:t>
+            </w:r>
+          </w:p>
+        </w:tc>
+        <w:tc>
+          <w:tcPr/>
+          <w:p>
+            <w:pPr>
+              <w:spacing w:after="0"/>
+            </w:pPr>
+            <w:r>
+              <w:rPr>
+                <w:rFonts w:ascii="Arial" w:hAnsi="Arial" w:cs="Arial"/>
+                <w:sz w:val="17"/>
+                <w:szCs w:val="17"/>
+              </w:rPr>
+              <w:t xml:space="preserve">11 months</w:t>
+            </w:r>
+          </w:p>
+        </w:tc>
+        <w:tc>
+          <w:tcPr/>
+          <w:p>
+            <w:pPr>
+              <w:spacing w:after="0"/>
+            </w:pPr>
+            <w:r>
+              <w:rPr>
+                <w:rFonts w:ascii="Arial" w:hAnsi="Arial" w:cs="Arial"/>
+                <w:sz w:val="17"/>
+                <w:szCs w:val="17"/>
+              </w:rPr>
+              <w:t xml:space="preserve">Stressor 1(b)</w:t>
+            </w:r>
+          </w:p>
+        </w:tc>
+        <w:tc>
+          <w:tcPr/>
+          <w:p>
+            <w:pPr>
+              <w:spacing w:after="0"/>
+            </w:pPr>
+            <w:r>
+              <w:rPr>
+                <w:rFonts w:ascii="Arial" w:hAnsi="Arial" w:cs="Arial"/>
+                <w:sz w:val="17"/>
+                <w:szCs w:val="17"/>
+              </w:rPr>
+              <w:t xml:space="preserve">¶ 55</w:t>
+            </w:r>
+          </w:p>
+        </w:tc>
+      </w:tr>
+      <w:tr>
+        <w:tc>
+          <w:tcPr/>
+          <w:p>
+            <w:pPr>
+              <w:spacing w:after="0"/>
+            </w:pPr>
+            <w:r>
+              <w:rPr>
+                <w:rFonts w:ascii="Arial" w:hAnsi="Arial" w:cs="Arial"/>
+                <w:sz w:val="17"/>
+                <w:szCs w:val="17"/>
+              </w:rPr>
+              <w:t xml:space="preserve">23 August 2023 to 17 May 2024; no fixed office hours alleged to have been stated</w:t>
+            </w:r>
+          </w:p>
+        </w:tc>
+        <w:tc>
+          <w:tcPr/>
+          <w:p>
+            <w:pPr>
+              <w:spacing w:after="0"/>
+            </w:pPr>
+            <w:r>
+              <w:rPr>
+                <w:rFonts w:ascii="Arial" w:hAnsi="Arial" w:cs="Arial"/>
+                <w:sz w:val="17"/>
+                <w:szCs w:val="17"/>
+              </w:rPr>
+              <w:t xml:space="preserve">9 months</w:t>
+            </w:r>
+          </w:p>
+        </w:tc>
+        <w:tc>
+          <w:tcPr/>
+          <w:p>
+            <w:pPr>
+              <w:spacing w:after="0"/>
+            </w:pPr>
+            <w:r>
+              <w:rPr>
+                <w:rFonts w:ascii="Arial" w:hAnsi="Arial" w:cs="Arial"/>
+                <w:sz w:val="17"/>
+                <w:szCs w:val="17"/>
+              </w:rPr>
+              <w:t xml:space="preserve">Stressor 1(i)</w:t>
+            </w:r>
+          </w:p>
+        </w:tc>
+        <w:tc>
+          <w:tcPr/>
+          <w:p>
+            <w:pPr>
+              <w:spacing w:after="0"/>
+            </w:pPr>
+            <w:r>
+              <w:rPr>
+                <w:rFonts w:ascii="Arial" w:hAnsi="Arial" w:cs="Arial"/>
+                <w:sz w:val="17"/>
+                <w:szCs w:val="17"/>
+              </w:rPr>
+              <w:t xml:space="preserve">¶ 73</w:t>
+            </w:r>
+          </w:p>
+        </w:tc>
+      </w:tr>
+      <w:tr>
+        <w:tc>
+          <w:tcPr/>
+          <w:p>
+            <w:pPr>
+              <w:spacing w:after="0"/>
+            </w:pPr>
+            <w:r>
+              <w:rPr>
+                <w:rFonts w:ascii="Arial" w:hAnsi="Arial" w:cs="Arial"/>
+                <w:sz w:val="17"/>
+                <w:szCs w:val="17"/>
+              </w:rPr>
+              <w:t xml:space="preserve">Payroll's direction, 3 May 2024, to the pay date of the payslip carrying three of the four corrections, 5 June 2024</w:t>
+            </w:r>
+          </w:p>
+        </w:tc>
+        <w:tc>
+          <w:tcPr/>
+          <w:p>
+            <w:pPr>
+              <w:spacing w:after="0"/>
+            </w:pPr>
+            <w:r>
+              <w:rPr>
+                <w:rFonts w:ascii="Arial" w:hAnsi="Arial" w:cs="Arial"/>
+                <w:sz w:val="17"/>
+                <w:szCs w:val="17"/>
+              </w:rPr>
+              <w:t xml:space="preserve">33 days</w:t>
+            </w:r>
+          </w:p>
+        </w:tc>
+        <w:tc>
+          <w:tcPr/>
+          <w:p>
+            <w:pPr>
+              <w:spacing w:after="0"/>
+            </w:pPr>
+            <w:r>
+              <w:rPr>
+                <w:rFonts w:ascii="Arial" w:hAnsi="Arial" w:cs="Arial"/>
+                <w:sz w:val="17"/>
+                <w:szCs w:val="17"/>
+              </w:rPr>
+              <w:t xml:space="preserve">Stressor 2(e)(i)</w:t>
+            </w:r>
+          </w:p>
+        </w:tc>
+        <w:tc>
+          <w:tcPr/>
+          <w:p>
+            <w:pPr>
+              <w:spacing w:after="0"/>
+            </w:pPr>
+            <w:r>
+              <w:rPr>
+                <w:rFonts w:ascii="Arial" w:hAnsi="Arial" w:cs="Arial"/>
+                <w:sz w:val="17"/>
+                <w:szCs w:val="17"/>
+              </w:rPr>
+              <w:t xml:space="preserve">Payroll disclosure, July 2025</w:t>
+            </w:r>
+          </w:p>
+        </w:tc>
+      </w:tr>
+      <w:tr>
+        <w:tc>
+          <w:tcPr/>
+          <w:p>
+            <w:pPr>
+              <w:spacing w:after="0"/>
+            </w:pPr>
+            <w:r>
+              <w:rPr>
+                <w:rFonts w:ascii="Arial" w:hAnsi="Arial" w:cs="Arial"/>
+                <w:sz w:val="17"/>
+                <w:szCs w:val="17"/>
+              </w:rPr>
+              <w:t xml:space="preserve">That direction to the pay date of the payslip carrying the fourth, 2 July 2025 (amendment dated 30 June 2025)</w:t>
+            </w:r>
+          </w:p>
+        </w:tc>
+        <w:tc>
+          <w:tcPr/>
+          <w:p>
+            <w:pPr>
+              <w:spacing w:after="0"/>
+            </w:pPr>
+            <w:r>
+              <w:rPr>
+                <w:rFonts w:ascii="Arial" w:hAnsi="Arial" w:cs="Arial"/>
+                <w:sz w:val="17"/>
+                <w:szCs w:val="17"/>
+              </w:rPr>
+              <w:t xml:space="preserve">425 days</w:t>
+            </w:r>
+          </w:p>
+        </w:tc>
+        <w:tc>
+          <w:tcPr/>
+          <w:p>
+            <w:pPr>
+              <w:spacing w:after="0"/>
+            </w:pPr>
+            <w:r>
+              <w:rPr>
+                <w:rFonts w:ascii="Arial" w:hAnsi="Arial" w:cs="Arial"/>
+                <w:sz w:val="17"/>
+                <w:szCs w:val="17"/>
+              </w:rPr>
+              <w:t xml:space="preserve">Stressor 2(e)(i)</w:t>
+            </w:r>
+          </w:p>
+        </w:tc>
+        <w:tc>
+          <w:tcPr/>
+          <w:p>
+            <w:pPr>
+              <w:spacing w:after="0"/>
+            </w:pPr>
+            <w:r>
+              <w:rPr>
+                <w:rFonts w:ascii="Arial" w:hAnsi="Arial" w:cs="Arial"/>
+                <w:sz w:val="17"/>
+                <w:szCs w:val="17"/>
+              </w:rPr>
+              <w:t xml:space="preserve">Payroll disclosure, July 2025</w:t>
+            </w:r>
+          </w:p>
+        </w:tc>
+      </w:tr>
+      <w:tr>
+        <w:tc>
+          <w:tcPr/>
+          <w:p>
+            <w:pPr>
+              <w:spacing w:after="0"/>
+            </w:pPr>
+            <w:r>
+              <w:rPr>
+                <w:rFonts w:ascii="Arial" w:hAnsi="Arial" w:cs="Arial"/>
+                <w:sz w:val="17"/>
+                <w:szCs w:val="17"/>
+              </w:rPr>
+              <w:t xml:space="preserve">The Appellant's last shift, 3 June 2024, to the first of those pay dates</w:t>
+            </w:r>
+          </w:p>
+        </w:tc>
+        <w:tc>
+          <w:tcPr/>
+          <w:p>
+            <w:pPr>
+              <w:spacing w:after="0"/>
+            </w:pPr>
+            <w:r>
+              <w:rPr>
+                <w:rFonts w:ascii="Arial" w:hAnsi="Arial" w:cs="Arial"/>
+                <w:sz w:val="17"/>
+                <w:szCs w:val="17"/>
+              </w:rPr>
+              <w:t xml:space="preserve">2 days</w:t>
+            </w:r>
+          </w:p>
+        </w:tc>
+        <w:tc>
+          <w:tcPr/>
+          <w:p>
+            <w:pPr>
+              <w:spacing w:after="0"/>
+            </w:pPr>
+            <w:r>
+              <w:rPr>
+                <w:rFonts w:ascii="Arial" w:hAnsi="Arial" w:cs="Arial"/>
+                <w:sz w:val="17"/>
+                <w:szCs w:val="17"/>
+              </w:rPr>
+              <w:t xml:space="preserve">Stressor 2(e)(i); Part B.1.4</w:t>
+            </w:r>
+          </w:p>
+        </w:tc>
+        <w:tc>
+          <w:tcPr/>
+          <w:p>
+            <w:pPr>
+              <w:spacing w:after="0"/>
+            </w:pPr>
+            <w:r>
+              <w:rPr>
+                <w:rFonts w:ascii="Arial" w:hAnsi="Arial" w:cs="Arial"/>
+                <w:sz w:val="17"/>
+                <w:szCs w:val="17"/>
+              </w:rPr>
+              <w:t xml:space="preserve">-</w:t>
+            </w:r>
+          </w:p>
+        </w:tc>
+      </w:tr>
+    </w:tbl>
     <w:p>
       <w:pPr>
-        <w:spacing w:before="0" w:after="100" w:line="264" w:lineRule="auto"/>
-      </w:pPr>
-      <w:r>
-        <w:rPr>
-          <w:rFonts w:ascii="Arial" w:hAnsi="Arial" w:cs="Arial"/>
-          <w:b/>
-          <w:sz w:val="20"/>
-          <w:szCs w:val="20"/>
-        </w:rPr>
-        <w:t xml:space="preserve">4.1 Between the MASPER Registrar's first report of 3 May 2024 at 3:06 pm and the first reply of 9 May 2024 at 9:20 am: five days, eighteen hours and fourteen minutes. </w:t>
-      </w:r>
-      <w:r>
-        <w:rPr>
-          <w:rFonts w:ascii="Arial" w:hAnsi="Arial" w:cs="Arial"/>
-          <w:sz w:val="20"/>
-          <w:szCs w:val="20"/>
-        </w:rPr>
-        <w:t xml:space="preserve">Her second report was sent on the fifth calendar day after the first; the reply was sent on the sixth.</w:t>
-      </w:r>
-    </w:p>
-    <w:p>
-      <w:pPr>
-        <w:spacing w:before="0" w:after="100" w:line="264" w:lineRule="auto"/>
-      </w:pPr>
-      <w:r>
-        <w:rPr>
-          <w:rFonts w:ascii="Arial" w:hAnsi="Arial" w:cs="Arial"/>
-          <w:b/>
-          <w:sz w:val="20"/>
-          <w:szCs w:val="20"/>
-        </w:rPr>
-        <w:t xml:space="preserve">4.2 Between the first email of the Integrated Respiratory Service of 15 May 2024 at 11:47 am and its second of 20 May 2024 at 11:03 am: the fifth calendar day. </w:t>
-      </w:r>
-      <w:r>
-        <w:rPr>
-          <w:rFonts w:ascii="Arial" w:hAnsi="Arial" w:cs="Arial"/>
-          <w:sz w:val="20"/>
-          <w:szCs w:val="20"/>
-        </w:rPr>
-        <w:t xml:space="preserve">Between that first email and the Appellant's escalation of 20 May 2024 at 2:05 pm: five days, two hours and eighteen minutes. Between the Service's second email and that escalation: three hours and two minutes. Between the escalation and the reply at 4:30 pm: two hours and twenty-five minutes, that reply being sent two hours after the conclusion of the office hours stated to all Switchboard staff on 17 May 2024.</w:t>
-      </w:r>
-    </w:p>
-    <w:p>
-      <w:pPr>
-        <w:spacing w:before="0" w:after="100" w:line="264" w:lineRule="auto"/>
-      </w:pPr>
-      <w:r>
-        <w:rPr>
-          <w:rFonts w:ascii="Arial" w:hAnsi="Arial" w:cs="Arial"/>
-          <w:sz w:val="20"/>
-          <w:szCs w:val="20"/>
-        </w:rPr>
-        <w:t xml:space="preserve">4.3 Between the Appellant's fatigue enquiry of 8 April 2024 and the response of 1 May 2024: 23 days, during which the Respondent does not allege that any response was made.</w:t>
-      </w:r>
-    </w:p>
-    <w:p>
-      <w:pPr>
-        <w:spacing w:before="0" w:after="100" w:line="264" w:lineRule="auto"/>
-      </w:pPr>
-      <w:r>
-        <w:rPr>
-          <w:rFonts w:ascii="Arial" w:hAnsi="Arial" w:cs="Arial"/>
-          <w:b/>
-          <w:sz w:val="20"/>
-          <w:szCs w:val="20"/>
-        </w:rPr>
-        <w:t xml:space="preserve">4.4 Between the third submission of the special pandemic leave request at 11:07:28 on 29 February 2024 and its approval at 11:21:03 the same morning: thirteen minutes and thirty-five seconds. </w:t>
-      </w:r>
-      <w:r>
-        <w:rPr>
-          <w:rFonts w:ascii="Arial" w:hAnsi="Arial" w:cs="Arial"/>
-          <w:sz w:val="20"/>
-          <w:szCs w:val="20"/>
-        </w:rPr>
-        <w:t xml:space="preserve">Between the creation of the draft on 20 February 2024 and the final approval on 1 March 2024: ten days, four hours, forty minutes and twenty seconds.</w:t>
-      </w:r>
-    </w:p>
-    <w:p>
-      <w:pPr>
-        <w:spacing w:before="0" w:after="100" w:line="264" w:lineRule="auto"/>
-      </w:pPr>
-      <w:r>
-        <w:rPr>
-          <w:rFonts w:ascii="Arial" w:hAnsi="Arial" w:cs="Arial"/>
-          <w:b/>
-          <w:sz w:val="20"/>
-          <w:szCs w:val="20"/>
-        </w:rPr>
-        <w:t xml:space="preserve">4.5 Between the removal of database access on 18 July 2023 and 18 June 2024: eleven months, during which the Respondent does not allege that access was restored. </w:t>
-      </w:r>
-      <w:r>
-        <w:rPr>
-          <w:rFonts w:ascii="Arial" w:hAnsi="Arial" w:cs="Arial"/>
-          <w:sz w:val="20"/>
-          <w:szCs w:val="20"/>
-        </w:rPr>
-        <w:t xml:space="preserve">Between 23 August 2023 and 17 May 2024: nine months, during which the Respondent does not allege that fixed office hours were stated to the Switchboard staff.</w:t>
-      </w:r>
-    </w:p>
-    <w:p>
-      <w:pPr>
-        <w:spacing w:before="0" w:after="100" w:line="264" w:lineRule="auto"/>
-      </w:pPr>
-      <w:r>
-        <w:rPr>
-          <w:rFonts w:ascii="Arial" w:hAnsi="Arial" w:cs="Arial"/>
-          <w:b/>
-          <w:sz w:val="20"/>
-          <w:szCs w:val="20"/>
-        </w:rPr>
-        <w:t xml:space="preserve">4.6 Between Payroll's direction of 3 May 2024 and the pay date of the payslip carrying three of the four corrections, 5 June 2024: 33 days. </w:t>
-      </w:r>
-      <w:r>
-        <w:rPr>
-          <w:rFonts w:ascii="Arial" w:hAnsi="Arial" w:cs="Arial"/>
-          <w:sz w:val="20"/>
-          <w:szCs w:val="20"/>
-        </w:rPr>
-        <w:t xml:space="preserve">Between that direction and the pay date of the payslip carrying the fourth, 2 July 2025: 425 days, the amendment itself being dated 30 June 2025. Between the Appellant's last shift, 3 June 2024, and the first of those pay dates: two days.</w:t>
-      </w:r>
+        <w:spacing w:after="60"/>
+      </w:pPr>
     </w:p>
     <w:p>
       <w:pPr>

</xml_diff>

<commit_message>
WC/2024/227: 9A — pay and office-hours intervals interleaved; B.4 table extended
Co-Authored-By: Claude Fable 5.1 <noreply@anthropic.com>
Claude-Session: https://claude.ai/code/session_01PbSZiMB1koFR46V5hQyVcy
</commit_message>
<xml_diff>
--- a/wc2024227/drafts/second-amended-9A/2026-10_SECOND_AMENDED_9A_FINAL.docx
+++ b/wc2024227/drafts/second-amended-9A/2026-10_SECOND_AMENDED_9A_FINAL.docx
@@ -1230,6 +1230,19 @@
       <w:r>
         <w:rPr>
           <w:rFonts w:ascii="Arial" w:hAnsi="Arial" w:cs="Arial"/>
+          <w:sz w:val="20"/>
+          <w:szCs w:val="20"/>
+        </w:rPr>
+        <w:t xml:space="preserve">So the request for the Manager's office hours was made at 1:15 pm on 15 May 2024. The request to retract it came five hours and eight minutes later, at 6:23 pm. The hours were stated to the whole department one day, twenty hours and fifteen minutes after the request, at 9:30 am on 17 May. The Director's question about which changes had concerned him came six days, one hour and thirty-eight minutes after the request, at 2:53 pm on 21 May. Before the request, no fixed hours had been stated for nine months. [¶¶ 73 to 84]</w:t>
+      </w:r>
+    </w:p>
+    <w:p>
+      <w:pPr>
+        <w:spacing w:before="0" w:after="100" w:line="264" w:lineRule="auto"/>
+      </w:pPr>
+      <w:r>
+        <w:rPr>
+          <w:rFonts w:ascii="Arial" w:hAnsi="Arial" w:cs="Arial"/>
           <w:b/>
           <w:sz w:val="20"/>
           <w:szCs w:val="20"/>
@@ -2068,6 +2081,19 @@
           <w:szCs w:val="20"/>
         </w:rPr>
         <w:t xml:space="preserve">The shift of 9 February 2024 was not corrected on that payslip. On Payroll's account it "was amended with an exemption for the Validation of Claims form on the 30.06.2025 and is on Payslip 07", for the pay period 9 to 22 June 2025, pay date 2 July 2025. That was 425 days after Payroll's direction of 3 May 2024 (the amendment itself being dated 30 June 2025); after the date of injury; after the Respondent's review decision of 24 October 2024; and after this appeal was commenced. It was made with an exemption from the form the Manager had asked the Appellant to sign on 28 May 2024. [¶¶ 196 to 197] The Respondent's pleading and its outlines of evidence (Part B.6) describe the pay issues as "corrected" and "remedied in a timely manner" [¶ 207] without stating these dates.</w:t>
+      </w:r>
+    </w:p>
+    <w:p>
+      <w:pPr>
+        <w:spacing w:before="0" w:after="100" w:line="264" w:lineRule="auto"/>
+      </w:pPr>
+      <w:r>
+        <w:rPr>
+          <w:rFonts w:ascii="Arial" w:hAnsi="Arial" w:cs="Arial"/>
+          <w:sz w:val="20"/>
+          <w:szCs w:val="20"/>
+        </w:rPr>
+        <w:t xml:space="preserve">So the pay sequence was this. The Appellant raised the pay for 8 to 31 March on 8 April 2024; the reply came the next day; his follow-up came fifteen days after that, on 24 April; and the refusal came seven days later, on 1 May. Two days after the refusal, on 3 May, Payroll identified all four fortnights and directed the Manager to submit an AVAC for each. From that direction: the Appellant wrote to Payroll and the Manager after seven days (10 May); Payroll wrote that nothing had been corrected after ten days (13 May); the Manager wrote that she was still waiting after eighteen days (21 May); she submitted the AVAC after 25 days (28 May); it was processed "Part Completed" two days after that (30 May); and three of the four corrections reached a payslip after 33 days (pay date 5 June 2024), two days after his last shift. From the shifts themselves to the payslip that adjusted them: 98 days for 28 February, 67 days for 30 March, 65 days for 1 April. The 9 February shift was corrected 423 days after Payroll's direction (30 June 2025) and reached a payslip after 425 days (2 July 2025): 509 days after the shift was worked. In all that time the Respondent alleges no step other than those listed. [¶¶ 185 to 197, 203, 209, 242 to 247]</w:t>
       </w:r>
     </w:p>
     <w:p>
@@ -4254,6 +4280,930 @@
           </w:p>
         </w:tc>
       </w:tr>
+      <w:tr>
+        <w:tc>
+          <w:tcPr/>
+          <w:p>
+            <w:pPr>
+              <w:spacing w:after="0"/>
+            </w:pPr>
+            <w:r>
+              <w:rPr>
+                <w:rFonts w:ascii="Arial" w:hAnsi="Arial" w:cs="Arial"/>
+                <w:sz w:val="17"/>
+                <w:szCs w:val="17"/>
+              </w:rPr>
+              <w:t xml:space="preserve">The pay enquiry of 8 April 2024 to the reply of 9 April</w:t>
+            </w:r>
+          </w:p>
+        </w:tc>
+        <w:tc>
+          <w:tcPr/>
+          <w:p>
+            <w:pPr>
+              <w:spacing w:after="0"/>
+            </w:pPr>
+            <w:r>
+              <w:rPr>
+                <w:rFonts w:ascii="Arial" w:hAnsi="Arial" w:cs="Arial"/>
+                <w:sz w:val="17"/>
+                <w:szCs w:val="17"/>
+              </w:rPr>
+              <w:t xml:space="preserve">1 day</w:t>
+            </w:r>
+          </w:p>
+        </w:tc>
+        <w:tc>
+          <w:tcPr/>
+          <w:p>
+            <w:pPr>
+              <w:spacing w:after="0"/>
+            </w:pPr>
+            <w:r>
+              <w:rPr>
+                <w:rFonts w:ascii="Arial" w:hAnsi="Arial" w:cs="Arial"/>
+                <w:sz w:val="17"/>
+                <w:szCs w:val="17"/>
+              </w:rPr>
+              <w:t xml:space="preserve">Stressor 2(e)(i), 3(j)</w:t>
+            </w:r>
+          </w:p>
+        </w:tc>
+        <w:tc>
+          <w:tcPr/>
+          <w:p>
+            <w:pPr>
+              <w:spacing w:after="0"/>
+            </w:pPr>
+            <w:r>
+              <w:rPr>
+                <w:rFonts w:ascii="Arial" w:hAnsi="Arial" w:cs="Arial"/>
+                <w:sz w:val="17"/>
+                <w:szCs w:val="17"/>
+              </w:rPr>
+              <w:t xml:space="preserve">¶¶ 242, 244</w:t>
+            </w:r>
+          </w:p>
+        </w:tc>
+      </w:tr>
+      <w:tr>
+        <w:tc>
+          <w:tcPr/>
+          <w:p>
+            <w:pPr>
+              <w:spacing w:after="0"/>
+            </w:pPr>
+            <w:r>
+              <w:rPr>
+                <w:rFonts w:ascii="Arial" w:hAnsi="Arial" w:cs="Arial"/>
+                <w:sz w:val="17"/>
+                <w:szCs w:val="17"/>
+              </w:rPr>
+              <w:t xml:space="preserve">That reply to the Appellant's follow-up of 24 April 2024</w:t>
+            </w:r>
+          </w:p>
+        </w:tc>
+        <w:tc>
+          <w:tcPr/>
+          <w:p>
+            <w:pPr>
+              <w:spacing w:after="0"/>
+            </w:pPr>
+            <w:r>
+              <w:rPr>
+                <w:rFonts w:ascii="Arial" w:hAnsi="Arial" w:cs="Arial"/>
+                <w:sz w:val="17"/>
+                <w:szCs w:val="17"/>
+              </w:rPr>
+              <w:t xml:space="preserve">15 days</w:t>
+            </w:r>
+          </w:p>
+        </w:tc>
+        <w:tc>
+          <w:tcPr/>
+          <w:p>
+            <w:pPr>
+              <w:spacing w:after="0"/>
+            </w:pPr>
+            <w:r>
+              <w:rPr>
+                <w:rFonts w:ascii="Arial" w:hAnsi="Arial" w:cs="Arial"/>
+                <w:sz w:val="17"/>
+                <w:szCs w:val="17"/>
+              </w:rPr>
+              <w:t xml:space="preserve">Stressor 2(e)(i), 3(j)</w:t>
+            </w:r>
+          </w:p>
+        </w:tc>
+        <w:tc>
+          <w:tcPr/>
+          <w:p>
+            <w:pPr>
+              <w:spacing w:after="0"/>
+            </w:pPr>
+            <w:r>
+              <w:rPr>
+                <w:rFonts w:ascii="Arial" w:hAnsi="Arial" w:cs="Arial"/>
+                <w:sz w:val="17"/>
+                <w:szCs w:val="17"/>
+              </w:rPr>
+              <w:t xml:space="preserve">¶¶ 244, 246</w:t>
+            </w:r>
+          </w:p>
+        </w:tc>
+      </w:tr>
+      <w:tr>
+        <w:tc>
+          <w:tcPr/>
+          <w:p>
+            <w:pPr>
+              <w:spacing w:after="0"/>
+            </w:pPr>
+            <w:r>
+              <w:rPr>
+                <w:rFonts w:ascii="Arial" w:hAnsi="Arial" w:cs="Arial"/>
+                <w:sz w:val="17"/>
+                <w:szCs w:val="17"/>
+              </w:rPr>
+              <w:t xml:space="preserve">That follow-up to the refusal of 1 May 2024</w:t>
+            </w:r>
+          </w:p>
+        </w:tc>
+        <w:tc>
+          <w:tcPr/>
+          <w:p>
+            <w:pPr>
+              <w:spacing w:after="0"/>
+            </w:pPr>
+            <w:r>
+              <w:rPr>
+                <w:rFonts w:ascii="Arial" w:hAnsi="Arial" w:cs="Arial"/>
+                <w:sz w:val="17"/>
+                <w:szCs w:val="17"/>
+              </w:rPr>
+              <w:t xml:space="preserve">7 days</w:t>
+            </w:r>
+          </w:p>
+        </w:tc>
+        <w:tc>
+          <w:tcPr/>
+          <w:p>
+            <w:pPr>
+              <w:spacing w:after="0"/>
+            </w:pPr>
+            <w:r>
+              <w:rPr>
+                <w:rFonts w:ascii="Arial" w:hAnsi="Arial" w:cs="Arial"/>
+                <w:sz w:val="17"/>
+                <w:szCs w:val="17"/>
+              </w:rPr>
+              <w:t xml:space="preserve">Stressor 2(e)(i), 3(j)</w:t>
+            </w:r>
+          </w:p>
+        </w:tc>
+        <w:tc>
+          <w:tcPr/>
+          <w:p>
+            <w:pPr>
+              <w:spacing w:after="0"/>
+            </w:pPr>
+            <w:r>
+              <w:rPr>
+                <w:rFonts w:ascii="Arial" w:hAnsi="Arial" w:cs="Arial"/>
+                <w:sz w:val="17"/>
+                <w:szCs w:val="17"/>
+              </w:rPr>
+              <w:t xml:space="preserve">¶¶ 246, 247</w:t>
+            </w:r>
+          </w:p>
+        </w:tc>
+      </w:tr>
+      <w:tr>
+        <w:tc>
+          <w:tcPr/>
+          <w:p>
+            <w:pPr>
+              <w:spacing w:after="0"/>
+            </w:pPr>
+            <w:r>
+              <w:rPr>
+                <w:rFonts w:ascii="Arial" w:hAnsi="Arial" w:cs="Arial"/>
+                <w:sz w:val="17"/>
+                <w:szCs w:val="17"/>
+              </w:rPr>
+              <w:t xml:space="preserve">The refusal of 1 May 2024 to Payroll's direction of 3 May 2024</w:t>
+            </w:r>
+          </w:p>
+        </w:tc>
+        <w:tc>
+          <w:tcPr/>
+          <w:p>
+            <w:pPr>
+              <w:spacing w:after="0"/>
+            </w:pPr>
+            <w:r>
+              <w:rPr>
+                <w:rFonts w:ascii="Arial" w:hAnsi="Arial" w:cs="Arial"/>
+                <w:sz w:val="17"/>
+                <w:szCs w:val="17"/>
+              </w:rPr>
+              <w:t xml:space="preserve">2 days</w:t>
+            </w:r>
+          </w:p>
+        </w:tc>
+        <w:tc>
+          <w:tcPr/>
+          <w:p>
+            <w:pPr>
+              <w:spacing w:after="0"/>
+            </w:pPr>
+            <w:r>
+              <w:rPr>
+                <w:rFonts w:ascii="Arial" w:hAnsi="Arial" w:cs="Arial"/>
+                <w:sz w:val="17"/>
+                <w:szCs w:val="17"/>
+              </w:rPr>
+              <w:t xml:space="preserve">Stressor 2(e)(i)</w:t>
+            </w:r>
+          </w:p>
+        </w:tc>
+        <w:tc>
+          <w:tcPr/>
+          <w:p>
+            <w:pPr>
+              <w:spacing w:after="0"/>
+            </w:pPr>
+            <w:r>
+              <w:rPr>
+                <w:rFonts w:ascii="Arial" w:hAnsi="Arial" w:cs="Arial"/>
+                <w:sz w:val="17"/>
+                <w:szCs w:val="17"/>
+              </w:rPr>
+              <w:t xml:space="preserve">¶¶ 247, 185</w:t>
+            </w:r>
+          </w:p>
+        </w:tc>
+      </w:tr>
+      <w:tr>
+        <w:tc>
+          <w:tcPr/>
+          <w:p>
+            <w:pPr>
+              <w:spacing w:after="0"/>
+            </w:pPr>
+            <w:r>
+              <w:rPr>
+                <w:rFonts w:ascii="Arial" w:hAnsi="Arial" w:cs="Arial"/>
+                <w:sz w:val="17"/>
+                <w:szCs w:val="17"/>
+              </w:rPr>
+              <w:t xml:space="preserve">Payroll's direction to the Appellant's email to Payroll and the Manager, 10 May 2024</w:t>
+            </w:r>
+          </w:p>
+        </w:tc>
+        <w:tc>
+          <w:tcPr/>
+          <w:p>
+            <w:pPr>
+              <w:spacing w:after="0"/>
+            </w:pPr>
+            <w:r>
+              <w:rPr>
+                <w:rFonts w:ascii="Arial" w:hAnsi="Arial" w:cs="Arial"/>
+                <w:sz w:val="17"/>
+                <w:szCs w:val="17"/>
+              </w:rPr>
+              <w:t xml:space="preserve">7 days</w:t>
+            </w:r>
+          </w:p>
+        </w:tc>
+        <w:tc>
+          <w:tcPr/>
+          <w:p>
+            <w:pPr>
+              <w:spacing w:after="0"/>
+            </w:pPr>
+            <w:r>
+              <w:rPr>
+                <w:rFonts w:ascii="Arial" w:hAnsi="Arial" w:cs="Arial"/>
+                <w:sz w:val="17"/>
+                <w:szCs w:val="17"/>
+              </w:rPr>
+              <w:t xml:space="preserve">Stressor 2(e)(i)</w:t>
+            </w:r>
+          </w:p>
+        </w:tc>
+        <w:tc>
+          <w:tcPr/>
+          <w:p>
+            <w:pPr>
+              <w:spacing w:after="0"/>
+            </w:pPr>
+            <w:r>
+              <w:rPr>
+                <w:rFonts w:ascii="Arial" w:hAnsi="Arial" w:cs="Arial"/>
+                <w:sz w:val="17"/>
+                <w:szCs w:val="17"/>
+              </w:rPr>
+              <w:t xml:space="preserve">¶¶ 185, 191</w:t>
+            </w:r>
+          </w:p>
+        </w:tc>
+      </w:tr>
+      <w:tr>
+        <w:tc>
+          <w:tcPr/>
+          <w:p>
+            <w:pPr>
+              <w:spacing w:after="0"/>
+            </w:pPr>
+            <w:r>
+              <w:rPr>
+                <w:rFonts w:ascii="Arial" w:hAnsi="Arial" w:cs="Arial"/>
+                <w:sz w:val="17"/>
+                <w:szCs w:val="17"/>
+              </w:rPr>
+              <w:t xml:space="preserve">Payroll's direction to Payroll's email that nothing had been corrected, 13 May 2024</w:t>
+            </w:r>
+          </w:p>
+        </w:tc>
+        <w:tc>
+          <w:tcPr/>
+          <w:p>
+            <w:pPr>
+              <w:spacing w:after="0"/>
+            </w:pPr>
+            <w:r>
+              <w:rPr>
+                <w:rFonts w:ascii="Arial" w:hAnsi="Arial" w:cs="Arial"/>
+                <w:sz w:val="17"/>
+                <w:szCs w:val="17"/>
+              </w:rPr>
+              <w:t xml:space="preserve">10 days</w:t>
+            </w:r>
+          </w:p>
+        </w:tc>
+        <w:tc>
+          <w:tcPr/>
+          <w:p>
+            <w:pPr>
+              <w:spacing w:after="0"/>
+            </w:pPr>
+            <w:r>
+              <w:rPr>
+                <w:rFonts w:ascii="Arial" w:hAnsi="Arial" w:cs="Arial"/>
+                <w:sz w:val="17"/>
+                <w:szCs w:val="17"/>
+              </w:rPr>
+              <w:t xml:space="preserve">Stressor 2(e)(i)</w:t>
+            </w:r>
+          </w:p>
+        </w:tc>
+        <w:tc>
+          <w:tcPr/>
+          <w:p>
+            <w:pPr>
+              <w:spacing w:after="0"/>
+            </w:pPr>
+            <w:r>
+              <w:rPr>
+                <w:rFonts w:ascii="Arial" w:hAnsi="Arial" w:cs="Arial"/>
+                <w:sz w:val="17"/>
+                <w:szCs w:val="17"/>
+              </w:rPr>
+              <w:t xml:space="preserve">¶¶ 185, 193</w:t>
+            </w:r>
+          </w:p>
+        </w:tc>
+      </w:tr>
+      <w:tr>
+        <w:tc>
+          <w:tcPr/>
+          <w:p>
+            <w:pPr>
+              <w:spacing w:after="0"/>
+            </w:pPr>
+            <w:r>
+              <w:rPr>
+                <w:rFonts w:ascii="Arial" w:hAnsi="Arial" w:cs="Arial"/>
+                <w:sz w:val="17"/>
+                <w:szCs w:val="17"/>
+              </w:rPr>
+              <w:t xml:space="preserve">Payroll's direction to the Manager's "still waiting" email, 21 May 2024</w:t>
+            </w:r>
+          </w:p>
+        </w:tc>
+        <w:tc>
+          <w:tcPr/>
+          <w:p>
+            <w:pPr>
+              <w:spacing w:after="0"/>
+            </w:pPr>
+            <w:r>
+              <w:rPr>
+                <w:rFonts w:ascii="Arial" w:hAnsi="Arial" w:cs="Arial"/>
+                <w:sz w:val="17"/>
+                <w:szCs w:val="17"/>
+              </w:rPr>
+              <w:t xml:space="preserve">18 days</w:t>
+            </w:r>
+          </w:p>
+        </w:tc>
+        <w:tc>
+          <w:tcPr/>
+          <w:p>
+            <w:pPr>
+              <w:spacing w:after="0"/>
+            </w:pPr>
+            <w:r>
+              <w:rPr>
+                <w:rFonts w:ascii="Arial" w:hAnsi="Arial" w:cs="Arial"/>
+                <w:sz w:val="17"/>
+                <w:szCs w:val="17"/>
+              </w:rPr>
+              <w:t xml:space="preserve">Stressor 2(e)(i)</w:t>
+            </w:r>
+          </w:p>
+        </w:tc>
+        <w:tc>
+          <w:tcPr/>
+          <w:p>
+            <w:pPr>
+              <w:spacing w:after="0"/>
+            </w:pPr>
+            <w:r>
+              <w:rPr>
+                <w:rFonts w:ascii="Arial" w:hAnsi="Arial" w:cs="Arial"/>
+                <w:sz w:val="17"/>
+                <w:szCs w:val="17"/>
+              </w:rPr>
+              <w:t xml:space="preserve">¶¶ 185, 195</w:t>
+            </w:r>
+          </w:p>
+        </w:tc>
+      </w:tr>
+      <w:tr>
+        <w:tc>
+          <w:tcPr/>
+          <w:p>
+            <w:pPr>
+              <w:spacing w:after="0"/>
+            </w:pPr>
+            <w:r>
+              <w:rPr>
+                <w:rFonts w:ascii="Arial" w:hAnsi="Arial" w:cs="Arial"/>
+                <w:sz w:val="17"/>
+                <w:szCs w:val="17"/>
+              </w:rPr>
+              <w:t xml:space="preserve">Payroll's direction to the Manager's AVAC of 28 May 2024</w:t>
+            </w:r>
+          </w:p>
+        </w:tc>
+        <w:tc>
+          <w:tcPr/>
+          <w:p>
+            <w:pPr>
+              <w:spacing w:after="0"/>
+            </w:pPr>
+            <w:r>
+              <w:rPr>
+                <w:rFonts w:ascii="Arial" w:hAnsi="Arial" w:cs="Arial"/>
+                <w:sz w:val="17"/>
+                <w:szCs w:val="17"/>
+              </w:rPr>
+              <w:t xml:space="preserve">25 days</w:t>
+            </w:r>
+          </w:p>
+        </w:tc>
+        <w:tc>
+          <w:tcPr/>
+          <w:p>
+            <w:pPr>
+              <w:spacing w:after="0"/>
+            </w:pPr>
+            <w:r>
+              <w:rPr>
+                <w:rFonts w:ascii="Arial" w:hAnsi="Arial" w:cs="Arial"/>
+                <w:sz w:val="17"/>
+                <w:szCs w:val="17"/>
+              </w:rPr>
+              <w:t xml:space="preserve">Stressor 2(e)(i)</w:t>
+            </w:r>
+          </w:p>
+        </w:tc>
+        <w:tc>
+          <w:tcPr/>
+          <w:p>
+            <w:pPr>
+              <w:spacing w:after="0"/>
+            </w:pPr>
+            <w:r>
+              <w:rPr>
+                <w:rFonts w:ascii="Arial" w:hAnsi="Arial" w:cs="Arial"/>
+                <w:sz w:val="17"/>
+                <w:szCs w:val="17"/>
+              </w:rPr>
+              <w:t xml:space="preserve">¶¶ 185, 197, 209</w:t>
+            </w:r>
+          </w:p>
+        </w:tc>
+      </w:tr>
+      <w:tr>
+        <w:tc>
+          <w:tcPr/>
+          <w:p>
+            <w:pPr>
+              <w:spacing w:after="0"/>
+            </w:pPr>
+            <w:r>
+              <w:rPr>
+                <w:rFonts w:ascii="Arial" w:hAnsi="Arial" w:cs="Arial"/>
+                <w:sz w:val="17"/>
+                <w:szCs w:val="17"/>
+              </w:rPr>
+              <w:t xml:space="preserve">That AVAC to its processing as "Part Completed", 30 May 2024</w:t>
+            </w:r>
+          </w:p>
+        </w:tc>
+        <w:tc>
+          <w:tcPr/>
+          <w:p>
+            <w:pPr>
+              <w:spacing w:after="0"/>
+            </w:pPr>
+            <w:r>
+              <w:rPr>
+                <w:rFonts w:ascii="Arial" w:hAnsi="Arial" w:cs="Arial"/>
+                <w:sz w:val="17"/>
+                <w:szCs w:val="17"/>
+              </w:rPr>
+              <w:t xml:space="preserve">2 days</w:t>
+            </w:r>
+          </w:p>
+        </w:tc>
+        <w:tc>
+          <w:tcPr/>
+          <w:p>
+            <w:pPr>
+              <w:spacing w:after="0"/>
+            </w:pPr>
+            <w:r>
+              <w:rPr>
+                <w:rFonts w:ascii="Arial" w:hAnsi="Arial" w:cs="Arial"/>
+                <w:sz w:val="17"/>
+                <w:szCs w:val="17"/>
+              </w:rPr>
+              <w:t xml:space="preserve">Stressor 2(e)(i)</w:t>
+            </w:r>
+          </w:p>
+        </w:tc>
+        <w:tc>
+          <w:tcPr/>
+          <w:p>
+            <w:pPr>
+              <w:spacing w:after="0"/>
+            </w:pPr>
+            <w:r>
+              <w:rPr>
+                <w:rFonts w:ascii="Arial" w:hAnsi="Arial" w:cs="Arial"/>
+                <w:sz w:val="17"/>
+                <w:szCs w:val="17"/>
+              </w:rPr>
+              <w:t xml:space="preserve">¶ 203</w:t>
+            </w:r>
+          </w:p>
+        </w:tc>
+      </w:tr>
+      <w:tr>
+        <w:tc>
+          <w:tcPr/>
+          <w:p>
+            <w:pPr>
+              <w:spacing w:after="0"/>
+            </w:pPr>
+            <w:r>
+              <w:rPr>
+                <w:rFonts w:ascii="Arial" w:hAnsi="Arial" w:cs="Arial"/>
+                <w:sz w:val="17"/>
+                <w:szCs w:val="17"/>
+              </w:rPr>
+              <w:t xml:space="preserve">The shifts of 28 February, 30 March and 1 April 2024 to the payslip that adjusted them, pay date 5 June 2024</w:t>
+            </w:r>
+          </w:p>
+        </w:tc>
+        <w:tc>
+          <w:tcPr/>
+          <w:p>
+            <w:pPr>
+              <w:spacing w:after="0"/>
+            </w:pPr>
+            <w:r>
+              <w:rPr>
+                <w:rFonts w:ascii="Arial" w:hAnsi="Arial" w:cs="Arial"/>
+                <w:sz w:val="17"/>
+                <w:szCs w:val="17"/>
+              </w:rPr>
+              <w:t xml:space="preserve">98 days; 67 days; 65 days</w:t>
+            </w:r>
+          </w:p>
+        </w:tc>
+        <w:tc>
+          <w:tcPr/>
+          <w:p>
+            <w:pPr>
+              <w:spacing w:after="0"/>
+            </w:pPr>
+            <w:r>
+              <w:rPr>
+                <w:rFonts w:ascii="Arial" w:hAnsi="Arial" w:cs="Arial"/>
+                <w:sz w:val="17"/>
+                <w:szCs w:val="17"/>
+              </w:rPr>
+              <w:t xml:space="preserve">Stressor 2(e)(i)</w:t>
+            </w:r>
+          </w:p>
+        </w:tc>
+        <w:tc>
+          <w:tcPr/>
+          <w:p>
+            <w:pPr>
+              <w:spacing w:after="0"/>
+            </w:pPr>
+            <w:r>
+              <w:rPr>
+                <w:rFonts w:ascii="Arial" w:hAnsi="Arial" w:cs="Arial"/>
+                <w:sz w:val="17"/>
+                <w:szCs w:val="17"/>
+              </w:rPr>
+              <w:t xml:space="preserve">¶¶ 187 to 189; Payroll disclosure, July 2025</w:t>
+            </w:r>
+          </w:p>
+        </w:tc>
+      </w:tr>
+      <w:tr>
+        <w:tc>
+          <w:tcPr/>
+          <w:p>
+            <w:pPr>
+              <w:spacing w:after="0"/>
+            </w:pPr>
+            <w:r>
+              <w:rPr>
+                <w:rFonts w:ascii="Arial" w:hAnsi="Arial" w:cs="Arial"/>
+                <w:sz w:val="17"/>
+                <w:szCs w:val="17"/>
+              </w:rPr>
+              <w:t xml:space="preserve">The shift of 9 February 2024 to the payslip carrying its correction, pay date 2 July 2025</w:t>
+            </w:r>
+          </w:p>
+        </w:tc>
+        <w:tc>
+          <w:tcPr/>
+          <w:p>
+            <w:pPr>
+              <w:spacing w:after="0"/>
+            </w:pPr>
+            <w:r>
+              <w:rPr>
+                <w:rFonts w:ascii="Arial" w:hAnsi="Arial" w:cs="Arial"/>
+                <w:sz w:val="17"/>
+                <w:szCs w:val="17"/>
+              </w:rPr>
+              <w:t xml:space="preserve">509 days</w:t>
+            </w:r>
+          </w:p>
+        </w:tc>
+        <w:tc>
+          <w:tcPr/>
+          <w:p>
+            <w:pPr>
+              <w:spacing w:after="0"/>
+            </w:pPr>
+            <w:r>
+              <w:rPr>
+                <w:rFonts w:ascii="Arial" w:hAnsi="Arial" w:cs="Arial"/>
+                <w:sz w:val="17"/>
+                <w:szCs w:val="17"/>
+              </w:rPr>
+              <w:t xml:space="preserve">Stressor 2(e)(i)</w:t>
+            </w:r>
+          </w:p>
+        </w:tc>
+        <w:tc>
+          <w:tcPr/>
+          <w:p>
+            <w:pPr>
+              <w:spacing w:after="0"/>
+            </w:pPr>
+            <w:r>
+              <w:rPr>
+                <w:rFonts w:ascii="Arial" w:hAnsi="Arial" w:cs="Arial"/>
+                <w:sz w:val="17"/>
+                <w:szCs w:val="17"/>
+              </w:rPr>
+              <w:t xml:space="preserve">¶¶ 185 to 186; Payroll disclosure, July 2025</w:t>
+            </w:r>
+          </w:p>
+        </w:tc>
+      </w:tr>
+      <w:tr>
+        <w:tc>
+          <w:tcPr/>
+          <w:p>
+            <w:pPr>
+              <w:spacing w:after="0"/>
+            </w:pPr>
+            <w:r>
+              <w:rPr>
+                <w:rFonts w:ascii="Arial" w:hAnsi="Arial" w:cs="Arial"/>
+                <w:sz w:val="17"/>
+                <w:szCs w:val="17"/>
+              </w:rPr>
+              <w:t xml:space="preserve">The request for office hours, 15 May 2024 at 1:15 pm, to the request to retract it, 6:23 pm</w:t>
+            </w:r>
+          </w:p>
+        </w:tc>
+        <w:tc>
+          <w:tcPr/>
+          <w:p>
+            <w:pPr>
+              <w:spacing w:after="0"/>
+            </w:pPr>
+            <w:r>
+              <w:rPr>
+                <w:rFonts w:ascii="Arial" w:hAnsi="Arial" w:cs="Arial"/>
+                <w:sz w:val="17"/>
+                <w:szCs w:val="17"/>
+              </w:rPr>
+              <w:t xml:space="preserve">5 hours, 8 minutes</w:t>
+            </w:r>
+          </w:p>
+        </w:tc>
+        <w:tc>
+          <w:tcPr/>
+          <w:p>
+            <w:pPr>
+              <w:spacing w:after="0"/>
+            </w:pPr>
+            <w:r>
+              <w:rPr>
+                <w:rFonts w:ascii="Arial" w:hAnsi="Arial" w:cs="Arial"/>
+                <w:sz w:val="17"/>
+                <w:szCs w:val="17"/>
+              </w:rPr>
+              <w:t xml:space="preserve">Stressor 1(i)</w:t>
+            </w:r>
+          </w:p>
+        </w:tc>
+        <w:tc>
+          <w:tcPr/>
+          <w:p>
+            <w:pPr>
+              <w:spacing w:after="0"/>
+            </w:pPr>
+            <w:r>
+              <w:rPr>
+                <w:rFonts w:ascii="Arial" w:hAnsi="Arial" w:cs="Arial"/>
+                <w:sz w:val="17"/>
+                <w:szCs w:val="17"/>
+              </w:rPr>
+              <w:t xml:space="preserve">¶¶ 74, 76</w:t>
+            </w:r>
+          </w:p>
+        </w:tc>
+      </w:tr>
+      <w:tr>
+        <w:tc>
+          <w:tcPr/>
+          <w:p>
+            <w:pPr>
+              <w:spacing w:after="0"/>
+            </w:pPr>
+            <w:r>
+              <w:rPr>
+                <w:rFonts w:ascii="Arial" w:hAnsi="Arial" w:cs="Arial"/>
+                <w:sz w:val="17"/>
+                <w:szCs w:val="17"/>
+              </w:rPr>
+              <w:t xml:space="preserve">That request to the hours being stated to the department, 17 May 2024 at 9:30 am</w:t>
+            </w:r>
+          </w:p>
+        </w:tc>
+        <w:tc>
+          <w:tcPr/>
+          <w:p>
+            <w:pPr>
+              <w:spacing w:after="0"/>
+            </w:pPr>
+            <w:r>
+              <w:rPr>
+                <w:rFonts w:ascii="Arial" w:hAnsi="Arial" w:cs="Arial"/>
+                <w:sz w:val="17"/>
+                <w:szCs w:val="17"/>
+              </w:rPr>
+              <w:t xml:space="preserve">1 day, 20 hours, 15 minutes</w:t>
+            </w:r>
+          </w:p>
+        </w:tc>
+        <w:tc>
+          <w:tcPr/>
+          <w:p>
+            <w:pPr>
+              <w:spacing w:after="0"/>
+            </w:pPr>
+            <w:r>
+              <w:rPr>
+                <w:rFonts w:ascii="Arial" w:hAnsi="Arial" w:cs="Arial"/>
+                <w:sz w:val="17"/>
+                <w:szCs w:val="17"/>
+              </w:rPr>
+              <w:t xml:space="preserve">Stressor 1(i)</w:t>
+            </w:r>
+          </w:p>
+        </w:tc>
+        <w:tc>
+          <w:tcPr/>
+          <w:p>
+            <w:pPr>
+              <w:spacing w:after="0"/>
+            </w:pPr>
+            <w:r>
+              <w:rPr>
+                <w:rFonts w:ascii="Arial" w:hAnsi="Arial" w:cs="Arial"/>
+                <w:sz w:val="17"/>
+                <w:szCs w:val="17"/>
+              </w:rPr>
+              <w:t xml:space="preserve">¶¶ 74, 81</w:t>
+            </w:r>
+          </w:p>
+        </w:tc>
+      </w:tr>
+      <w:tr>
+        <w:tc>
+          <w:tcPr/>
+          <w:p>
+            <w:pPr>
+              <w:spacing w:after="0"/>
+            </w:pPr>
+            <w:r>
+              <w:rPr>
+                <w:rFonts w:ascii="Arial" w:hAnsi="Arial" w:cs="Arial"/>
+                <w:sz w:val="17"/>
+                <w:szCs w:val="17"/>
+              </w:rPr>
+              <w:t xml:space="preserve">That request to the Director's question about which changes had concerned him, 21 May 2024 at 2:53 pm</w:t>
+            </w:r>
+          </w:p>
+        </w:tc>
+        <w:tc>
+          <w:tcPr/>
+          <w:p>
+            <w:pPr>
+              <w:spacing w:after="0"/>
+            </w:pPr>
+            <w:r>
+              <w:rPr>
+                <w:rFonts w:ascii="Arial" w:hAnsi="Arial" w:cs="Arial"/>
+                <w:sz w:val="17"/>
+                <w:szCs w:val="17"/>
+              </w:rPr>
+              <w:t xml:space="preserve">6 days, 1 hour, 38 minutes</w:t>
+            </w:r>
+          </w:p>
+        </w:tc>
+        <w:tc>
+          <w:tcPr/>
+          <w:p>
+            <w:pPr>
+              <w:spacing w:after="0"/>
+            </w:pPr>
+            <w:r>
+              <w:rPr>
+                <w:rFonts w:ascii="Arial" w:hAnsi="Arial" w:cs="Arial"/>
+                <w:sz w:val="17"/>
+                <w:szCs w:val="17"/>
+              </w:rPr>
+              <w:t xml:space="preserve">Stressor 1(i)</w:t>
+            </w:r>
+          </w:p>
+        </w:tc>
+        <w:tc>
+          <w:tcPr/>
+          <w:p>
+            <w:pPr>
+              <w:spacing w:after="0"/>
+            </w:pPr>
+            <w:r>
+              <w:rPr>
+                <w:rFonts w:ascii="Arial" w:hAnsi="Arial" w:cs="Arial"/>
+                <w:sz w:val="17"/>
+                <w:szCs w:val="17"/>
+              </w:rPr>
+              <w:t xml:space="preserve">¶¶ 74, 79</w:t>
+            </w:r>
+          </w:p>
+        </w:tc>
+      </w:tr>
     </w:tbl>
     <w:p>
       <w:pPr>
@@ -4272,7 +5222,7 @@
           <w:sz w:val="18"/>
           <w:szCs w:val="18"/>
         </w:rPr>
-        <w:t xml:space="preserve">Particulars: paragraphs 62 to 64, 92, 97 to 98, 102 to 103, 124 to 125, 249 of the notice to admit facts served 28 August 2026, admitted 8 September 2026.</w:t>
+        <w:t xml:space="preserve">Particulars: paragraphs 55, 62 to 64, 73 to 74, 76, 79, 81, 92, 97 to 98, 102 to 103, 124 to 125, 185 to 197, 203, 209, 242 to 247, 249 to 250 of the notice to admit facts served 28 August 2026, admitted 8 September 2026; the Respondent's payroll disclosure of July 2025 (Part B.7.5).</w:t>
       </w:r>
     </w:p>
     <w:p>

</xml_diff>

<commit_message>
WC/2024/227: one-page election and directions requested (order register); roster row in B.4; combined set re-ordered
Co-Authored-By: Claude Fable 5.1 <noreply@anthropic.com>
Claude-Session: https://claude.ai/code/session_01PbSZiMB1koFR46V5hQyVcy
</commit_message>
<xml_diff>
--- a/wc2024227/drafts/second-amended-9A/2026-10_SECOND_AMENDED_9A_FINAL.docx
+++ b/wc2024227/drafts/second-amended-9A/2026-10_SECOND_AMENDED_9A_FINAL.docx
@@ -3418,6 +3418,72 @@
                 <w:szCs w:val="17"/>
               </w:rPr>
               <w:t xml:space="preserve">Facts</w:t>
+            </w:r>
+          </w:p>
+        </w:tc>
+      </w:tr>
+      <w:tr>
+        <w:tc>
+          <w:tcPr/>
+          <w:p>
+            <w:pPr>
+              <w:spacing w:after="0"/>
+            </w:pPr>
+            <w:r>
+              <w:rPr>
+                <w:rFonts w:ascii="Arial" w:hAnsi="Arial" w:cs="Arial"/>
+                <w:sz w:val="17"/>
+                <w:szCs w:val="17"/>
+              </w:rPr>
+              <w:t xml:space="preserve">Rostered finish on 17 March 2024 at 23:00 to rostered start on 18 March 2024 at 06:00; the minimum is ten hours, or eight by written agreement, and the agreement applied only to staff-initiated swaps, none being alleged; with travel, less than five hours</w:t>
+            </w:r>
+          </w:p>
+        </w:tc>
+        <w:tc>
+          <w:tcPr/>
+          <w:p>
+            <w:pPr>
+              <w:spacing w:after="0"/>
+            </w:pPr>
+            <w:r>
+              <w:rPr>
+                <w:rFonts w:ascii="Arial" w:hAnsi="Arial" w:cs="Arial"/>
+                <w:sz w:val="17"/>
+                <w:szCs w:val="17"/>
+              </w:rPr>
+              <w:t xml:space="preserve">7 hours</w:t>
+            </w:r>
+          </w:p>
+        </w:tc>
+        <w:tc>
+          <w:tcPr/>
+          <w:p>
+            <w:pPr>
+              <w:spacing w:after="0"/>
+            </w:pPr>
+            <w:r>
+              <w:rPr>
+                <w:rFonts w:ascii="Arial" w:hAnsi="Arial" w:cs="Arial"/>
+                <w:sz w:val="17"/>
+                <w:szCs w:val="17"/>
+              </w:rPr>
+              <w:t xml:space="preserve">Stressor 3(d) to (g); the Review Unit's own finding at 3(m)</w:t>
+            </w:r>
+          </w:p>
+        </w:tc>
+        <w:tc>
+          <w:tcPr/>
+          <w:p>
+            <w:pPr>
+              <w:spacing w:after="0"/>
+            </w:pPr>
+            <w:r>
+              <w:rPr>
+                <w:rFonts w:ascii="Arial" w:hAnsi="Arial" w:cs="Arial"/>
+                <w:sz w:val="17"/>
+                <w:szCs w:val="17"/>
+              </w:rPr>
+              <w:t xml:space="preserve">¶¶ 284 to 285, 225, 234, 251, 260</w:t>
             </w:r>
           </w:p>
         </w:tc>

</xml_diff>

<commit_message>
WC/2024/227: FINAL set — B.6.5 witness-list sentence; request item 4 covers amended lists and outlines; check 1 corrections (fact 207 attribution; Earl quotation)
Co-Authored-By: Claude Fable 5.1 <noreply@anthropic.com>
Claude-Session: https://claude.ai/code/session_01PbSZiMB1koFR46V5hQyVcy
</commit_message>
<xml_diff>
--- a/wc2024227/drafts/second-amended-9A/2026-10_SECOND_AMENDED_9A_FINAL.docx
+++ b/wc2024227/drafts/second-amended-9A/2026-10_SECOND_AMENDED_9A_FINAL.docx
@@ -2080,7 +2080,7 @@
           <w:sz w:val="20"/>
           <w:szCs w:val="20"/>
         </w:rPr>
-        <w:t xml:space="preserve">The shift of 9 February 2024 was not corrected on that payslip. On Payroll's account it "was amended with an exemption for the Validation of Claims form on the 30.06.2025 and is on Payslip 07", for the pay period 9 to 22 June 2025, pay date 2 July 2025. That was 425 days after Payroll's direction of 3 May 2024 (the amendment itself being dated 30 June 2025); after the date of injury; after the Respondent's review decision of 24 October 2024; and after this appeal was commenced. It was made with an exemption from the form the Manager had asked the Appellant to sign on 28 May 2024. [¶¶ 196 to 197] The Respondent's pleading and its outlines of evidence (Part B.6) describe the pay issues as "corrected" and "remedied in a timely manner" [¶ 207] without stating these dates.</w:t>
+        <w:t xml:space="preserve">The shift of 9 February 2024 was not corrected on that payslip. On Payroll's account it "was amended with an exemption for the Validation of Claims form on the 30.06.2025 and is on Payslip 07", for the pay period 9 to 22 June 2025, pay date 2 July 2025. That was 425 days after Payroll's direction of 3 May 2024 (the amendment itself being dated 30 June 2025); after the date of injury; after the Respondent's review decision of 24 October 2024; and after this appeal was commenced. It was made with an exemption from the form the Manager had asked the Appellant to sign on 28 May 2024. [¶¶ 196 to 197] The Respondent's pleading describes the pay issues as "remedied in a timely manner" [¶ 207], and its outlines of evidence describe them as "corrected" (Part B.6.3), without stating these dates.</w:t>
       </w:r>
     </w:p>
     <w:p>
@@ -5601,7 +5601,7 @@
           <w:sz w:val="20"/>
           <w:szCs w:val="20"/>
         </w:rPr>
-        <w:t xml:space="preserve">The outline states that the Appellant "uploaded his Special Pandemic Leave application together with a supporting attachment on 20 February 2024 at 11:41am"; that it was declined on 21 February "on the stated basis that a minimum five-day period of leave was required" and on 29 February "for want of an attached statutory declaration or evidence of a positive test"; that "On payroll's own review of the system's attachment history, however, the supporting document had in fact been attached from the original 20 February submission onward, meaning the second decline also appears to have been made in error"; that it was then "approved that day by the delegate and manager" and that the Appellant "continued to be paid, throughout the period this was being sorted out"; that for the fortnight including 30 March 2024 an entry was first processed so as to "trigger an automatic hours reduction on his payslip" and was "later corrected"; and that from the roster the break of 17 to 18 March 2024 "was only seven hours, that he was rostered on ordinary hours rather than overtime at the time, and that he took paid sick leave on 19 March 2024".</w:t>
+        <w:t xml:space="preserve">The outline states that the Appellant "uploaded his Special Pandemic Leave application together with a supporting attachment on 20 February 2024 at 11:41am"; that it was declined on 21 February "on the stated basis that a minimum five-day period of leave was required" and on 29 February "for want of an attached statutory declaration or evidence of a positive test"; that "On payroll's own review of the system's attachment history, however, the supporting document had in fact been attached from the original 20 February submission onward, meaning the second decline also appears to have been made in error"; that it was then "approved that day by the delegate and manager" and that the Appellant "continued to be paid, throughout the period this was being sorted out"; that for the fortnight including 30 March 2024 the public holiday was first processed as "public holiday not required", which "triggered an automatic hours reduction on his payslip", and that "The entry was later corrected"; and that from the roster the break of 17 to 18 March 2024 "was only seven hours, that he was rostered on ordinary hours rather than overtime at the time, and that he took paid sick leave on 19 March 2024".</w:t>
       </w:r>
     </w:p>
     <w:p>
@@ -5623,7 +5623,7 @@
           <w:sz w:val="20"/>
           <w:szCs w:val="20"/>
         </w:rPr>
-        <w:t xml:space="preserve">No outline addresses the removal of database access or its restoration; the Contact &amp; Number Changes book; any consultation preceding the change notified on 15 April 2024; the reports of the MASPER Registrar of 3 and 8 May 2024; the emails of the Integrated Respiratory Service of 15 and 20 May 2024; the amendment of the clinic contact-details document; the fatigue enquiry of 8 April 2024 or the interval to 1 May 2024; the email to Human Resources of 10 May 2024; or the absence of fatigue risk management at the Switchboard before 30 June 2024. No medical or expert evidence is notified.</w:t>
+        <w:t xml:space="preserve">No outline addresses the removal of database access or its restoration; the Contact &amp; Number Changes book; any consultation preceding the change notified on 15 April 2024; the reports of the MASPER Registrar of 3 and 8 May 2024; the emails of the Integrated Respiratory Service of 15 and 20 May 2024; the amendment of the clinic contact-details document; the fatigue enquiry of 8 April 2024 or the interval to 1 May 2024; the email to Human Resources of 10 May 2024; or the absence of fatigue risk management at the Switchboard before 30 June 2024. No medical or expert evidence is notified. The Respondent's list of witnesses, sent to the Registry for filing and to the Appellant on 24 September 2026, names those four witnesses, described as "lay" witnesses, and no other, and states that the Respondent "reserves its right to amend this list depending on the case presented by the appellant at the hearing".</w:t>
       </w:r>
     </w:p>
     <w:p>

</xml_diff>

<commit_message>
WC/2024/227: 9A — particulars folded into the body; facts 32 and 292 pleaded; 154 and 228–231 status stated in the body
Co-Authored-By: Claude Fable 5.1 <noreply@anthropic.com>
Claude-Session: https://claude.ai/code/session_01PbSZiMB1koFR46V5hQyVcy
</commit_message>
<xml_diff>
--- a/wc2024227/drafts/second-amended-9A/2026-10_SECOND_AMENDED_9A_FINAL.docx
+++ b/wc2024227/drafts/second-amended-9A/2026-10_SECOND_AMENDED_9A_FINAL.docx
@@ -59,22 +59,7 @@
           <w:sz w:val="20"/>
           <w:szCs w:val="20"/>
         </w:rPr>
-        <w:t xml:space="preserve">Appellant: Cory Lea Shepherd. Employer: State of Queensland (Queensland Health) - Logan Hospital Switchboard. Role: Administration Officer, Switchboard Services, classification AO3, a continuous shift working role. Injury: major depressive disorder with anxious distress (DSM-5 296.23). The treating psychiatrist recorded the diagnosis in writing on 24 October 2024 and gave it the code DSM-5 296.23 in his report of 13 February 2025. The injury is a diagnosed medical condition. It arose from the Appellant's employment over the course of conduct pleaded at Part B.2 below, between about June 2023 and June 2024. It is not pleaded as arising from an event on a single day. The date of injury is 18 June 2024, as recorded on the work capacity certificates. The injury is pleaded as arising from that course of conduct, not from a single event on that day.</w:t>
-      </w:r>
-    </w:p>
-    <w:p>
-      <w:pPr>
-        <w:spacing w:before="0" w:after="100" w:line="264" w:lineRule="auto"/>
-        <w:ind w:left="284"/>
-      </w:pPr>
-      <w:r>
-        <w:rPr>
-          <w:rFonts w:ascii="Arial" w:hAnsi="Arial" w:cs="Arial"/>
-          <w:i/>
-          <w:sz w:val="18"/>
-          <w:szCs w:val="18"/>
-        </w:rPr>
-        <w:t xml:space="preserve">Particulars: paragraphs 1 to 4, 13 to 16 of the notice to admit facts served 28 August 2026, admitted 8 September 2026.</w:t>
+        <w:t xml:space="preserve">Appellant: Cory Lea Shepherd. Employer: State of Queensland (Queensland Health) - Logan Hospital Switchboard. Role: Administration Officer, Switchboard Services, classification AO3, a continuous shift working role. [¶¶ 1 to 4, 13] Three movement forms approved in 2026 record the shift arrangement as "Continuous Shift Worker", and the Respondent does not allege that the Appellant ceased to be a continuous shift worker at any time before 18 June 2024. [¶¶ 14 to 16] Injury: major depressive disorder with anxious distress (DSM-5 296.23). The treating psychiatrist recorded the diagnosis in writing on 24 October 2024 and gave it the code DSM-5 296.23 in his report of 13 February 2025. The injury is a diagnosed medical condition. It arose from the Appellant's employment over the course of conduct pleaded at Part B.2 below, between about June 2023 and June 2024. It is not pleaded as arising from an event on a single day. The date of injury is 18 June 2024, as recorded on the work capacity certificates. The injury is pleaded as arising from that course of conduct, not from a single event on that day.</w:t>
       </w:r>
     </w:p>
     <w:p>
@@ -162,22 +147,7 @@
           <w:sz w:val="20"/>
           <w:szCs w:val="20"/>
         </w:rPr>
-        <w:t xml:space="preserve">1.1 The Switchboard receives emergency response notifications and distributes them to the response groups by category of emergency, and maintains the contact and paging information by which that is done.</w:t>
-      </w:r>
-    </w:p>
-    <w:p>
-      <w:pPr>
-        <w:spacing w:before="0" w:after="100" w:line="264" w:lineRule="auto"/>
-        <w:ind w:left="284"/>
-      </w:pPr>
-      <w:r>
-        <w:rPr>
-          <w:rFonts w:ascii="Arial" w:hAnsi="Arial" w:cs="Arial"/>
-          <w:i/>
-          <w:sz w:val="18"/>
-          <w:szCs w:val="18"/>
-        </w:rPr>
-        <w:t xml:space="preserve">Duty engaged: paragraphs 5, 7 to 8, 10 of that notice (the role description).</w:t>
+        <w:t xml:space="preserve">1.1 The Switchboard receives emergency response notifications and distributes them to the response groups by category of emergency, and maintains the contact and paging information by which that is done. [¶¶ 5, 7 to 8, 10] The position is also required to work effectively with limited supervision, to meet deadlines and establish work priorities, and to work as a member of a multi-disciplinary team in a changing environment. [¶ 11]</w:t>
       </w:r>
     </w:p>
     <w:p>
@@ -1333,7 +1303,7 @@
           <w:sz w:val="20"/>
           <w:szCs w:val="20"/>
         </w:rPr>
-        <w:t xml:space="preserve">The Respondent has admitted that it does not have a copy of the removed page. [¶ 288]</w:t>
+        <w:t xml:space="preserve">The Respondent has admitted that it does not have a copy of the removed page. [¶ 288] On 18 February 2026 it also admitted that in her email to the Director of 6 June 2023 the Manager stated: "I did raise my voice and asked him to please stop talking over the top of me." [¶ 292] The Respondent's amended List of Documents of 14 August 2026 does not list the Communication Book, nor any page or entry from it; that proposition (paragraph 154 of the notice) was not admitted.</w:t>
       </w:r>
     </w:p>
     <w:p>
@@ -1420,7 +1390,7 @@
           <w:sz w:val="20"/>
           <w:szCs w:val="20"/>
         </w:rPr>
-        <w:t xml:space="preserve">On 31 August 2023 he provided a written application headed "Request to Increase Working Hours to Full Time Rotational Roster", expressing willingness to take on additional night shifts. [¶¶ 30 to 31]</w:t>
+        <w:t xml:space="preserve">On 31 August 2023 he provided a written application headed "Request to Increase Working Hours to Full Time Rotational Roster", expressing willingness to take on additional night shifts. [¶¶ 30 to 31] The same sentence of that application records his advocacy to become a union representative for the Switchboard department. [¶ 32]</w:t>
       </w:r>
     </w:p>
     <w:p>
@@ -2728,7 +2698,7 @@
           <w:sz w:val="20"/>
           <w:szCs w:val="20"/>
         </w:rPr>
-        <w:t xml:space="preserve">The entries are those recorded in the register at Tab 31. The employer holds its own record of the MET calls for 17 and 18 March 2024. [¶ 268]</w:t>
+        <w:t xml:space="preserve">The entries are those recorded in the register at Tab 31. The propositions drawn from it (paragraphs 228 to 231 of the notice: the eight entries on 17 March including the MET call and Code Blue to Ward 2H bed 7; the six entries between 06:00 and 14:00 on 18 March including the two Neonatal MET calls; and the 19 March entry "CALLED VIA SWITRCHBOARD") were not admitted, and the authenticity of the copy is in issue (Part B.7.3). The employer holds its own record of the MET calls for 17 and 18 March 2024. [¶ 268]</w:t>
       </w:r>
     </w:p>
     <w:p>
@@ -3255,7 +3225,7 @@
           <w:sz w:val="20"/>
           <w:szCs w:val="20"/>
         </w:rPr>
-        <w:t xml:space="preserve">The Respondent's amended List of Documents of 14 August 2026 records that the Appellant provided to WorkCover Queensland, at item 12, an email of 12 July 2024 with an attachment described as "Event overview - undated"; at item 14, an email of 18 July 2024 with an attachment described as "Witness statement - Carolyn Jeffrey"; at item 25, an email of 29 August 2024 described as regarding the after hours on call change, with an attachment described as "Email: After hours on call process"; at item 26, an email of 30 August 2024 described as regarding failure to consult, with an attachment described as "Email: Task change switchboard - 19/04/2024"; and at item 27, an email of 30 August 2024 described as regarding failure to consult, with an attachment described as "Email: MASPER process - 09/05/2024". It further records, at item 16, an email from Ms Carolyn Jeffrey to WorkCover Queensland of 1 August 2024 described as a follow up statement. The documents at items 25, 26 and 27 are the three directives pleaded at Stressor 1(e) and Stressor 1(g) above. They were provided by the Appellant to WorkCover Queensland in August 2024, before any decision on his claim and more than two years before this pleading.</w:t>
+        <w:t xml:space="preserve">The Respondent's amended List of Documents of 14 August 2026 records that the Appellant provided to WorkCover Queensland, at item 12, an email of 12 July 2024 with an attachment described as "Event overview - undated"; at item 14, an email of 18 July 2024 with an attachment described as "Witness statement - Carolyn Jeffrey"; at item 25, an email of 29 August 2024 described as regarding the after hours on call change, with an attachment described as "Email: After hours on call process"; at item 26, an email of 30 August 2024 described as regarding failure to consult, with an attachment described as "Email: Task change switchboard - 19/04/2024"; and at item 27, an email of 30 August 2024 described as regarding failure to consult, with an attachment described as "Email: MASPER process - 09/05/2024". It further records, at item 16, an email from Ms Carolyn Jeffrey to WorkCover Queensland of 1 August 2024 described as a follow up statement. [¶¶ 274 to 280] The documents at items 25, 26 and 27 are the three directives pleaded at Stressor 1(e) and Stressor 1(g) above. They were provided by the Appellant to WorkCover Queensland in August 2024, before any decision on his claim and more than two years before this pleading.</w:t>
       </w:r>
     </w:p>
     <w:p>
@@ -3277,22 +3247,7 @@
           <w:sz w:val="20"/>
           <w:szCs w:val="20"/>
         </w:rPr>
-        <w:t xml:space="preserve">The Respondent's amended statement of facts and contentions states at paragraph 11 that it does not admit the allegations in Stressor 1(a) of the Appellant's statement "because there are no particulars or details to respond to". On 11 August 2026 the Appellant served a bundle titled "Stressor 1(a) - Particulars support bundle", comprising 30 pages and six tabs, each stating a particular of that stressor and enclosing the documents recording it.</w:t>
-      </w:r>
-    </w:p>
-    <w:p>
-      <w:pPr>
-        <w:spacing w:before="0" w:after="100" w:line="264" w:lineRule="auto"/>
-        <w:ind w:left="284"/>
-      </w:pPr>
-      <w:r>
-        <w:rPr>
-          <w:rFonts w:ascii="Arial" w:hAnsi="Arial" w:cs="Arial"/>
-          <w:i/>
-          <w:sz w:val="18"/>
-          <w:szCs w:val="18"/>
-        </w:rPr>
-        <w:t xml:space="preserve">Particulars: paragraphs 274 to 282 of the notice to admit facts served 28 August 2026, admitted 8 September 2026.</w:t>
+        <w:t xml:space="preserve">The Respondent's amended statement of facts and contentions states at paragraph 11 that it does not admit the allegations in Stressor 1(a) of the Appellant's statement "because there are no particulars or details to respond to". On 11 August 2026 the Appellant served a bundle titled "Stressor 1(a) - Particulars support bundle", comprising 30 pages and six tabs, each stating a particular of that stressor and enclosing the documents recording it. [¶¶ 281 to 282]</w:t>
       </w:r>
     </w:p>
     <w:p>

</xml_diff>

<commit_message>
WC/2024/227: 9A — PID, union, Band 9, post-injury and call-load passages removed or trimmed; guideline extract halved; costs uplift conditioned on representation
Co-Authored-By: Claude Fable 5.1 <noreply@anthropic.com>
Claude-Session: https://claude.ai/code/session_01PbSZiMB1koFR46V5hQyVcy
</commit_message>
<xml_diff>
--- a/wc2024227/drafts/second-amended-9A/2026-10_SECOND_AMENDED_9A_FINAL.docx
+++ b/wc2024227/drafts/second-amended-9A/2026-10_SECOND_AMENDED_9A_FINAL.docx
@@ -90,7 +90,7 @@
           <w:sz w:val="20"/>
           <w:szCs w:val="20"/>
         </w:rPr>
-        <w:t xml:space="preserve">Each fact set out below that carries a paragraph number in square brackets was admitted by the Respondent, to the extent recorded in its response of 8 September 2026. A statement without a bracket is drawn from a document identified in Part B.7 or is the Appellant's own evidence; the register at Tab 31 and the call statistics in Stressor 3(h) are of that kind, and facts 228 to 231 were not admitted. The Commission is asked to decide from the admitted facts what the circumstances were, whether they were reasonable, and how much they contributed to the injury.</w:t>
+        <w:t xml:space="preserve">Each fact set out below that carries a paragraph number in square brackets was admitted by the Respondent, to the extent recorded in its response of 8 September 2026. A statement without a bracket is drawn from a document identified in Part B.7 or is the Appellant's own evidence; the register at Tab 31 in Stressor 3(h) is of that kind, and facts 228 to 231 were not admitted. The Commission is asked to decide from the admitted facts what the circumstances were, whether they were reasonable, and how much they contributed to the injury.</w:t>
       </w:r>
     </w:p>
     <w:p>
@@ -847,7 +847,7 @@
           <w:sz w:val="20"/>
           <w:szCs w:val="20"/>
         </w:rPr>
-        <w:t xml:space="preserve">The console took about 270 to 440 calls on an eight-hour shift. Emergency codes were received and paged through it throughout the day (Stressor 3(h) below).</w:t>
+        <w:t xml:space="preserve">Emergency codes were received and paged through the console throughout the day (Stressor 3(h) below).</w:t>
       </w:r>
     </w:p>
     <w:p>
@@ -1303,7 +1303,7 @@
           <w:sz w:val="20"/>
           <w:szCs w:val="20"/>
         </w:rPr>
-        <w:t xml:space="preserve">The Respondent has admitted that it does not have a copy of the removed page. [¶ 288] On 18 February 2026 it also admitted that in her email to the Director of 6 June 2023 the Manager stated: "I did raise my voice and asked him to please stop talking over the top of me." [¶ 292] The Respondent's amended List of Documents of 14 August 2026 does not list the Communication Book, nor any page or entry from it; that proposition (paragraph 154 of the notice) was not admitted.</w:t>
+        <w:t xml:space="preserve">The Respondent has admitted that it does not have a copy of the removed page. [¶ 288] The Respondent's amended List of Documents of 14 August 2026 does not list the Communication Book, nor any page or entry from it; that proposition (paragraph 154 of the notice) was not admitted.</w:t>
       </w:r>
     </w:p>
     <w:p>
@@ -1390,7 +1390,7 @@
           <w:sz w:val="20"/>
           <w:szCs w:val="20"/>
         </w:rPr>
-        <w:t xml:space="preserve">On 31 August 2023 he provided a written application headed "Request to Increase Working Hours to Full Time Rotational Roster", expressing willingness to take on additional night shifts. [¶¶ 30 to 31] The same sentence of that application records his advocacy to become a union representative for the Switchboard department. [¶ 32]</w:t>
+        <w:t xml:space="preserve">On 31 August 2023 he provided a written application headed "Request to Increase Working Hours to Full Time Rotational Roster", expressing willingness to take on additional night shifts. [¶¶ 30 to 31]</w:t>
       </w:r>
     </w:p>
     <w:p>
@@ -1530,15 +1530,15 @@
           <w:sz w:val="20"/>
           <w:szCs w:val="20"/>
         </w:rPr>
-        <w:t xml:space="preserve">(m) The authority to decide that application. </w:t>
-      </w:r>
-      <w:r>
-        <w:rPr>
-          <w:rFonts w:ascii="Arial" w:hAnsi="Arial" w:cs="Arial"/>
-          <w:sz w:val="20"/>
-          <w:szCs w:val="20"/>
-        </w:rPr>
-        <w:t xml:space="preserve">The power to approve paid special pandemic leave was sub-delegated by an Instrument of Human Resource Sub-Delegation signed by the Acting Health Service Chief Executive on 23 November 2022 and effective from 5 December 2022. [¶ 127]</w:t>
+        <w:t xml:space="preserve">(m) What the employer states about its own systems and records. </w:t>
+      </w:r>
+      <w:r>
+        <w:rPr>
+          <w:rFonts w:ascii="Arial" w:hAnsi="Arial" w:cs="Arial"/>
+          <w:sz w:val="20"/>
+          <w:szCs w:val="20"/>
+        </w:rPr>
+        <w:t xml:space="preserve">A key responsibility of the position is to follow defined service quality standards and occupational health and safety policies and procedures relating to the work being undertaken, to ensure high quality, safe services and workplaces. [¶ 12]</w:t>
       </w:r>
     </w:p>
     <w:p>
@@ -1551,7 +1551,7 @@
           <w:sz w:val="20"/>
           <w:szCs w:val="20"/>
         </w:rPr>
-        <w:t xml:space="preserve">That Instrument states: "This Instrument does not permit the further sub-delegation of the powers outlined in (a) above." [¶ 128]</w:t>
+        <w:t xml:space="preserve">By letter of 5 June 2026, reference K-LM26/729, signed by the Chief Executive and addressed to the Commission, Metro South Health stated that the requested fatigue risk management documents "do not exist", that mandatory Fatigue Risk Management System training "only applies to health practitioners and clinical assistants" and that Switchboard staff are non-clinical. [¶¶ 263, 265] It stated that "The implementation of fatigue risk management assessment at Switchboard Logan Hospital occurred after 30 June 2024". [¶ 264] It stated that "there have been no 'consequential' changes to operating procedures over the period requested". [¶ 266] It stated that "All employee complaints relating to Logan Hospital Switchboard operational errors are made directly to the Line Manager of Switch Board and managed solely via email or verbally with the complainant." [¶ 267] It stated that "a spreadsheet of recorded MET calls is available for the period 17-18 March 2024". [¶ 268]</w:t>
       </w:r>
     </w:p>
     <w:p>
@@ -1564,7 +1564,7 @@
           <w:sz w:val="20"/>
           <w:szCs w:val="20"/>
         </w:rPr>
-        <w:t xml:space="preserve">In the leave request history the Switchboard Manager is identified as "Reviewer" and the Director as "Manager". [¶ 126]</w:t>
+        <w:t xml:space="preserve">The Respondent does not allege that any fatigue risk assessment was conducted, that any fatigue risk management training was provided, that fatigue risk management assessment was implemented at the Switchboard, or that any change was made to the operating procedures of the Switchboard as a consequence of any employee complaint, at any time before 30 June 2024. [¶¶ 269 to 272]</w:t>
       </w:r>
     </w:p>
     <w:p>
@@ -1574,137 +1574,19 @@
       <w:r>
         <w:rPr>
           <w:rFonts w:ascii="Arial" w:hAnsi="Arial" w:cs="Arial"/>
-          <w:sz w:val="20"/>
-          <w:szCs w:val="20"/>
-        </w:rPr>
-        <w:t xml:space="preserve">The Respondent does not allege that either was a Band 9 delegate at any relevant time in February or March 2024, and does not identify the person who exercised the power sub-delegated by that Instrument in respect of Process Reference 15480560. [¶¶ 129 to 131]</w:t>
-      </w:r>
-    </w:p>
-    <w:p>
-      <w:pPr>
-        <w:spacing w:before="0" w:after="100" w:line="264" w:lineRule="auto"/>
-      </w:pPr>
-      <w:r>
-        <w:rPr>
-          <w:rFonts w:ascii="Arial" w:hAnsi="Arial" w:cs="Arial"/>
           <w:b/>
           <w:sz w:val="20"/>
           <w:szCs w:val="20"/>
         </w:rPr>
-        <w:t xml:space="preserve">(n) Public interest disclosure - chronology only. </w:t>
-      </w:r>
-      <w:r>
-        <w:rPr>
-          <w:rFonts w:ascii="Arial" w:hAnsi="Arial" w:cs="Arial"/>
-          <w:sz w:val="20"/>
-          <w:szCs w:val="20"/>
-        </w:rPr>
-        <w:t xml:space="preserve">On 13 May 2024 the Appellant lodged a corrupt conduct complaint regarding clinical risks. The Ethical Standards Unit formally determined this constituted a Public Interest Disclosure (Admitted Fact: Form 24, para 20, admitted 18 February 2026). The content is not set out.</w:t>
-      </w:r>
-    </w:p>
-    <w:p>
-      <w:pPr>
-        <w:spacing w:before="0" w:after="100" w:line="264" w:lineRule="auto"/>
-      </w:pPr>
-      <w:r>
-        <w:rPr>
-          <w:rFonts w:ascii="Arial" w:hAnsi="Arial" w:cs="Arial"/>
-          <w:b/>
-          <w:sz w:val="20"/>
-          <w:szCs w:val="20"/>
-        </w:rPr>
-        <w:t xml:space="preserve">(o) Workplace representation. </w:t>
-      </w:r>
-      <w:r>
-        <w:rPr>
-          <w:rFonts w:ascii="Arial" w:hAnsi="Arial" w:cs="Arial"/>
-          <w:sz w:val="20"/>
-          <w:szCs w:val="20"/>
-        </w:rPr>
-        <w:t xml:space="preserve">The Respondent has admitted that the Union Encouragement Policy QH-POL-248 requires managers to take a "positive, supportive role" in relation to workplace delegates, and admitted that the Appellant sent a text to the Manager at 5.03 pm that he was "just putting his hand up", saying that this was not a formal notification. [¶¶ 293 to 294]</w:t>
-      </w:r>
-    </w:p>
-    <w:p>
-      <w:pPr>
-        <w:spacing w:before="0" w:after="100" w:line="264" w:lineRule="auto"/>
-      </w:pPr>
-      <w:r>
-        <w:rPr>
-          <w:rFonts w:ascii="Arial" w:hAnsi="Arial" w:cs="Arial"/>
-          <w:sz w:val="20"/>
-          <w:szCs w:val="20"/>
-        </w:rPr>
-        <w:t xml:space="preserve">On 3 November 2025 an Organiser of Together Queensland wrote to the Appellant and two colleagues congratulating them, and the Appellant was endorsed as a workplace delegate on or about that date. [¶¶ 178 to 179]</w:t>
-      </w:r>
-    </w:p>
-    <w:p>
-      <w:pPr>
-        <w:spacing w:before="0" w:after="100" w:line="264" w:lineRule="auto"/>
-      </w:pPr>
-      <w:r>
-        <w:rPr>
-          <w:rFonts w:ascii="Arial" w:hAnsi="Arial" w:cs="Arial"/>
-          <w:b/>
-          <w:sz w:val="20"/>
-          <w:szCs w:val="20"/>
-        </w:rPr>
-        <w:t xml:space="preserve">(p) What the employer states about its own systems and records. </w:t>
-      </w:r>
-      <w:r>
-        <w:rPr>
-          <w:rFonts w:ascii="Arial" w:hAnsi="Arial" w:cs="Arial"/>
-          <w:sz w:val="20"/>
-          <w:szCs w:val="20"/>
-        </w:rPr>
-        <w:t xml:space="preserve">A key responsibility of the position is to follow defined service quality standards and occupational health and safety policies and procedures relating to the work being undertaken, to ensure high quality, safe services and workplaces. [¶ 12]</w:t>
-      </w:r>
-    </w:p>
-    <w:p>
-      <w:pPr>
-        <w:spacing w:before="0" w:after="100" w:line="264" w:lineRule="auto"/>
-      </w:pPr>
-      <w:r>
-        <w:rPr>
-          <w:rFonts w:ascii="Arial" w:hAnsi="Arial" w:cs="Arial"/>
-          <w:sz w:val="20"/>
-          <w:szCs w:val="20"/>
-        </w:rPr>
-        <w:t xml:space="preserve">By letter of 5 June 2026, reference K-LM26/729, signed by the Chief Executive and addressed to the Commission, Metro South Health stated that the requested fatigue risk management documents "do not exist", that mandatory Fatigue Risk Management System training "only applies to health practitioners and clinical assistants" and that Switchboard staff are non-clinical. [¶¶ 263, 265] It stated that "The implementation of fatigue risk management assessment at Switchboard Logan Hospital occurred after 30 June 2024". [¶ 264] It stated that "there have been no 'consequential' changes to operating procedures over the period requested". [¶ 266] It stated that "All employee complaints relating to Logan Hospital Switchboard operational errors are made directly to the Line Manager of Switch Board and managed solely via email or verbally with the complainant." [¶ 267] It stated that "a spreadsheet of recorded MET calls is available for the period 17-18 March 2024". [¶ 268]</w:t>
-      </w:r>
-    </w:p>
-    <w:p>
-      <w:pPr>
-        <w:spacing w:before="0" w:after="100" w:line="264" w:lineRule="auto"/>
-      </w:pPr>
-      <w:r>
-        <w:rPr>
-          <w:rFonts w:ascii="Arial" w:hAnsi="Arial" w:cs="Arial"/>
-          <w:sz w:val="20"/>
-          <w:szCs w:val="20"/>
-        </w:rPr>
-        <w:t xml:space="preserve">The Respondent does not allege that any fatigue risk assessment was conducted, that any fatigue risk management training was provided, that fatigue risk management assessment was implemented at the Switchboard, or that any change was made to the operating procedures of the Switchboard as a consequence of any employee complaint, at any time before 30 June 2024. [¶¶ 269 to 272]</w:t>
-      </w:r>
-    </w:p>
-    <w:p>
-      <w:pPr>
-        <w:spacing w:before="0" w:after="100" w:line="264" w:lineRule="auto"/>
-      </w:pPr>
-      <w:r>
-        <w:rPr>
-          <w:rFonts w:ascii="Arial" w:hAnsi="Arial" w:cs="Arial"/>
-          <w:b/>
-          <w:sz w:val="20"/>
-          <w:szCs w:val="20"/>
-        </w:rPr>
-        <w:t xml:space="preserve">(q) Matters pleaded as context only. </w:t>
-      </w:r>
-      <w:r>
-        <w:rPr>
-          <w:rFonts w:ascii="Arial" w:hAnsi="Arial" w:cs="Arial"/>
-          <w:sz w:val="20"/>
-          <w:szCs w:val="20"/>
-        </w:rPr>
-        <w:t xml:space="preserve">The Respondent does not allege that the Appellant was subject to any disciplinary process, or that his work performance was the subject of any formal performance management process, before 18 June 2024, nor does it describe any communication with him before that date as a warning. [¶¶ 300 to 302] Paragraph 27 of its amended statement of facts and contentions does not identify the management action relied upon. [¶ 303] The matters at (j), (k), (l), (m), (n) and (o) above, and at paragraph 3 below, are pleaded as part of the sequence of matters the Appellant raised and the responses he received. They are not relied on as separate causes within Stressor 1. Where an admitted fact from that sequence is repeated under Stressor 2 or Stressor 3, it is relied on there only for the purpose stated under that stressor. The circumstances relied on as causes in Stressor 1 are those at (a) to (i) and (p).</w:t>
+        <w:t xml:space="preserve">(n) Matters pleaded as context only. </w:t>
+      </w:r>
+      <w:r>
+        <w:rPr>
+          <w:rFonts w:ascii="Arial" w:hAnsi="Arial" w:cs="Arial"/>
+          <w:sz w:val="20"/>
+          <w:szCs w:val="20"/>
+        </w:rPr>
+        <w:t xml:space="preserve">The Respondent does not allege that the Appellant was subject to any disciplinary process, or that his work performance was the subject of any formal performance management process, before 18 June 2024, nor does it describe any communication with him before that date as a warning. [¶¶ 300 to 302] Paragraph 27 of its amended statement of facts and contentions does not identify the management action relied upon. [¶ 303] The matters at (j), (k) and (l) above, and at paragraph 3 below, are pleaded as part of the sequence of matters the Appellant raised and the responses he received. They are not relied on as separate causes within Stressor 1. Where an admitted fact from that sequence is repeated under Stressor 2 or Stressor 3, it is relied on there only for the purpose stated under that stressor. The circumstances relied on as causes in Stressor 1 are those at (a) to (i) and (m).</w:t>
       </w:r>
     </w:p>
     <w:p>
@@ -2085,7 +1967,7 @@
           <w:sz w:val="20"/>
           <w:szCs w:val="20"/>
         </w:rPr>
-        <w:t xml:space="preserve">The power to approve or not approve paid Special Pandemic Leave for the COVID-19 event was sub-delegated by the Acting Health Service Chief Executive to a Band 9 delegate, and the Instrument states that the power could not be further sub-delegated. [¶¶ 127 to 128] On 20 February 2024 the Manager asked the Appellant to send his material to her so she could submit it in myHR [¶ 136]; he did so; she then asked him to submit it through myHR himself [¶ 132], and the leave history records him creating the draft and submitting the request that morning. [¶¶ 114 to 115] The history records the request being declined on 21 February, resubmitted on 28 February, declined again on 29 February, submitted a third time at 11:07:28 that day and approved at 11:21:03. [¶¶ 116 to 120] It records the Appellant as making three submissions, the Manager as declining twice, the Manager as "Reviewer" and the Director as "Manager", with the Director recording final approval on 1 March 2024. [¶¶ 121 to 123, 126] The review decision records that on the first decline the stated reason was the minimum period for COVID leave while the statutory declaration was said to be sufficient; it records the Appellant saying he was confused by the second decline and had done everything required. [¶¶ 137 to 139] The Respondent's pleading states that the later decline was because the statutory declaration was assessed as not attached, but that review showed the attachments were in fact present, and pleads human error against a background of high work demands. [¶¶ 133 to 135] The Respondent does not allege that either recorded approver was a Band 9 delegate at the relevant time and does not identify the person who exercised the sub-delegated power for Process Reference 15480560; nor does it allege that any other Switchboard employee was required personally to submit such a request through myHR in February 2024. [¶¶ 129 to 131, 142] This sequence is repeated on purpose from Stressor 1(l) and (m). In Stressor 2 it is relied on as the handling of a paid employment entitlement: an entitlement that took three submissions and a decision process the Appellant could not complete by himself. It is not relied on as a separate injury.</w:t>
+        <w:t xml:space="preserve">The power to approve or not approve paid Special Pandemic Leave for the COVID-19 event was sub-delegated by the Acting Health Service Chief Executive to a Band 9 delegate, and the Instrument states that the power could not be further sub-delegated. [¶¶ 127 to 128] On 20 February 2024 the Manager asked the Appellant to send his material to her so she could submit it in myHR [¶ 136]; he did so; she then asked him to submit it through myHR himself [¶ 132], and the leave history records him creating the draft and submitting the request that morning. [¶¶ 114 to 115] The history records the request being declined on 21 February, resubmitted on 28 February, declined again on 29 February, submitted a third time at 11:07:28 that day and approved at 11:21:03. [¶¶ 116 to 120] It records the Appellant as making three submissions, the Manager as declining twice, the Manager as "Reviewer" and the Director as "Manager", with the Director recording final approval on 1 March 2024. [¶¶ 121 to 123, 126] The review decision records that on the first decline the stated reason was the minimum period for COVID leave while the statutory declaration was said to be sufficient; it records the Appellant saying he was confused by the second decline and had done everything required. [¶¶ 137 to 139] The Respondent's pleading states that the later decline was because the statutory declaration was assessed as not attached, but that review showed the attachments were in fact present, and pleads human error against a background of high work demands. [¶¶ 133 to 135] The Respondent does not allege that any other Switchboard employee was required personally to submit such a request through myHR in February 2024. [¶ 142] This sequence is repeated on purpose from Stressor 1(l). In Stressor 2 it is relied on as the handling of a paid employment entitlement: an entitlement that took three submissions and a decision process the Appellant could not complete by himself. It is not relied on as a separate injury.</w:t>
       </w:r>
     </w:p>
     <w:p>
@@ -2712,15 +2594,15 @@
           <w:sz w:val="20"/>
           <w:szCs w:val="20"/>
         </w:rPr>
-        <w:t xml:space="preserve">(h)(v) The ordinary call load, and the Monday. </w:t>
-      </w:r>
-      <w:r>
-        <w:rPr>
-          <w:rFonts w:ascii="Arial" w:hAnsi="Arial" w:cs="Arial"/>
-          <w:sz w:val="20"/>
-          <w:szCs w:val="20"/>
-        </w:rPr>
-        <w:t xml:space="preserve">In April 2025, during the Appellant's graduated return, the console took between 269 and 444 calls on a single eight-hour shift, an average of about 360, on the monthly call statistics for that period; the highest figure, 444, was the one Monday afternoon shift in that period, 14 April 2025. The Monday early shift is the peak of the week: the weekend's backlog, the resumption of clinics and elective lists and the Monday admissions arrive at the console together. The shift of 18 March 2024 was the Monday early shift, the first shift of the working week [¶ 227], and it followed a break of seven hours. [¶ 284]</w:t>
+        <w:t xml:space="preserve">(i) The leave of 19 March 2024. </w:t>
+      </w:r>
+      <w:r>
+        <w:rPr>
+          <w:rFonts w:ascii="Arial" w:hAnsi="Arial" w:cs="Arial"/>
+          <w:sz w:val="20"/>
+          <w:szCs w:val="20"/>
+        </w:rPr>
+        <w:t xml:space="preserve">The Leave Takings Report produced by Metro South Health in respect of 19 March 2024 records the Leave Category as "Sick", the Leave Type as "Sick Leave", the Time Code as "SCK", the Leave Taken as 7.60 hours and the Leave Status as approved. [¶ 235]</w:t>
       </w:r>
     </w:p>
     <w:p>
@@ -2730,19 +2612,10 @@
       <w:r>
         <w:rPr>
           <w:rFonts w:ascii="Arial" w:hAnsi="Arial" w:cs="Arial"/>
-          <w:b/>
-          <w:sz w:val="20"/>
-          <w:szCs w:val="20"/>
-        </w:rPr>
-        <w:t xml:space="preserve">(i) The leave of 19 March 2024. </w:t>
-      </w:r>
-      <w:r>
-        <w:rPr>
-          <w:rFonts w:ascii="Arial" w:hAnsi="Arial" w:cs="Arial"/>
-          <w:sz w:val="20"/>
-          <w:szCs w:val="20"/>
-        </w:rPr>
-        <w:t xml:space="preserve">The Leave Takings Report produced by Metro South Health in respect of 19 March 2024 records the Leave Category as "Sick", the Leave Type as "Sick Leave", the Time Code as "SCK", the Leave Taken as 7.60 hours and the Leave Status as approved. [¶ 235]</w:t>
+          <w:sz w:val="20"/>
+          <w:szCs w:val="20"/>
+        </w:rPr>
+        <w:t xml:space="preserve">The Respondent pleads that the Appellant took leave on 19 March 2024 but says this was paid leave, and that pursuant to clause 18.10 of the Award he is not entitled to fatigue leave because he was not performing overtime. [¶¶ 236 to 237] The Respondent's outlines (Part B.6) give notice that its payroll witness will say the Award's fatigue provision "applies to breaks around overtime, not between two ordinary shifts". On that account, no entitlement to recovery time arose from a seven-hour break between two ordinary shifts. The only protection was the roster itself.</w:t>
       </w:r>
     </w:p>
     <w:p>
@@ -2752,10 +2625,19 @@
       <w:r>
         <w:rPr>
           <w:rFonts w:ascii="Arial" w:hAnsi="Arial" w:cs="Arial"/>
-          <w:sz w:val="20"/>
-          <w:szCs w:val="20"/>
-        </w:rPr>
-        <w:t xml:space="preserve">The Respondent pleads that the Appellant took leave on 19 March 2024 but says this was paid leave, and that pursuant to clause 18.10 of the Award he is not entitled to fatigue leave because he was not performing overtime. [¶¶ 236 to 237] The Respondent's outlines (Part B.6) give notice that its payroll witness will say the Award's fatigue provision "applies to breaks around overtime, not between two ordinary shifts". On that account, no entitlement to recovery time arose from a seven-hour break between two ordinary shifts. The only protection was the roster itself.</w:t>
+          <w:b/>
+          <w:sz w:val="20"/>
+          <w:szCs w:val="20"/>
+        </w:rPr>
+        <w:t xml:space="preserve">(j) The enquiry of 8 April 2024, the delay, and the refusal of 1 May 2024. </w:t>
+      </w:r>
+      <w:r>
+        <w:rPr>
+          <w:rFonts w:ascii="Arial" w:hAnsi="Arial" w:cs="Arial"/>
+          <w:sz w:val="20"/>
+          <w:szCs w:val="20"/>
+        </w:rPr>
+        <w:t xml:space="preserve">The review decision records: "You emailed Ms Taylor on 8 April 2024 and requested a review of your payment for the pay period between 8 March 2024 and 31 March 2024", noting the Award requirement as to a minimum ten-hour break. [¶¶ 242 to 243]</w:t>
       </w:r>
     </w:p>
     <w:p>
@@ -2765,19 +2647,10 @@
       <w:r>
         <w:rPr>
           <w:rFonts w:ascii="Arial" w:hAnsi="Arial" w:cs="Arial"/>
-          <w:b/>
-          <w:sz w:val="20"/>
-          <w:szCs w:val="20"/>
-        </w:rPr>
-        <w:t xml:space="preserve">(j) The enquiry of 8 April 2024, the delay, and the refusal of 1 May 2024. </w:t>
-      </w:r>
-      <w:r>
-        <w:rPr>
-          <w:rFonts w:ascii="Arial" w:hAnsi="Arial" w:cs="Arial"/>
-          <w:sz w:val="20"/>
-          <w:szCs w:val="20"/>
-        </w:rPr>
-        <w:t xml:space="preserve">The review decision records: "You emailed Ms Taylor on 8 April 2024 and requested a review of your payment for the pay period between 8 March 2024 and 31 March 2024", noting the Award requirement as to a minimum ten-hour break. [¶¶ 242 to 243]</w:t>
+          <w:sz w:val="20"/>
+          <w:szCs w:val="20"/>
+        </w:rPr>
+        <w:t xml:space="preserve">It records that she replied on 9 April 2024 and "added she also escalated your enquiry regarding fatigue leave to Human Resources to confirm policies around this", and that she "proceeded to acknowledge the importance of communication and requested that you raise your concerns with her as soon as they arise so she could action them sooner for you". [¶¶ 244 to 245]</w:t>
       </w:r>
     </w:p>
     <w:p>
@@ -2790,7 +2663,7 @@
           <w:sz w:val="20"/>
           <w:szCs w:val="20"/>
         </w:rPr>
-        <w:t xml:space="preserve">It records that she replied on 9 April 2024 and "added she also escalated your enquiry regarding fatigue leave to Human Resources to confirm policies around this", and that she "proceeded to acknowledge the importance of communication and requested that you raise your concerns with her as soon as they arise so she could action them sooner for you". [¶¶ 244 to 245]</w:t>
+        <w:t xml:space="preserve">It records that on 24 April 2024 the Appellant emailed expressing dissatisfaction that it had been more than two weeks without any response or overtime payment. [¶ 246]</w:t>
       </w:r>
     </w:p>
     <w:p>
@@ -2803,7 +2676,7 @@
           <w:sz w:val="20"/>
           <w:szCs w:val="20"/>
         </w:rPr>
-        <w:t xml:space="preserve">It records that on 24 April 2024 the Appellant emailed expressing dissatisfaction that it had been more than two weeks without any response or overtime payment. [¶ 246]</w:t>
+        <w:t xml:space="preserve">The Respondent does not allege that any response was made to the fatigue enquiry between 9 April and 1 May 2024; the enquiry of 8 April was answered after 23 days. [¶¶ 249 to 250]</w:t>
       </w:r>
     </w:p>
     <w:p>
@@ -2816,7 +2689,7 @@
           <w:sz w:val="20"/>
           <w:szCs w:val="20"/>
         </w:rPr>
-        <w:t xml:space="preserve">The Respondent does not allege that any response was made to the fatigue enquiry between 9 April and 1 May 2024; the enquiry of 8 April was answered after 23 days. [¶¶ 249 to 250]</w:t>
+        <w:t xml:space="preserve">It records that she responded on 1 May 2024 stating that after a consultation with payroll and Human Resources the request for fatigue payment for 18 March 2024 would not be processed due to the existing 8-hour agreement, and noting that he was able to terminate that agreement going forward. [¶¶ 247 to 248]</w:t>
       </w:r>
     </w:p>
     <w:p>
@@ -2829,7 +2702,7 @@
           <w:sz w:val="20"/>
           <w:szCs w:val="20"/>
         </w:rPr>
-        <w:t xml:space="preserve">It records that she responded on 1 May 2024 stating that after a consultation with payroll and Human Resources the request for fatigue payment for 18 March 2024 would not be processed due to the existing 8-hour agreement, and noting that he was able to terminate that agreement going forward. [¶¶ 247 to 248]</w:t>
+        <w:t xml:space="preserve">It records that payroll was, as at 1 May 2024, still reviewing his entitlements; that the employer did not mention his shift on 18 March 2024; and that there was uncertainty between him and the employer regarding whether the 8-hour agreement continued to apply. [¶¶ 253 to 255]</w:t>
       </w:r>
     </w:p>
     <w:p>
@@ -2842,7 +2715,7 @@
           <w:sz w:val="20"/>
           <w:szCs w:val="20"/>
         </w:rPr>
-        <w:t xml:space="preserve">It records that payroll was, as at 1 May 2024, still reviewing his entitlements; that the employer did not mention his shift on 18 March 2024; and that there was uncertainty between him and the employer regarding whether the 8-hour agreement continued to apply. [¶¶ 253 to 255]</w:t>
+        <w:t xml:space="preserve">So the enquiry of 8 April 2024 was answered on 1 May 2024, 23 days later, with a refusal. In between were the acknowledgment of 9 April, the escalation to Human Resources, and the Appellant's email of 24 April; no other response is alleged. [¶¶ 242 to 250]</w:t>
       </w:r>
     </w:p>
     <w:p>
@@ -2852,10 +2725,19 @@
       <w:r>
         <w:rPr>
           <w:rFonts w:ascii="Arial" w:hAnsi="Arial" w:cs="Arial"/>
-          <w:sz w:val="20"/>
-          <w:szCs w:val="20"/>
-        </w:rPr>
-        <w:t xml:space="preserve">So the enquiry of 8 April 2024 was answered on 1 May 2024, 23 days later, with a refusal. In between were the acknowledgment of 9 April, the escalation to Human Resources, and the Appellant's email of 24 April; no other response is alleged. [¶¶ 242 to 250]</w:t>
+          <w:b/>
+          <w:sz w:val="20"/>
+          <w:szCs w:val="20"/>
+        </w:rPr>
+        <w:t xml:space="preserve">(k) The employer's own fatigue policy. </w:t>
+      </w:r>
+      <w:r>
+        <w:rPr>
+          <w:rFonts w:ascii="Arial" w:hAnsi="Arial" w:cs="Arial"/>
+          <w:sz w:val="20"/>
+          <w:szCs w:val="20"/>
+        </w:rPr>
+        <w:t xml:space="preserve">The review decision records that the policy regarding fatigue leave following weekends and rostered days off is dated June 2020. [¶ 239]</w:t>
       </w:r>
     </w:p>
     <w:p>
@@ -2865,19 +2747,10 @@
       <w:r>
         <w:rPr>
           <w:rFonts w:ascii="Arial" w:hAnsi="Arial" w:cs="Arial"/>
-          <w:b/>
-          <w:sz w:val="20"/>
-          <w:szCs w:val="20"/>
-        </w:rPr>
-        <w:t xml:space="preserve">(k) The employer's own fatigue policy. </w:t>
-      </w:r>
-      <w:r>
-        <w:rPr>
-          <w:rFonts w:ascii="Arial" w:hAnsi="Arial" w:cs="Arial"/>
-          <w:sz w:val="20"/>
-          <w:szCs w:val="20"/>
-        </w:rPr>
-        <w:t xml:space="preserve">The review decision records that the policy regarding fatigue leave following weekends and rostered days off is dated June 2020. [¶ 239]</w:t>
+          <w:sz w:val="20"/>
+          <w:szCs w:val="20"/>
+        </w:rPr>
+        <w:t xml:space="preserve">It records that "The policy notes that many problems can be overcome regarding fatigue leave by either not rostering the employee who is on call for the first shift of the following day and not rostering on call an officer who is rostered for the first shift on the following day." [¶ 240]</w:t>
       </w:r>
     </w:p>
     <w:p>
@@ -2887,10 +2760,19 @@
       <w:r>
         <w:rPr>
           <w:rFonts w:ascii="Arial" w:hAnsi="Arial" w:cs="Arial"/>
-          <w:sz w:val="20"/>
-          <w:szCs w:val="20"/>
-        </w:rPr>
-        <w:t xml:space="preserve">It records that "The policy notes that many problems can be overcome regarding fatigue leave by either not rostering the employee who is on call for the first shift of the following day and not rostering on call an officer who is rostered for the first shift on the following day." [¶ 240]</w:t>
+          <w:b/>
+          <w:sz w:val="20"/>
+          <w:szCs w:val="20"/>
+        </w:rPr>
+        <w:t xml:space="preserve">(l) The absence of fatigue risk management at the Switchboard. </w:t>
+      </w:r>
+      <w:r>
+        <w:rPr>
+          <w:rFonts w:ascii="Arial" w:hAnsi="Arial" w:cs="Arial"/>
+          <w:sz w:val="20"/>
+          <w:szCs w:val="20"/>
+        </w:rPr>
+        <w:t xml:space="preserve">By letter of 5 June 2026, reference K-LM26/729, signed by the Chief Executive and addressed to the Commission, Metro South Health stated that the requested fatigue risk management documents "do not exist", that mandatory Fatigue Risk Management System training "only applies to health practitioners and clinical assistants" and that Switchboard staff are non-clinical. [¶¶ 263, 265] It stated that "The implementation of fatigue risk management assessment at Switchboard Logan Hospital occurred after 30 June 2024". [¶ 264] It stated that "there have been no 'consequential' changes to operating procedures over the period requested". [¶ 266] The Respondent does not allege that any fatigue risk assessment was conducted, that fatigue risk management training was provided, that fatigue risk management assessment was implemented at the Switchboard, or that any change was made to the operating procedures of the Switchboard as a consequence of any employee complaint, at any time before 30 June 2024. [¶¶ 269 to 272]</w:t>
       </w:r>
     </w:p>
     <w:p>
@@ -2904,15 +2786,15 @@
           <w:sz w:val="20"/>
           <w:szCs w:val="20"/>
         </w:rPr>
-        <w:t xml:space="preserve">(l) The absence of fatigue risk management at the Switchboard. </w:t>
-      </w:r>
-      <w:r>
-        <w:rPr>
-          <w:rFonts w:ascii="Arial" w:hAnsi="Arial" w:cs="Arial"/>
-          <w:sz w:val="20"/>
-          <w:szCs w:val="20"/>
-        </w:rPr>
-        <w:t xml:space="preserve">By letter of 5 June 2026, reference K-LM26/729, signed by the Chief Executive and addressed to the Commission, Metro South Health stated that the requested fatigue risk management documents "do not exist", that mandatory Fatigue Risk Management System training "only applies to health practitioners and clinical assistants" and that Switchboard staff are non-clinical. [¶¶ 263, 265] It stated that "The implementation of fatigue risk management assessment at Switchboard Logan Hospital occurred after 30 June 2024". [¶ 264] It stated that "there have been no 'consequential' changes to operating procedures over the period requested". [¶ 266] The Respondent does not allege that any fatigue risk assessment was conducted, that fatigue risk management training was provided, that fatigue risk management assessment was implemented at the Switchboard, or that any change was made to the operating procedures of the Switchboard as a consequence of any employee complaint, at any time before 30 June 2024. [¶¶ 269 to 272]</w:t>
+        <w:t xml:space="preserve">(l)(i) The employer's own fatigue guideline. </w:t>
+      </w:r>
+      <w:r>
+        <w:rPr>
+          <w:rFonts w:ascii="Arial" w:hAnsi="Arial" w:cs="Arial"/>
+          <w:sz w:val="20"/>
+          <w:szCs w:val="20"/>
+        </w:rPr>
+        <w:t xml:space="preserve">On 20 May 2024 the Director sent Human Resources the Queensland Health Fatigue Risk Management Systems Implementation Guideline, qh-gdl-401-3.3. [¶¶ 222 to 223] Ten days earlier she had written that she and the Manager had run through the Roster Risk Assessment Matrix and "we say at best there would be a rating of 11 which is moderate". [¶ 219] The Respondent disclosed the guideline, with that email chain, on 14 July 2025 (Tab 8A). The following passages are from that disclosed copy.</w:t>
       </w:r>
     </w:p>
     <w:p>
@@ -2922,19 +2804,10 @@
       <w:r>
         <w:rPr>
           <w:rFonts w:ascii="Arial" w:hAnsi="Arial" w:cs="Arial"/>
-          <w:b/>
-          <w:sz w:val="20"/>
-          <w:szCs w:val="20"/>
-        </w:rPr>
-        <w:t xml:space="preserve">(l)(i) The employer's own fatigue guideline. </w:t>
-      </w:r>
-      <w:r>
-        <w:rPr>
-          <w:rFonts w:ascii="Arial" w:hAnsi="Arial" w:cs="Arial"/>
-          <w:sz w:val="20"/>
-          <w:szCs w:val="20"/>
-        </w:rPr>
-        <w:t xml:space="preserve">On 20 May 2024 the Director sent Human Resources the Queensland Health Fatigue Risk Management Systems Implementation Guideline, qh-gdl-401-3.3. [¶¶ 222 to 223] Ten days earlier she had written that she and the Manager had run through the Roster Risk Assessment Matrix and "we say at best there would be a rating of 11 which is moderate". [¶ 219] The Respondent disclosed the guideline, with that email chain, on 14 July 2025 (Tab 8A). The following passages are from that disclosed copy.</w:t>
+          <w:sz w:val="20"/>
+          <w:szCs w:val="20"/>
+        </w:rPr>
+        <w:t xml:space="preserve">The guideline defines fatigue as "A state of impaired physical and/or mental performance and lowered alertness arising as a result or combination of physical and mental work, health and psychosocial factors or inadequate restorative sleep", and a fatigue risk management system as "An integrated set of management practices and procedures for monitoring and managing the risks posed to health, safety and wellbeing by fatigue". It defines "Defences in depth" as a "Hazard identification and risk control model that applies a series of layered mechanisms to minimise the occurrence of fatigue related incidents". [Guideline, glossary, p 29]</w:t>
       </w:r>
     </w:p>
     <w:p>
@@ -2947,7 +2820,7 @@
           <w:sz w:val="20"/>
           <w:szCs w:val="20"/>
         </w:rPr>
-        <w:t xml:space="preserve">The guideline defines fatigue as "A state of impaired physical and/or mental performance and lowered alertness arising as a result or combination of physical and mental work, health and psychosocial factors or inadequate restorative sleep", and a fatigue risk management system as "An integrated set of management practices and procedures for monitoring and managing the risks posed to health, safety and wellbeing by fatigue". It defines "Defences in depth" as a "Hazard identification and risk control model that applies a series of layered mechanisms to minimise the occurrence of fatigue related incidents". [Guideline, glossary, p 29]</w:t>
+        <w:t xml:space="preserve">It provides that "Level 4 controls relate to error tolerance and containment" and that "Error tolerance relates to built-in redundancies that decrease the likelihood that a fatigued individual will make an error which may have catastrophic consequences." [p 21] It lists among its related documents the Hospital and Health Services General Employees (Queensland Health) Award - State 2015 and the "I1 (QH-POL-171) Fatigue risk management policy". [p 27, section 9]</w:t>
       </w:r>
     </w:p>
     <w:p>
@@ -2960,7 +2833,7 @@
           <w:sz w:val="20"/>
           <w:szCs w:val="20"/>
         </w:rPr>
-        <w:t xml:space="preserve">It provides that "Level 4 controls relate to error tolerance and containment" and that "Error tolerance relates to built-in redundancies that decrease the likelihood that a fatigued individual will make an error which may have catastrophic consequences." [p 21] It provides that "workers should be encouraged to report fatigue via the organisation's incident management system or other relevant hazard or incident reporting channels", and that reporting fatigue may constitute "a situation where a worker has identified that they are suffering from fatigue due to work-related factors". [p 22] It provides that determining whether fatigue contributed to an incident "is reliant on evidence such as rostering information, actual hours worked, fatigue leave, fatigue self-assessment scores and reporting of fatigue hazards". [p 23] It lists among performance indicators "fatigue risk management training compliance levels" and "payroll data (fatigue leave and overtime accessed)". [p 24, section 6.1] It lists among its related documents the Hospital and Health Services General Employees (Queensland Health) Award - State 2015 and the "I1 (QH-POL-171) Fatigue risk management policy". [p 27, section 9]</w:t>
+        <w:t xml:space="preserve">On consultation and training, the guideline states: "there is a legislative obligation to consult with workers in relation to hazard identification and the making of decisions about how associated risks can be managed. Consultation requirements for Queensland Health are described in Health, safety and wellbeing consultation standard (QH-IMP-401-2:2020)." It states that information, training and instruction "must have regard for: the nature of the work carried out; the nature of the risks associated with the work; the control measures implemented", and that "where a work unit or an occupational stream has been identified at risk of fatigue, the training provided must consider the above criteria". Its example training matrix (Figure 11) lists, as those to be trained, "Staff at risk of fatigue", "Rostering staff" and "Manager, supervisors, executives", with learning outcomes including "Rostering". [p 26, section 7.1]</w:t>
       </w:r>
     </w:p>
     <w:p>
@@ -2973,20 +2846,7 @@
           <w:sz w:val="20"/>
           <w:szCs w:val="20"/>
         </w:rPr>
-        <w:t xml:space="preserve">On consultation and training, the guideline states: "there is a legislative obligation to consult with workers in relation to hazard identification and the making of decisions about how associated risks can be managed. Consultation requirements for Queensland Health are described in Health, safety and wellbeing consultation standard (QH-IMP-401-2:2020)." It states that information, training and instruction "must have regard for: the nature of the work carried out; the nature of the risks associated with the work; the control measures implemented", and that "where a work unit or an occupational stream has been identified at risk of fatigue, the training provided must consider the above criteria". Its example training matrix (Figure 11) lists, as those to be trained, "Staff at risk of fatigue", "Rostering staff" and "Manager, supervisors, executives", with learning outcomes including "Rostering". [p 26, section 7.1] It states that successful implementation "relies strongly on effective communication", including "the training of relevant stakeholders so there is an understanding of the actions required of individuals to ensure the FRMS performs as intended". [p 25, section 7] It states that monitoring and assurance "can highlight situations where control measures may require modification" and provide "an opportunity to identify emerging issues and introduce new procedures and controls to mitigate risk". [p 25, section 6.2]</w:t>
-      </w:r>
-    </w:p>
-    <w:p>
-      <w:pPr>
-        <w:spacing w:before="0" w:after="100" w:line="264" w:lineRule="auto"/>
-      </w:pPr>
-      <w:r>
-        <w:rPr>
-          <w:rFonts w:ascii="Arial" w:hAnsi="Arial" w:cs="Arial"/>
-          <w:sz w:val="20"/>
-          <w:szCs w:val="20"/>
-        </w:rPr>
-        <w:t xml:space="preserve">Its supporting documents include the "Fatigue risk assessment tool", the "Individual fatigue likelihood calculator", the "Samn-Perelli fatigue checklist", "Preventing and managing fatigue-related risk in the workplace (Workplace Health and Safety Queensland)", the Health, safety and wellbeing consultation standard (QH-IMP-401-2:2020), the Health, safety and wellbeing risk management standard (QH-IMP-401-3:2020) and the Health, safety and wellbeing policy (QH-POL-401:2020). [pp 27 to 28, section 9] Its legislation list includes the Work Health and Safety Act 2011, the Work Health and Safety Regulation 2011, and the "Managing the risk of work-related psychosocial hazards Code of Practice". [p 27, section 8] It defines a "Worker" by reference to section 7 of the WHS Act, including "An employee", and states that "The Department of Health and each of the HHSs are considered to be PCBUs". [pp 29 to 30, section 10] Its version control records that version 1.0 of 10 November 2021 replaced the "Fatigue Risk Management System Resource Pack December 2018 v. 3". [p 30, section 11] Its references include "Queensland Ombudsman (2006). The Neville Report" and Ziebertz and others (2015) on "The Relationship of on-call work with fatigue, work-home interference, and perceived performance difficulties". [pp 30 to 31, section 12] Each page of the disclosed copy carries the footer "Managing the risk of psychosocial hazards at work Code of Practice 2022 applies 1 April 2023".</w:t>
+        <w:t xml:space="preserve">Its supporting documents include the "Fatigue risk assessment tool", the "Individual fatigue likelihood calculator" and the "Samn-Perelli fatigue checklist". [pp 27 to 28, section 9] It defines a "Worker" by reference to section 7 of the WHS Act, including "An employee", and states that "The Department of Health and each of the HHSs are considered to be PCBUs". [pp 29 to 30, section 10] Its version control records that version 1.0 of 10 November 2021 replaced the "Fatigue Risk Management System Resource Pack December 2018 v. 3". [p 30, section 11] Its references include "Queensland Ombudsman (2006). The Neville Report". [p 31, section 12]</w:t>
       </w:r>
     </w:p>
     <w:p>
@@ -3203,7 +3063,7 @@
           <w:sz w:val="20"/>
           <w:szCs w:val="20"/>
         </w:rPr>
-        <w:t xml:space="preserve">The work capacity certificates certify no functional capacity from 1 July to 6 October 2024. During certified leave, Ms Reese contacted the Appellant and meetings were scheduled. His employment was later ended under abandonment provisions with an effective separation date of 20 September 2024, and he was later reinstated. These matters are notified in his outline of evidence. The effective separation date therefore falls within the certified no-capacity period. The later October communication or processing of the abandonment outcome is not pleaded as having occurred while the final certificate was still current. These matters are not part of the admitted facts and are not relied on as causes of the injury, which had arisen by June 2024. They are kept only as context after the injury, as history of continuing effect and capacity, and as matters notified for oral evidence. Any later WorkCover, income-protection, return-to-work or employment dispute is treated in the same way unless it is separately admitted and relied on for another stated purpose.</w:t>
+        <w:t xml:space="preserve">The work capacity certificates certify no functional capacity from 1 July to 6 October 2024. Matters after the date of injury are not relied on as causes of it and are not pleaded.</w:t>
       </w:r>
     </w:p>
     <w:p>
@@ -5040,72 +4900,6 @@
                 <w:sz w:val="17"/>
                 <w:szCs w:val="17"/>
               </w:rPr>
-              <w:t xml:space="preserve">The request for office hours, 15 May 2024 at 1:15 pm, to the request to retract it, 6:23 pm</w:t>
-            </w:r>
-          </w:p>
-        </w:tc>
-        <w:tc>
-          <w:tcPr/>
-          <w:p>
-            <w:pPr>
-              <w:spacing w:after="0"/>
-            </w:pPr>
-            <w:r>
-              <w:rPr>
-                <w:rFonts w:ascii="Arial" w:hAnsi="Arial" w:cs="Arial"/>
-                <w:sz w:val="17"/>
-                <w:szCs w:val="17"/>
-              </w:rPr>
-              <w:t xml:space="preserve">5 hours, 8 minutes</w:t>
-            </w:r>
-          </w:p>
-        </w:tc>
-        <w:tc>
-          <w:tcPr/>
-          <w:p>
-            <w:pPr>
-              <w:spacing w:after="0"/>
-            </w:pPr>
-            <w:r>
-              <w:rPr>
-                <w:rFonts w:ascii="Arial" w:hAnsi="Arial" w:cs="Arial"/>
-                <w:sz w:val="17"/>
-                <w:szCs w:val="17"/>
-              </w:rPr>
-              <w:t xml:space="preserve">Stressor 1(i)</w:t>
-            </w:r>
-          </w:p>
-        </w:tc>
-        <w:tc>
-          <w:tcPr/>
-          <w:p>
-            <w:pPr>
-              <w:spacing w:after="0"/>
-            </w:pPr>
-            <w:r>
-              <w:rPr>
-                <w:rFonts w:ascii="Arial" w:hAnsi="Arial" w:cs="Arial"/>
-                <w:sz w:val="17"/>
-                <w:szCs w:val="17"/>
-              </w:rPr>
-              <w:t xml:space="preserve">¶¶ 74, 76</w:t>
-            </w:r>
-          </w:p>
-        </w:tc>
-      </w:tr>
-      <w:tr>
-        <w:tc>
-          <w:tcPr/>
-          <w:p>
-            <w:pPr>
-              <w:spacing w:after="0"/>
-            </w:pPr>
-            <w:r>
-              <w:rPr>
-                <w:rFonts w:ascii="Arial" w:hAnsi="Arial" w:cs="Arial"/>
-                <w:sz w:val="17"/>
-                <w:szCs w:val="17"/>
-              </w:rPr>
               <w:t xml:space="preserve">That request to the hours being stated to the department, 17 May 2024 at 9:30 am</w:t>
             </w:r>
           </w:p>
@@ -5243,7 +5037,7 @@
           <w:sz w:val="18"/>
           <w:szCs w:val="18"/>
         </w:rPr>
-        <w:t xml:space="preserve">Particulars: paragraphs 55, 62 to 64, 73 to 74, 76, 79, 81, 92, 97 to 98, 102 to 103, 124 to 125, 185 to 197, 203, 209, 225, 234, 242 to 247, 249 to 251, 260, 284 to 285 of the notice to admit facts served 28 August 2026, admitted 8 September 2026; the Respondent's payroll disclosure of July 2025 (Part B.7.5).</w:t>
+        <w:t xml:space="preserve">Particulars: paragraphs 55, 62 to 64, 73 to 74, 79, 81, 92, 97 to 98, 102 to 103, 124 to 125, 185 to 197, 203, 209, 225, 234, 242 to 247, 249 to 251, 260, 284 to 285 of the notice to admit facts served 28 August 2026, admitted 8 September 2026; the Respondent's payroll disclosure of July 2025 (Part B.7.5).</w:t>
       </w:r>
     </w:p>
     <w:p>
@@ -5381,7 +5175,7 @@
           <w:sz w:val="20"/>
           <w:szCs w:val="20"/>
         </w:rPr>
-        <w:t xml:space="preserve">That either person recorded in the leave history was a Band 9 delegate at any relevant time; the identity of the person who exercised the sub-delegated power in respect of Process Reference 15480560; or that any other Switchboard employee was required to submit such a request personally through myHR in February 2024.</w:t>
+        <w:t xml:space="preserve">That any other Switchboard employee was required to submit such a request personally through myHR in February 2024.</w:t>
       </w:r>
     </w:p>
     <w:p>
@@ -5440,7 +5234,7 @@
           <w:sz w:val="18"/>
           <w:szCs w:val="18"/>
         </w:rPr>
-        <w:t xml:space="preserve">Particulars: paragraphs 16, 21 to 22, 25, 55, 69, 73, 90, 93, 99, 105 to 110, 129 to 131, 142, 150 to 153, 166, 180 to 181, 213, 216, 234, 250, 269 to 273, 300 to 303 of the notice to admit facts served 28 August 2026, admitted 8 September 2026. Paragraph 154 of that notice is not admitted.</w:t>
+        <w:t xml:space="preserve">Particulars: paragraphs 16, 21 to 22, 25, 55, 69, 73, 90, 93, 99, 105 to 110, 142, 150 to 153, 166, 180 to 181, 213, 216, 234, 250, 269 to 273, 300 to 303 of the notice to admit facts served 28 August 2026, admitted 8 September 2026. Paragraph 154 of that notice is not admitted.</w:t>
       </w:r>
     </w:p>
     <w:p>
@@ -5650,7 +5444,7 @@
           <w:sz w:val="20"/>
           <w:szCs w:val="20"/>
         </w:rPr>
-        <w:t xml:space="preserve">Tab 6, Ms Taylor to Logan Switch and the Switchboard staff, "Afterhours Oncall Process - Switchboard", 15 April 2024, 12:39 pm (Stressor 1(e)). Tab 20, the letter of Metro South Hospital and Health Service to Commissioner Dwyer, reference K-LM26/729, 5 June 2026 (Stressors 1(p) and 3(l)). Tab 30, Ms Taylor to Logan Switch and the Switchboard staff, "What's Chloe's Hours?!", 23 August 2023, 2:18 pm (Stressor 1(i)). Tab 30A, Ms Taylor to Logan Switch, "Good morning Team.", 18 June 2024, 8:58 am (Stressor 1(i)). Each was confirmed from the Respondent's own appeal file.</w:t>
+        <w:t xml:space="preserve">Tab 6, Ms Taylor to Logan Switch and the Switchboard staff, "Afterhours Oncall Process - Switchboard", 15 April 2024, 12:39 pm (Stressor 1(e)). Tab 20, the letter of Metro South Hospital and Health Service to Commissioner Dwyer, reference K-LM26/729, 5 June 2026 (Stressors 1(m) and 3(l)). Tab 30, Ms Taylor to Logan Switch and the Switchboard staff, "What's Chloe's Hours?!", 23 August 2023, 2:18 pm (Stressor 1(i)). Tab 30A, Ms Taylor to Logan Switch, "Good morning Team.", 18 June 2024, 8:58 am (Stressor 1(i)). Each was confirmed from the Respondent's own appeal file.</w:t>
       </w:r>
     </w:p>
     <w:p>
@@ -6354,7 +6148,7 @@
           <w:sz w:val="20"/>
           <w:szCs w:val="20"/>
         </w:rPr>
-        <w:t xml:space="preserve">The Appellant will contend that the amounts under section 191(2)(a) are inadequate and will seek an award of up to 1.5 times those amounts under section 191(3), in total or for any item, having regard to: (a) the work involved: a record of 303 facts of which 298 are admitted, the documents at Annexure A to the notice to admit, non-party disclosure obtained under rule 64G, two notices to admit facts and a notice to admit documents, and the outlines of four witnesses served by the Respondent; and (b) the importance, difficulty and complexity of the matter: an appeal about a psychological injury under section 32(5)(a), which requires each pleaded circumstance to be classified, a finding on the reasonableness of each that is management action, and the weighing of the whole.</w:t>
+        <w:t xml:space="preserve">The Appellant will contend that the amounts under section 191(2)(a) are inadequate and will seek, for any period in which the Appellant is legally represented, an award of up to 1.5 times those amounts under section 191(3), in total or for any item, having regard to: (a) the work involved: a record of 303 facts of which 298 are admitted, the documents at Annexure A to the notice to admit, non-party disclosure obtained under rule 64G, two notices to admit facts and a notice to admit documents, and the outlines of four witnesses served by the Respondent; and (b) the importance, difficulty and complexity of the matter: an appeal about a psychological injury under section 32(5)(a), which requires each pleaded circumstance to be classified, a finding on the reasonableness of each that is management action, and the weighing of the whole.</w:t>
       </w:r>
     </w:p>
     <w:p>

</xml_diff>

<commit_message>
WC/2024/227: 9A — 1(n) restored as chronology of the 13 May 2024 complaint and the days that followed, from the Respondent's own disclosure
Co-Authored-By: Claude Fable 5.1 <noreply@anthropic.com>
Claude-Session: https://claude.ai/code/session_01PbSZiMB1koFR46V5hQyVcy
</commit_message>
<xml_diff>
--- a/wc2024227/drafts/second-amended-9A/2026-10_SECOND_AMENDED_9A_FINAL.docx
+++ b/wc2024227/drafts/second-amended-9A/2026-10_SECOND_AMENDED_9A_FINAL.docx
@@ -1578,15 +1578,37 @@
           <w:sz w:val="20"/>
           <w:szCs w:val="20"/>
         </w:rPr>
-        <w:t xml:space="preserve">(n) Matters pleaded as context only. </w:t>
-      </w:r>
-      <w:r>
-        <w:rPr>
-          <w:rFonts w:ascii="Arial" w:hAnsi="Arial" w:cs="Arial"/>
-          <w:sz w:val="20"/>
-          <w:szCs w:val="20"/>
-        </w:rPr>
-        <w:t xml:space="preserve">The Respondent does not allege that the Appellant was subject to any disciplinary process, or that his work performance was the subject of any formal performance management process, before 18 June 2024, nor does it describe any communication with him before that date as a warning. [¶¶ 300 to 302] Paragraph 27 of its amended statement of facts and contentions does not identify the management action relied upon. [¶ 303] The matters at (j), (k) and (l) above, and at paragraph 3 below, are pleaded as part of the sequence of matters the Appellant raised and the responses he received. They are not relied on as separate causes within Stressor 1. Where an admitted fact from that sequence is repeated under Stressor 2 or Stressor 3, it is relied on there only for the purpose stated under that stressor. The circumstances relied on as causes in Stressor 1 are those at (a) to (i) and (m).</w:t>
+        <w:t xml:space="preserve">(n) The complaint of 13 May 2024, and the days that followed - chronology only. </w:t>
+      </w:r>
+      <w:r>
+        <w:rPr>
+          <w:rFonts w:ascii="Arial" w:hAnsi="Arial" w:cs="Arial"/>
+          <w:sz w:val="20"/>
+          <w:szCs w:val="20"/>
+        </w:rPr>
+        <w:t xml:space="preserve">On 13 May 2024 the Appellant lodged a corrupt conduct complaint regarding clinical risks. The Ethical Standards Unit formally determined this constituted a Public Interest Disclosure (Admitted Fact: Form 24, para 20, admitted 18 February 2026). The content is not set out. The Respondent's disclosure of 11 June 2025 (Part B.7.5) contains, in this order: the complaint form, dated 13 May 2024 (pp 9 to 10); the Appellant's email of 15 May 2024 at 3:35 pm to the Ethical Standards Unit, the complaints mailbox and LBH_HR (p 8); a forward of that email by LBH_HR at 3:41 pm the same day to three Human Resources officers (p 7); and an email of 16 May 2024 at 11:43 am from one of those officers to the Director and Ms Smith, copied to three others, attaching the complaint form (p 7). The same bundle contains the Appellant's email of 15 May 2024 at 1:15 pm (p 6) and the Director's reply at 6:23 pm asking him to retract it (p 5), pleaded at (i) above. [¶¶ 74 to 77] The Respondent's outline of Ms Taylor's evidence states that, acting on HR's advice, she removed the email of 15 May 2024 from the shared Switchboard inbox (Part B.6.1). On 21 May 2024 at 2:53 pm the Director asked which changes or directives had concerned him. [¶¶ 79 to 80]</w:t>
+      </w:r>
+    </w:p>
+    <w:p>
+      <w:pPr>
+        <w:spacing w:before="0" w:after="100" w:line="264" w:lineRule="auto"/>
+      </w:pPr>
+      <w:r>
+        <w:rPr>
+          <w:rFonts w:ascii="Arial" w:hAnsi="Arial" w:cs="Arial"/>
+          <w:b/>
+          <w:sz w:val="20"/>
+          <w:szCs w:val="20"/>
+        </w:rPr>
+        <w:t xml:space="preserve">(o) Matters pleaded as context only. </w:t>
+      </w:r>
+      <w:r>
+        <w:rPr>
+          <w:rFonts w:ascii="Arial" w:hAnsi="Arial" w:cs="Arial"/>
+          <w:sz w:val="20"/>
+          <w:szCs w:val="20"/>
+        </w:rPr>
+        <w:t xml:space="preserve">The Respondent does not allege that the Appellant was subject to any disciplinary process, or that his work performance was the subject of any formal performance management process, before 18 June 2024, nor does it describe any communication with him before that date as a warning. [¶¶ 300 to 302] Paragraph 27 of its amended statement of facts and contentions does not identify the management action relied upon. [¶ 303] The matters at (j), (k), (l) and (n) above, and at paragraph 3 below, are pleaded as part of the sequence of matters the Appellant raised and the responses he received. They are not relied on as separate causes within Stressor 1. Where an admitted fact from that sequence is repeated under Stressor 2 or Stressor 3, it is relied on there only for the purpose stated under that stressor. The circumstances relied on as causes in Stressor 1 are those at (a) to (i) and (m).</w:t>
       </w:r>
     </w:p>
     <w:p>
@@ -5510,7 +5532,7 @@
           <w:sz w:val="20"/>
           <w:szCs w:val="20"/>
         </w:rPr>
-        <w:t xml:space="preserve">The spreadsheet of recorded MET calls for 17 and 18 March 2024, which Metro South Health states is available [¶ 268]. The Logan Hospital emergency code procedures referred to in the role description [¶ 8]. The documents recording the advice of Human Resources on the 8-hour agreement, to which the Respondent's outlines of Ms Taylor and Ms Reese refer (Part B.6) and which neither identifies. The Communication Book, which the Respondent's List of Documents does not list; paragraph 154 of the notice was not admitted. The Respondent's disclosure of July 2025 headed "Disclosure from witness conferencing - Qld Health Payroll" (24 pages): the email of Ms Christensen, Manager Service Delivery, Payroll, to the Respondent of 11 July 2025, and Payslips 01 to 07, including Payslip 06 (pay date 5 June 2024) and Payslip 07 (pay date 2 July 2025), relied upon at Stressor 2(e)(i).</w:t>
+        <w:t xml:space="preserve">The spreadsheet of recorded MET calls for 17 and 18 March 2024, which Metro South Health states is available [¶ 268]. The Logan Hospital emergency code procedures referred to in the role description [¶ 8]. The documents recording the advice of Human Resources on the 8-hour agreement, to which the Respondent's outlines of Ms Taylor and Ms Reese refer (Part B.6) and which neither identifies. The Communication Book, which the Respondent's List of Documents does not list; paragraph 154 of the notice was not admitted. The Respondent's disclosure of July 2025 headed "Disclosure from witness conferencing - Qld Health Payroll" (24 pages): the email of Ms Christensen, Manager Service Delivery, Payroll, to the Respondent of 11 July 2025, and Payslips 01 to 07, including Payslip 06 (pay date 5 June 2024) and Payslip 07 (pay date 2 July 2025), relied upon at Stressor 2(e)(i). The Respondent's disclosure of 11 June 2025 (10 pages): the leave-form walkthrough for Process Reference 15480560, the emails of 15 May 2024 at 1:15 pm and 6:23 pm, the emails of 15 and 16 May 2024 concerning the complaint of 13 May 2024, and the complaint form; relied on at Stressor 1(n) for dates, senders and recipients only.</w:t>
       </w:r>
     </w:p>
     <w:p>

</xml_diff>

<commit_message>
WC/2024/227: 9A Stressor 3 — travel and sleep account, QH code protocol, call load and the Neville origin of the fatigue framework; sources filed
Co-Authored-By: Claude Fable 5.1 <noreply@anthropic.com>
Claude-Session: https://claude.ai/code/session_01PbSZiMB1koFR46V5hQyVcy
</commit_message>
<xml_diff>
--- a/wc2024227/drafts/second-amended-9A/2026-10_SECOND_AMENDED_9A_FINAL.docx
+++ b/wc2024227/drafts/second-amended-9A/2026-10_SECOND_AMENDED_9A_FINAL.docx
@@ -90,7 +90,7 @@
           <w:sz w:val="20"/>
           <w:szCs w:val="20"/>
         </w:rPr>
-        <w:t xml:space="preserve">Each fact set out below that carries a paragraph number in square brackets was admitted by the Respondent, to the extent recorded in its response of 8 September 2026. A statement without a bracket is drawn from a document identified in Part B.7 or is the Appellant's own evidence; the register at Tab 31 in Stressor 3(h) is of that kind, and facts 228 to 231 were not admitted. The Commission is asked to decide from the admitted facts what the circumstances were, whether they were reasonable, and how much they contributed to the injury.</w:t>
+        <w:t xml:space="preserve">Each fact set out below that carries a paragraph number in square brackets was admitted by the Respondent, to the extent recorded in its response of 8 September 2026. A statement without a bracket is drawn from a document identified in Part B.7 or is the Appellant's own evidence; the register at Tab 31, the call statistics and the account of travel and sleep in Stressor 3 are of that kind, and facts 228 to 231 were not admitted. The Commission is asked to decide from the admitted facts what the circumstances were, whether they were reasonable, and how much they contributed to the injury.</w:t>
       </w:r>
     </w:p>
     <w:p>
@@ -847,7 +847,7 @@
           <w:sz w:val="20"/>
           <w:szCs w:val="20"/>
         </w:rPr>
-        <w:t xml:space="preserve">Emergency codes were received and paged through the console throughout the day (Stressor 3(h) below).</w:t>
+        <w:t xml:space="preserve">The console took about 270 to 440 calls on an eight-hour shift (Stressor 3(h)(v) below). Emergency codes were received and paged through it throughout the day (Stressor 3(h)).</w:t>
       </w:r>
     </w:p>
     <w:p>
@@ -2383,7 +2383,7 @@
           <w:sz w:val="20"/>
           <w:szCs w:val="20"/>
         </w:rPr>
-        <w:t xml:space="preserve">The seven-hour figure is the interval between the rostered finish at 23:00 on 17 March 2024 and the rostered commencement at 06:00 on 18 March 2024. The review decision records the Appellant's response of 9 August 2024 that the break "did not include travel time" and that, with travel factored in, the break between shifts would have been less than five hours. [¶ 251] This pleading relies on that admitted record. Separate estimates of time awake, travel, sleep and workload are not part of the admitted facts and are not pleaded.</w:t>
+        <w:t xml:space="preserve">The seven-hour figure is the interval between the rostered finish at 23:00 on 17 March 2024 and the rostered commencement at 06:00 on 18 March 2024. The review decision records the Appellant's response of 9 August 2024 that the break "did not include travel time" and that, with travel factored in, the break between shifts would have been less than five hours. [¶ 251] The Appellant's account is this. His home is on the Gold Coast and the drive to and from Logan Hospital took about an hour each way at those hours. Across the two shifts about four hours were spent driving. When the 17 March shift ended at 23:00 he had been awake and working for about sixteen hours. Of the seven hours before 06:00, two were on the road and at best four to five were available for sleep. The seven hours and the response of 9 August 2024 are the admitted record; the rest of that account is the Appellant's own evidence.</w:t>
       </w:r>
     </w:p>
     <w:p>
@@ -2523,7 +2523,7 @@
           <w:sz w:val="20"/>
           <w:szCs w:val="20"/>
         </w:rPr>
-        <w:t xml:space="preserve">Each emergency code at Logan Hospital is received at the Switchboard, categorised by the operator by the type of emergency, and paged to the response group for that category within the time the procedure allows. [¶ 8] A Code Blue is the call for a medical emergency in which a patient has suffered, or is about to suffer, cardiac or respiratory arrest, and brings the resuscitation team. A MET call is the call for the Medical Emergency Team to a patient whose observations have deteriorated to the hospital's escalation threshold; a Neonatal MET call and a Paediatric MET call are the same call for a newborn and for a child. A Code Grey is the call for a security response to threatening or aggressive behaviour; a Code Black is the call for a security response to a personal threat. The colour codes follow the Australian Standard for emergency control in health care facilities, AS 4083.</w:t>
+        <w:t xml:space="preserve">Each emergency code at Logan Hospital is received at the Switchboard, categorised by the operator by the type of emergency, and paged to the response group for that category within the time the procedure allows. [¶ 8] A Code Blue is the call for a medical emergency in which a patient has suffered, or is about to suffer, cardiac or respiratory arrest, and brings the resuscitation team. A MET call is the call for the Medical Emergency Team to a patient whose observations have deteriorated to the hospital's escalation threshold; a Neonatal MET call and a Paediatric MET call are the same call for a newborn and for a child. A Code Grey is the call for a security response to threatening or aggressive behaviour; a Code Black is the call for a security response to a personal threat. The colour codes follow the Australian Standard for emergency control in health care facilities, AS 4083. Queensland Health's own Code Blue procedure for the Royal Brisbane and Women's Hospital (Procedure 001443, version 5, effective April 2020) states that "there are eight different types of Code Blue", including Medical Emergency, Cardiac Arrest, Neonatal Emergency, and Paediatric Emergency or Paediatric Cardiac Arrest; that "Switchboard Services will activate one or multiple teams to provide a Code Blue response"; and that the response team "will be notified by a paging system from Switchboard Services… identifying the type of Code Blue and the location of the emergency". The Logan Hospital emergency code procedures referred to in the role description [¶ 8] are the equivalent document for Logan Hospital (Part B.7.5).</w:t>
       </w:r>
     </w:p>
     <w:p>
@@ -2616,15 +2616,15 @@
           <w:sz w:val="20"/>
           <w:szCs w:val="20"/>
         </w:rPr>
-        <w:t xml:space="preserve">(i) The leave of 19 March 2024. </w:t>
-      </w:r>
-      <w:r>
-        <w:rPr>
-          <w:rFonts w:ascii="Arial" w:hAnsi="Arial" w:cs="Arial"/>
-          <w:sz w:val="20"/>
-          <w:szCs w:val="20"/>
-        </w:rPr>
-        <w:t xml:space="preserve">The Leave Takings Report produced by Metro South Health in respect of 19 March 2024 records the Leave Category as "Sick", the Leave Type as "Sick Leave", the Time Code as "SCK", the Leave Taken as 7.60 hours and the Leave Status as approved. [¶ 235]</w:t>
+        <w:t xml:space="preserve">(h)(v) The ordinary call load, and the Monday. </w:t>
+      </w:r>
+      <w:r>
+        <w:rPr>
+          <w:rFonts w:ascii="Arial" w:hAnsi="Arial" w:cs="Arial"/>
+          <w:sz w:val="20"/>
+          <w:szCs w:val="20"/>
+        </w:rPr>
+        <w:t xml:space="preserve">In April 2025, during the Appellant's graduated return, the console took between 269 and 444 calls on a single eight-hour shift, an average of about 360, on the monthly call statistics for that period; the highest figure, 444, was the one Monday afternoon shift in that period, 14 April 2025. On the Appellant's account the Monday early shift is the peak of the week: the weekend's backlog, the resumption of clinics and elective lists and the Monday admissions arrive at the console together. The shift of 18 March 2024 was the Monday early shift, the first shift of the working week [¶ 227], and it followed a break of seven hours. [¶ 284]</w:t>
       </w:r>
     </w:p>
     <w:p>
@@ -2634,10 +2634,19 @@
       <w:r>
         <w:rPr>
           <w:rFonts w:ascii="Arial" w:hAnsi="Arial" w:cs="Arial"/>
-          <w:sz w:val="20"/>
-          <w:szCs w:val="20"/>
-        </w:rPr>
-        <w:t xml:space="preserve">The Respondent pleads that the Appellant took leave on 19 March 2024 but says this was paid leave, and that pursuant to clause 18.10 of the Award he is not entitled to fatigue leave because he was not performing overtime. [¶¶ 236 to 237] The Respondent's outlines (Part B.6) give notice that its payroll witness will say the Award's fatigue provision "applies to breaks around overtime, not between two ordinary shifts". On that account, no entitlement to recovery time arose from a seven-hour break between two ordinary shifts. The only protection was the roster itself.</w:t>
+          <w:b/>
+          <w:sz w:val="20"/>
+          <w:szCs w:val="20"/>
+        </w:rPr>
+        <w:t xml:space="preserve">(i) The leave of 19 March 2024. </w:t>
+      </w:r>
+      <w:r>
+        <w:rPr>
+          <w:rFonts w:ascii="Arial" w:hAnsi="Arial" w:cs="Arial"/>
+          <w:sz w:val="20"/>
+          <w:szCs w:val="20"/>
+        </w:rPr>
+        <w:t xml:space="preserve">The Leave Takings Report produced by Metro South Health in respect of 19 March 2024 records the Leave Category as "Sick", the Leave Type as "Sick Leave", the Time Code as "SCK", the Leave Taken as 7.60 hours and the Leave Status as approved. [¶ 235]</w:t>
       </w:r>
     </w:p>
     <w:p>
@@ -2647,19 +2656,10 @@
       <w:r>
         <w:rPr>
           <w:rFonts w:ascii="Arial" w:hAnsi="Arial" w:cs="Arial"/>
-          <w:b/>
-          <w:sz w:val="20"/>
-          <w:szCs w:val="20"/>
-        </w:rPr>
-        <w:t xml:space="preserve">(j) The enquiry of 8 April 2024, the delay, and the refusal of 1 May 2024. </w:t>
-      </w:r>
-      <w:r>
-        <w:rPr>
-          <w:rFonts w:ascii="Arial" w:hAnsi="Arial" w:cs="Arial"/>
-          <w:sz w:val="20"/>
-          <w:szCs w:val="20"/>
-        </w:rPr>
-        <w:t xml:space="preserve">The review decision records: "You emailed Ms Taylor on 8 April 2024 and requested a review of your payment for the pay period between 8 March 2024 and 31 March 2024", noting the Award requirement as to a minimum ten-hour break. [¶¶ 242 to 243]</w:t>
+          <w:sz w:val="20"/>
+          <w:szCs w:val="20"/>
+        </w:rPr>
+        <w:t xml:space="preserve">The Respondent pleads that the Appellant took leave on 19 March 2024 but says this was paid leave, and that pursuant to clause 18.10 of the Award he is not entitled to fatigue leave because he was not performing overtime. [¶¶ 236 to 237] The Respondent's outlines (Part B.6) give notice that its payroll witness will say the Award's fatigue provision "applies to breaks around overtime, not between two ordinary shifts". On that account, no entitlement to recovery time arose from a seven-hour break between two ordinary shifts. The only protection was the roster itself.</w:t>
       </w:r>
     </w:p>
     <w:p>
@@ -2669,10 +2669,19 @@
       <w:r>
         <w:rPr>
           <w:rFonts w:ascii="Arial" w:hAnsi="Arial" w:cs="Arial"/>
-          <w:sz w:val="20"/>
-          <w:szCs w:val="20"/>
-        </w:rPr>
-        <w:t xml:space="preserve">It records that she replied on 9 April 2024 and "added she also escalated your enquiry regarding fatigue leave to Human Resources to confirm policies around this", and that she "proceeded to acknowledge the importance of communication and requested that you raise your concerns with her as soon as they arise so she could action them sooner for you". [¶¶ 244 to 245]</w:t>
+          <w:b/>
+          <w:sz w:val="20"/>
+          <w:szCs w:val="20"/>
+        </w:rPr>
+        <w:t xml:space="preserve">(j) The enquiry of 8 April 2024, the delay, and the refusal of 1 May 2024. </w:t>
+      </w:r>
+      <w:r>
+        <w:rPr>
+          <w:rFonts w:ascii="Arial" w:hAnsi="Arial" w:cs="Arial"/>
+          <w:sz w:val="20"/>
+          <w:szCs w:val="20"/>
+        </w:rPr>
+        <w:t xml:space="preserve">The review decision records: "You emailed Ms Taylor on 8 April 2024 and requested a review of your payment for the pay period between 8 March 2024 and 31 March 2024", noting the Award requirement as to a minimum ten-hour break. [¶¶ 242 to 243]</w:t>
       </w:r>
     </w:p>
     <w:p>
@@ -2685,7 +2694,7 @@
           <w:sz w:val="20"/>
           <w:szCs w:val="20"/>
         </w:rPr>
-        <w:t xml:space="preserve">It records that on 24 April 2024 the Appellant emailed expressing dissatisfaction that it had been more than two weeks without any response or overtime payment. [¶ 246]</w:t>
+        <w:t xml:space="preserve">It records that she replied on 9 April 2024 and "added she also escalated your enquiry regarding fatigue leave to Human Resources to confirm policies around this", and that she "proceeded to acknowledge the importance of communication and requested that you raise your concerns with her as soon as they arise so she could action them sooner for you". [¶¶ 244 to 245]</w:t>
       </w:r>
     </w:p>
     <w:p>
@@ -2698,7 +2707,7 @@
           <w:sz w:val="20"/>
           <w:szCs w:val="20"/>
         </w:rPr>
-        <w:t xml:space="preserve">The Respondent does not allege that any response was made to the fatigue enquiry between 9 April and 1 May 2024; the enquiry of 8 April was answered after 23 days. [¶¶ 249 to 250]</w:t>
+        <w:t xml:space="preserve">It records that on 24 April 2024 the Appellant emailed expressing dissatisfaction that it had been more than two weeks without any response or overtime payment. [¶ 246]</w:t>
       </w:r>
     </w:p>
     <w:p>
@@ -2711,7 +2720,7 @@
           <w:sz w:val="20"/>
           <w:szCs w:val="20"/>
         </w:rPr>
-        <w:t xml:space="preserve">It records that she responded on 1 May 2024 stating that after a consultation with payroll and Human Resources the request for fatigue payment for 18 March 2024 would not be processed due to the existing 8-hour agreement, and noting that he was able to terminate that agreement going forward. [¶¶ 247 to 248]</w:t>
+        <w:t xml:space="preserve">The Respondent does not allege that any response was made to the fatigue enquiry between 9 April and 1 May 2024; the enquiry of 8 April was answered after 23 days. [¶¶ 249 to 250]</w:t>
       </w:r>
     </w:p>
     <w:p>
@@ -2724,7 +2733,7 @@
           <w:sz w:val="20"/>
           <w:szCs w:val="20"/>
         </w:rPr>
-        <w:t xml:space="preserve">It records that payroll was, as at 1 May 2024, still reviewing his entitlements; that the employer did not mention his shift on 18 March 2024; and that there was uncertainty between him and the employer regarding whether the 8-hour agreement continued to apply. [¶¶ 253 to 255]</w:t>
+        <w:t xml:space="preserve">It records that she responded on 1 May 2024 stating that after a consultation with payroll and Human Resources the request for fatigue payment for 18 March 2024 would not be processed due to the existing 8-hour agreement, and noting that he was able to terminate that agreement going forward. [¶¶ 247 to 248]</w:t>
       </w:r>
     </w:p>
     <w:p>
@@ -2737,7 +2746,7 @@
           <w:sz w:val="20"/>
           <w:szCs w:val="20"/>
         </w:rPr>
-        <w:t xml:space="preserve">So the enquiry of 8 April 2024 was answered on 1 May 2024, 23 days later, with a refusal. In between were the acknowledgment of 9 April, the escalation to Human Resources, and the Appellant's email of 24 April; no other response is alleged. [¶¶ 242 to 250]</w:t>
+        <w:t xml:space="preserve">It records that payroll was, as at 1 May 2024, still reviewing his entitlements; that the employer did not mention his shift on 18 March 2024; and that there was uncertainty between him and the employer regarding whether the 8-hour agreement continued to apply. [¶¶ 253 to 255]</w:t>
       </w:r>
     </w:p>
     <w:p>
@@ -2747,19 +2756,10 @@
       <w:r>
         <w:rPr>
           <w:rFonts w:ascii="Arial" w:hAnsi="Arial" w:cs="Arial"/>
-          <w:b/>
-          <w:sz w:val="20"/>
-          <w:szCs w:val="20"/>
-        </w:rPr>
-        <w:t xml:space="preserve">(k) The employer's own fatigue policy. </w:t>
-      </w:r>
-      <w:r>
-        <w:rPr>
-          <w:rFonts w:ascii="Arial" w:hAnsi="Arial" w:cs="Arial"/>
-          <w:sz w:val="20"/>
-          <w:szCs w:val="20"/>
-        </w:rPr>
-        <w:t xml:space="preserve">The review decision records that the policy regarding fatigue leave following weekends and rostered days off is dated June 2020. [¶ 239]</w:t>
+          <w:sz w:val="20"/>
+          <w:szCs w:val="20"/>
+        </w:rPr>
+        <w:t xml:space="preserve">So the enquiry of 8 April 2024 was answered on 1 May 2024, 23 days later, with a refusal. In between were the acknowledgment of 9 April, the escalation to Human Resources, and the Appellant's email of 24 April; no other response is alleged. [¶¶ 242 to 250]</w:t>
       </w:r>
     </w:p>
     <w:p>
@@ -2769,10 +2769,19 @@
       <w:r>
         <w:rPr>
           <w:rFonts w:ascii="Arial" w:hAnsi="Arial" w:cs="Arial"/>
-          <w:sz w:val="20"/>
-          <w:szCs w:val="20"/>
-        </w:rPr>
-        <w:t xml:space="preserve">It records that "The policy notes that many problems can be overcome regarding fatigue leave by either not rostering the employee who is on call for the first shift of the following day and not rostering on call an officer who is rostered for the first shift on the following day." [¶ 240]</w:t>
+          <w:b/>
+          <w:sz w:val="20"/>
+          <w:szCs w:val="20"/>
+        </w:rPr>
+        <w:t xml:space="preserve">(k) The employer's own fatigue policy. </w:t>
+      </w:r>
+      <w:r>
+        <w:rPr>
+          <w:rFonts w:ascii="Arial" w:hAnsi="Arial" w:cs="Arial"/>
+          <w:sz w:val="20"/>
+          <w:szCs w:val="20"/>
+        </w:rPr>
+        <w:t xml:space="preserve">The review decision records that the policy regarding fatigue leave following weekends and rostered days off is dated June 2020. [¶ 239]</w:t>
       </w:r>
     </w:p>
     <w:p>
@@ -2782,19 +2791,10 @@
       <w:r>
         <w:rPr>
           <w:rFonts w:ascii="Arial" w:hAnsi="Arial" w:cs="Arial"/>
-          <w:b/>
-          <w:sz w:val="20"/>
-          <w:szCs w:val="20"/>
-        </w:rPr>
-        <w:t xml:space="preserve">(l) The absence of fatigue risk management at the Switchboard. </w:t>
-      </w:r>
-      <w:r>
-        <w:rPr>
-          <w:rFonts w:ascii="Arial" w:hAnsi="Arial" w:cs="Arial"/>
-          <w:sz w:val="20"/>
-          <w:szCs w:val="20"/>
-        </w:rPr>
-        <w:t xml:space="preserve">By letter of 5 June 2026, reference K-LM26/729, signed by the Chief Executive and addressed to the Commission, Metro South Health stated that the requested fatigue risk management documents "do not exist", that mandatory Fatigue Risk Management System training "only applies to health practitioners and clinical assistants" and that Switchboard staff are non-clinical. [¶¶ 263, 265] It stated that "The implementation of fatigue risk management assessment at Switchboard Logan Hospital occurred after 30 June 2024". [¶ 264] It stated that "there have been no 'consequential' changes to operating procedures over the period requested". [¶ 266] The Respondent does not allege that any fatigue risk assessment was conducted, that fatigue risk management training was provided, that fatigue risk management assessment was implemented at the Switchboard, or that any change was made to the operating procedures of the Switchboard as a consequence of any employee complaint, at any time before 30 June 2024. [¶¶ 269 to 272]</w:t>
+          <w:sz w:val="20"/>
+          <w:szCs w:val="20"/>
+        </w:rPr>
+        <w:t xml:space="preserve">It records that "The policy notes that many problems can be overcome regarding fatigue leave by either not rostering the employee who is on call for the first shift of the following day and not rostering on call an officer who is rostered for the first shift on the following day." [¶ 240]</w:t>
       </w:r>
     </w:p>
     <w:p>
@@ -2808,15 +2808,15 @@
           <w:sz w:val="20"/>
           <w:szCs w:val="20"/>
         </w:rPr>
-        <w:t xml:space="preserve">(l)(i) The employer's own fatigue guideline. </w:t>
-      </w:r>
-      <w:r>
-        <w:rPr>
-          <w:rFonts w:ascii="Arial" w:hAnsi="Arial" w:cs="Arial"/>
-          <w:sz w:val="20"/>
-          <w:szCs w:val="20"/>
-        </w:rPr>
-        <w:t xml:space="preserve">On 20 May 2024 the Director sent Human Resources the Queensland Health Fatigue Risk Management Systems Implementation Guideline, qh-gdl-401-3.3. [¶¶ 222 to 223] Ten days earlier she had written that she and the Manager had run through the Roster Risk Assessment Matrix and "we say at best there would be a rating of 11 which is moderate". [¶ 219] The Respondent disclosed the guideline, with that email chain, on 14 July 2025 (Tab 8A). The following passages are from that disclosed copy.</w:t>
+        <w:t xml:space="preserve">(l) The absence of fatigue risk management at the Switchboard. </w:t>
+      </w:r>
+      <w:r>
+        <w:rPr>
+          <w:rFonts w:ascii="Arial" w:hAnsi="Arial" w:cs="Arial"/>
+          <w:sz w:val="20"/>
+          <w:szCs w:val="20"/>
+        </w:rPr>
+        <w:t xml:space="preserve">By letter of 5 June 2026, reference K-LM26/729, signed by the Chief Executive and addressed to the Commission, Metro South Health stated that the requested fatigue risk management documents "do not exist", that mandatory Fatigue Risk Management System training "only applies to health practitioners and clinical assistants" and that Switchboard staff are non-clinical. [¶¶ 263, 265] It stated that "The implementation of fatigue risk management assessment at Switchboard Logan Hospital occurred after 30 June 2024". [¶ 264] It stated that "there have been no 'consequential' changes to operating procedures over the period requested". [¶ 266] The Respondent does not allege that any fatigue risk assessment was conducted, that fatigue risk management training was provided, that fatigue risk management assessment was implemented at the Switchboard, or that any change was made to the operating procedures of the Switchboard as a consequence of any employee complaint, at any time before 30 June 2024. [¶¶ 269 to 272]</w:t>
       </w:r>
     </w:p>
     <w:p>
@@ -2826,10 +2826,19 @@
       <w:r>
         <w:rPr>
           <w:rFonts w:ascii="Arial" w:hAnsi="Arial" w:cs="Arial"/>
-          <w:sz w:val="20"/>
-          <w:szCs w:val="20"/>
-        </w:rPr>
-        <w:t xml:space="preserve">The guideline defines fatigue as "A state of impaired physical and/or mental performance and lowered alertness arising as a result or combination of physical and mental work, health and psychosocial factors or inadequate restorative sleep", and a fatigue risk management system as "An integrated set of management practices and procedures for monitoring and managing the risks posed to health, safety and wellbeing by fatigue". It defines "Defences in depth" as a "Hazard identification and risk control model that applies a series of layered mechanisms to minimise the occurrence of fatigue related incidents". [Guideline, glossary, p 29]</w:t>
+          <w:b/>
+          <w:sz w:val="20"/>
+          <w:szCs w:val="20"/>
+        </w:rPr>
+        <w:t xml:space="preserve">(l)(i) The employer's own fatigue guideline. </w:t>
+      </w:r>
+      <w:r>
+        <w:rPr>
+          <w:rFonts w:ascii="Arial" w:hAnsi="Arial" w:cs="Arial"/>
+          <w:sz w:val="20"/>
+          <w:szCs w:val="20"/>
+        </w:rPr>
+        <w:t xml:space="preserve">On 20 May 2024 the Director sent Human Resources the Queensland Health Fatigue Risk Management Systems Implementation Guideline, qh-gdl-401-3.3. [¶¶ 222 to 223] Ten days earlier she had written that she and the Manager had run through the Roster Risk Assessment Matrix and "we say at best there would be a rating of 11 which is moderate". [¶ 219] The Respondent disclosed the guideline, with that email chain, on 14 July 2025 (Tab 8A). The following passages are from that disclosed copy.</w:t>
       </w:r>
     </w:p>
     <w:p>
@@ -2842,7 +2851,7 @@
           <w:sz w:val="20"/>
           <w:szCs w:val="20"/>
         </w:rPr>
-        <w:t xml:space="preserve">It provides that "Level 4 controls relate to error tolerance and containment" and that "Error tolerance relates to built-in redundancies that decrease the likelihood that a fatigued individual will make an error which may have catastrophic consequences." [p 21] It lists among its related documents the Hospital and Health Services General Employees (Queensland Health) Award - State 2015 and the "I1 (QH-POL-171) Fatigue risk management policy". [p 27, section 9]</w:t>
+        <w:t xml:space="preserve">The guideline defines fatigue as "A state of impaired physical and/or mental performance and lowered alertness arising as a result or combination of physical and mental work, health and psychosocial factors or inadequate restorative sleep", and a fatigue risk management system as "An integrated set of management practices and procedures for monitoring and managing the risks posed to health, safety and wellbeing by fatigue". It defines "Defences in depth" as a "Hazard identification and risk control model that applies a series of layered mechanisms to minimise the occurrence of fatigue related incidents". [Guideline, glossary, p 29]</w:t>
       </w:r>
     </w:p>
     <w:p>
@@ -2855,7 +2864,7 @@
           <w:sz w:val="20"/>
           <w:szCs w:val="20"/>
         </w:rPr>
-        <w:t xml:space="preserve">On consultation and training, the guideline states: "there is a legislative obligation to consult with workers in relation to hazard identification and the making of decisions about how associated risks can be managed. Consultation requirements for Queensland Health are described in Health, safety and wellbeing consultation standard (QH-IMP-401-2:2020)." It states that information, training and instruction "must have regard for: the nature of the work carried out; the nature of the risks associated with the work; the control measures implemented", and that "where a work unit or an occupational stream has been identified at risk of fatigue, the training provided must consider the above criteria". Its example training matrix (Figure 11) lists, as those to be trained, "Staff at risk of fatigue", "Rostering staff" and "Manager, supervisors, executives", with learning outcomes including "Rostering". [p 26, section 7.1]</w:t>
+        <w:t xml:space="preserve">It provides that "Level 4 controls relate to error tolerance and containment" and that "Error tolerance relates to built-in redundancies that decrease the likelihood that a fatigued individual will make an error which may have catastrophic consequences." [p 21] It lists among its related documents the Hospital and Health Services General Employees (Queensland Health) Award - State 2015 and the "I1 (QH-POL-171) Fatigue risk management policy". [p 27, section 9]</w:t>
       </w:r>
     </w:p>
     <w:p>
@@ -2868,7 +2877,7 @@
           <w:sz w:val="20"/>
           <w:szCs w:val="20"/>
         </w:rPr>
-        <w:t xml:space="preserve">Its supporting documents include the "Fatigue risk assessment tool", the "Individual fatigue likelihood calculator" and the "Samn-Perelli fatigue checklist". [pp 27 to 28, section 9] It defines a "Worker" by reference to section 7 of the WHS Act, including "An employee", and states that "The Department of Health and each of the HHSs are considered to be PCBUs". [pp 29 to 30, section 10] Its version control records that version 1.0 of 10 November 2021 replaced the "Fatigue Risk Management System Resource Pack December 2018 v. 3". [p 30, section 11] Its references include "Queensland Ombudsman (2006). The Neville Report". [p 31, section 12]</w:t>
+        <w:t xml:space="preserve">On consultation and training, the guideline states: "there is a legislative obligation to consult with workers in relation to hazard identification and the making of decisions about how associated risks can be managed. Consultation requirements for Queensland Health are described in Health, safety and wellbeing consultation standard (QH-IMP-401-2:2020)." It states that information, training and instruction "must have regard for: the nature of the work carried out; the nature of the risks associated with the work; the control measures implemented", and that "where a work unit or an occupational stream has been identified at risk of fatigue, the training provided must consider the above criteria". Its example training matrix (Figure 11) lists, as those to be trained, "Staff at risk of fatigue", "Rostering staff" and "Manager, supervisors, executives", with learning outcomes including "Rostering". [p 26, section 7.1]</w:t>
       </w:r>
     </w:p>
     <w:p>
@@ -2881,7 +2890,7 @@
           <w:sz w:val="20"/>
           <w:szCs w:val="20"/>
         </w:rPr>
-        <w:t xml:space="preserve">So the guideline treated the Award under which the Appellant was employed as a supporting document. It treated every employee of a Hospital and Health Service as a worker to whom it applied. It called for consultation with workers on fatigue hazards, and for training of rostering staff and managers. A resource pack had preceded it since December 2018. The Chief Executive's letter states that fatigue risk management assessment at the Switchboard was implemented after 30 June 2024 and that the mandatory training "only applies to health practitioners and clinical assistants". [¶¶ 264 to 265] The Respondent does not allege that any fatigue risk management training was provided to the Appellant, or that any fatigue risk assessment of his position was conducted, before 30 June 2024. [¶¶ 269 to 270]</w:t>
+        <w:t xml:space="preserve">Its supporting documents include the "Fatigue risk assessment tool", the "Individual fatigue likelihood calculator" and the "Samn-Perelli fatigue checklist". [pp 27 to 28, section 9] It defines a "Worker" by reference to section 7 of the WHS Act, including "An employee", and states that "The Department of Health and each of the HHSs are considered to be PCBUs". [pp 29 to 30, section 10] Its version control records that version 1.0 of 10 November 2021 replaced the "Fatigue Risk Management System Resource Pack December 2018 v. 3". [p 30, section 11] Its references include "Queensland Ombudsman (2006). The Neville Report". [p 31, section 12]</w:t>
       </w:r>
     </w:p>
     <w:p>
@@ -2894,7 +2903,42 @@
           <w:sz w:val="20"/>
           <w:szCs w:val="20"/>
         </w:rPr>
+        <w:t xml:space="preserve">So the guideline treated the Award under which the Appellant was employed as a supporting document. It treated every employee of a Hospital and Health Service as a worker to whom it applied. It called for consultation with workers on fatigue hazards, and for training of rostering staff and managers. A resource pack had preceded it since December 2018. The Chief Executive's letter states that fatigue risk management assessment at the Switchboard was implemented after 30 June 2024 and that the mandatory training "only applies to health practitioners and clinical assistants". [¶¶ 264 to 265] The Respondent does not allege that any fatigue risk management training was provided to the Appellant, or that any fatigue risk assessment of his position was conducted, before 30 June 2024. [¶¶ 269 to 270]</w:t>
+      </w:r>
+    </w:p>
+    <w:p>
+      <w:pPr>
+        <w:spacing w:before="0" w:after="100" w:line="264" w:lineRule="auto"/>
+      </w:pPr>
+      <w:r>
+        <w:rPr>
+          <w:rFonts w:ascii="Arial" w:hAnsi="Arial" w:cs="Arial"/>
+          <w:sz w:val="20"/>
+          <w:szCs w:val="20"/>
+        </w:rPr>
         <w:t xml:space="preserve">The guideline the Director sent to Human Resources on 20 May 2024 is the guideline the Chief Executive's letter of 5 June 2026 says was implemented at the Switchboard only "after 30 June 2024" [¶ 264], and the training for which "only applies to health practitioners and clinical assistants" [¶ 265]. The fatigue risk of the Appellant's roster had been assessed by the Director and the Manager as moderate on 10 May 2024 [¶ 219]; no fatigue risk assessment of his position is alleged to have been conducted before 30 June 2024 [¶ 269].</w:t>
+      </w:r>
+    </w:p>
+    <w:p>
+      <w:pPr>
+        <w:spacing w:before="0" w:after="100" w:line="264" w:lineRule="auto"/>
+      </w:pPr>
+      <w:r>
+        <w:rPr>
+          <w:rFonts w:ascii="Arial" w:hAnsi="Arial" w:cs="Arial"/>
+          <w:b/>
+          <w:sz w:val="20"/>
+          <w:szCs w:val="20"/>
+        </w:rPr>
+        <w:t xml:space="preserve">(l)(ii) Where the framework came from. </w:t>
+      </w:r>
+      <w:r>
+        <w:rPr>
+          <w:rFonts w:ascii="Arial" w:hAnsi="Arial" w:cs="Arial"/>
+          <w:sz w:val="20"/>
+          <w:szCs w:val="20"/>
+        </w:rPr>
+        <w:t xml:space="preserve">The guideline's references list "Queensland Ombudsman (2006). The Neville Report". [p 31, section 12] That report followed the death of Elise Neville, aged 10, after her presentation to the Caloundra Hospital emergency department in January 2002, where the only doctor on duty was "in the 20th hour of a continuous shift". The Ombudsman identified "unsafe working hours for junior doctors" and "rostering practices that required excessive hours of work" among the systemic flaws found, wrote that "anyone who is in the 20th hour of a continuous shift must have reduced capacity to assess the situation when it presents itself", and recommended that Queensland Health determine "an interim standard on safe working hours for doctors in public hospitals" and implement "management practices aimed at alleviating the ill-effects of excessive working hours" (Recommendations 4 and 5). Queensland Health's Policy on Medical Fatigue Risk Management took effect on 1 July 2008 and required each health service district to "develop, implement and maintain a fatigue risk management system" for medical officers (Queensland Ombudsman, The Neville Report Update, 2011). The resource pack of December 2018 and the 2021 guideline that replaced it apply the system to every "worker" of a Hospital and Health Service, including "An employee". [pp 29 to 30, section 10; p 30, section 11] The Chief Executive's letter of 5 June 2026 states that the mandatory training "only applies to health practitioners and clinical assistants" and that assessment at the Switchboard was implemented after 30 June 2024. [¶¶ 264 to 265] The Switchboard is where the codes are received and paged. [¶ 8]</w:t>
       </w:r>
     </w:p>
     <w:p>
@@ -5532,7 +5576,7 @@
           <w:sz w:val="20"/>
           <w:szCs w:val="20"/>
         </w:rPr>
-        <w:t xml:space="preserve">The spreadsheet of recorded MET calls for 17 and 18 March 2024, which Metro South Health states is available [¶ 268]. The Logan Hospital emergency code procedures referred to in the role description [¶ 8]. The documents recording the advice of Human Resources on the 8-hour agreement, to which the Respondent's outlines of Ms Taylor and Ms Reese refer (Part B.6) and which neither identifies. The Communication Book, which the Respondent's List of Documents does not list; paragraph 154 of the notice was not admitted. The Respondent's disclosure of July 2025 headed "Disclosure from witness conferencing - Qld Health Payroll" (24 pages): the email of Ms Christensen, Manager Service Delivery, Payroll, to the Respondent of 11 July 2025, and Payslips 01 to 07, including Payslip 06 (pay date 5 June 2024) and Payslip 07 (pay date 2 July 2025), relied upon at Stressor 2(e)(i). The Respondent's disclosure of 11 June 2025 (10 pages): the leave-form walkthrough for Process Reference 15480560, the emails of 15 May 2024 at 1:15 pm and 6:23 pm, the emails of 15 and 16 May 2024 concerning the complaint of 13 May 2024, and the complaint form; relied on at Stressor 1(n) for dates, senders and recipients only.</w:t>
+        <w:t xml:space="preserve">The spreadsheet of recorded MET calls for 17 and 18 March 2024, which Metro South Health states is available [¶ 268]. The Logan Hospital emergency code procedures referred to in the role description [¶ 8]. The documents recording the advice of Human Resources on the 8-hour agreement, to which the Respondent's outlines of Ms Taylor and Ms Reese refer (Part B.6) and which neither identifies. The Communication Book, which the Respondent's List of Documents does not list; paragraph 154 of the notice was not admitted. The Respondent's disclosure of July 2025 headed "Disclosure from witness conferencing - Qld Health Payroll" (24 pages): the email of Ms Christensen, Manager Service Delivery, Payroll, to the Respondent of 11 July 2025, and Payslips 01 to 07, including Payslip 06 (pay date 5 June 2024) and Payslip 07 (pay date 2 July 2025), relied upon at Stressor 2(e)(i). The Respondent's disclosure of 11 June 2025 (10 pages): the leave-form walkthrough for Process Reference 15480560, the emails of 15 May 2024 at 1:15 pm and 6:23 pm, the emails of 15 and 16 May 2024 concerning the complaint of 13 May 2024, and the complaint form; relied on at Stressor 1(n) for dates, senders and recipients only. Public documents relied on at Stressor 3: Queensland Health's Code Blue procedure 001443 (Royal Brisbane and Women's Hospital, version 5, April 2020), at 3(h)(i) for the types of Code Blue and the role of Switchboard Services; the Queensland Ombudsman's Neville Report (June 2006) and its 2011 update, and the Coroner's findings of 12 September 2008, at 3(l)(ii) for the origin of the fatigue framework; the monthly call statistics for April 2025, at 3(h)(v).</w:t>
       </w:r>
     </w:p>
     <w:p>

</xml_diff>

<commit_message>
WC/2024/227: final set as three separate documents — 1.3 'referred', Dr Krishnaiah named at 1.6, s 32(3)(b) aggravation alternative at C.3, B.4 1:15 pm row restored, F.3 condensed; build v3 with two full check passes; s 32 extract filed
Co-Authored-By: Claude Fable 5.1 <noreply@anthropic.com>
Claude-Session: https://claude.ai/code/session_01PbSZiMB1koFR46V5hQyVcy
</commit_message>
<xml_diff>
--- a/wc2024227/drafts/second-amended-9A/2026-10_SECOND_AMENDED_9A_FINAL.docx
+++ b/wc2024227/drafts/second-amended-9A/2026-10_SECOND_AMENDED_9A_FINAL.docx
@@ -191,7 +191,7 @@
           <w:sz w:val="20"/>
           <w:szCs w:val="20"/>
         </w:rPr>
-        <w:t xml:space="preserve">The referral letter of 16 May 2024 (Dr Zhao) renews a referral to a psychiatrist, Dr Amini, for "ongoing care and management". It lists the past medical history as the history-list items "26/10/2022 ADHD" and "26/10/2022 Anxiety". It lists the medications then current; they include no antidepressant, no anti-anxiety medication and no other medication for mental health. [Tab M1.] No appointment with the psychiatrist was obtained on that referral. The referral was made the day after the request to retract at Stressor 1(i). [¶¶ 76 to 77]</w:t>
+        <w:t xml:space="preserve">The referral letter of 16 May 2024 (Dr Zhao) referred the Appellant to a psychiatrist, Dr Amini, for "ongoing care and management". It lists the past medical history as the history-list items "26/10/2022 ADHD" and "26/10/2022 Anxiety". It lists the medications then current; they include no antidepressant, no anti-anxiety medication and no other medication for mental health. [Tab M1.] No appointment with the psychiatrist was obtained on that referral. The referral was made the day after the request to retract at Stressor 1(i). [¶¶ 76 to 77]</w:t>
       </w:r>
     </w:p>
     <w:p>
@@ -272,7 +272,7 @@
           <w:sz w:val="20"/>
           <w:szCs w:val="20"/>
         </w:rPr>
-        <w:t xml:space="preserve">At the first consultation, on the referral, the treating psychiatrist told the Appellant, and confirmed in writing at 11:45 am that day, that he was "suffering from psychological injury of Major Depressive Disorder with anxiety state"; that fluoxetine was increased to two capsules "from today" and Seroquel 25 mg commenced at night, "to restore basic needs- sleep, eating and routine". The Appellant's email of 5:12 pm that day reads "I have finally been able to see a psychiatrist today". [Tab M3; Respondent's item 9.] Read with paragraph 1.5, it records how the injury certified as anxiety and stress on 1 July 2024 had become a depressive disorder by 24 October 2024.</w:t>
+        <w:t xml:space="preserve">At the first consultation, on the referral, the treating psychiatrist, Dr Ravikumar Bangalore Krishnaiah, told the Appellant, and confirmed in writing at 11:45 am that day, that he was "suffering from psychological injury of Major Depressive Disorder with anxiety state"; that fluoxetine was increased to two capsules "from today" and Seroquel 25 mg commenced at night, "to restore basic needs- sleep, eating and routine". The Appellant's email of 5:12 pm that day reads "I have finally been able to see a psychiatrist today". [Tab M3; Respondent's item 9.] Read with paragraph 1.5, it records how the injury certified as anxiety and stress on 1 July 2024 had become a depressive disorder by 24 October 2024.</w:t>
       </w:r>
     </w:p>
     <w:p>
@@ -4966,6 +4966,72 @@
                 <w:sz w:val="17"/>
                 <w:szCs w:val="17"/>
               </w:rPr>
+              <w:t xml:space="preserve">The Appellant's request for the Manager's office hours, 15 May 2024 at 1:15 pm, to the Director's request to retract it, 6:23 pm the same day</w:t>
+            </w:r>
+          </w:p>
+        </w:tc>
+        <w:tc>
+          <w:tcPr/>
+          <w:p>
+            <w:pPr>
+              <w:spacing w:after="0"/>
+            </w:pPr>
+            <w:r>
+              <w:rPr>
+                <w:rFonts w:ascii="Arial" w:hAnsi="Arial" w:cs="Arial"/>
+                <w:sz w:val="17"/>
+                <w:szCs w:val="17"/>
+              </w:rPr>
+              <w:t xml:space="preserve">5 hours, 8 minutes</w:t>
+            </w:r>
+          </w:p>
+        </w:tc>
+        <w:tc>
+          <w:tcPr/>
+          <w:p>
+            <w:pPr>
+              <w:spacing w:after="0"/>
+            </w:pPr>
+            <w:r>
+              <w:rPr>
+                <w:rFonts w:ascii="Arial" w:hAnsi="Arial" w:cs="Arial"/>
+                <w:sz w:val="17"/>
+                <w:szCs w:val="17"/>
+              </w:rPr>
+              <w:t xml:space="preserve">Stressor 1(i)</w:t>
+            </w:r>
+          </w:p>
+        </w:tc>
+        <w:tc>
+          <w:tcPr/>
+          <w:p>
+            <w:pPr>
+              <w:spacing w:after="0"/>
+            </w:pPr>
+            <w:r>
+              <w:rPr>
+                <w:rFonts w:ascii="Arial" w:hAnsi="Arial" w:cs="Arial"/>
+                <w:sz w:val="17"/>
+                <w:szCs w:val="17"/>
+              </w:rPr>
+              <w:t xml:space="preserve">¶¶ 74, 76</w:t>
+            </w:r>
+          </w:p>
+        </w:tc>
+      </w:tr>
+      <w:tr>
+        <w:tc>
+          <w:tcPr/>
+          <w:p>
+            <w:pPr>
+              <w:spacing w:after="0"/>
+            </w:pPr>
+            <w:r>
+              <w:rPr>
+                <w:rFonts w:ascii="Arial" w:hAnsi="Arial" w:cs="Arial"/>
+                <w:sz w:val="17"/>
+                <w:szCs w:val="17"/>
+              </w:rPr>
               <w:t xml:space="preserve">That request to the hours being stated to the department, 17 May 2024 at 9:30 am</w:t>
             </w:r>
           </w:p>
@@ -5103,7 +5169,7 @@
           <w:sz w:val="18"/>
           <w:szCs w:val="18"/>
         </w:rPr>
-        <w:t xml:space="preserve">Particulars: paragraphs 55, 62 to 64, 73 to 74, 79, 81, 92, 97 to 98, 102 to 103, 124 to 125, 185 to 197, 203, 209, 225, 234, 242 to 247, 249 to 251, 260, 284 to 285 of the notice to admit facts served 28 August 2026, admitted 8 September 2026; the Respondent's payroll disclosure of July 2025 (Part B.7.5).</w:t>
+        <w:t xml:space="preserve">Particulars: paragraphs 55, 62 to 64, 73 to 74, 76, 79, 81, 92, 97 to 98, 102 to 103, 124 to 125, 185 to 197, 203, 209, 225, 234, 242 to 247, 249 to 251, 260, 284 to 285 of the notice to admit facts served 28 August 2026, admitted 8 September 2026; the Respondent's payroll disclosure of July 2025 (Part B.7.5).</w:t>
       </w:r>
     </w:p>
     <w:p>
@@ -5661,7 +5727,7 @@
           <w:sz w:val="20"/>
           <w:szCs w:val="20"/>
         </w:rPr>
-        <w:t xml:space="preserve">The Appellant contends that he sustained a personal injury of a psychological nature arising out of, or in the course of, his employment, with employment a significant contributing factor. The injury is the diagnosed condition identified in Part A. It is pleaded as arising from the whole course of conduct in Part B.2, not from an event on a single day. The Respondent's review decision recorded both a psychological injury and employment as a significant contributing factor, while rejecting the claim under section 32(5).</w:t>
+        <w:t xml:space="preserve">The Appellant contends that he sustained a personal injury of a psychological nature arising out of, or in the course of, his employment, with employment a significant contributing factor. The injury is the diagnosed condition identified in Part A. It is pleaded as arising from the whole course of conduct in Part B.2, not from an event on a single day. The Respondent's review decision recorded both a psychological injury and employment as a significant contributing factor, while rejecting the claim under section 32(5). In the alternative, if the entries of 26 October 2022 recorded at paragraph B.1.3 are found to record a pre-existing psychiatric or psychological disorder, the injury is an aggravation of that disorder within section 32(3)(b) of the Act, the Appellant's employment being a significant contributing factor to the aggravation.</w:t>
       </w:r>
     </w:p>
     <w:p>
@@ -6214,7 +6280,7 @@
           <w:sz w:val="20"/>
           <w:szCs w:val="20"/>
         </w:rPr>
-        <w:t xml:space="preserve">The Appellant will contend that the amounts under section 191(2)(a) are inadequate and will seek, for any period in which the Appellant is legally represented, an award of up to 1.5 times those amounts under section 191(3), in total or for any item, having regard to: (a) the work involved: a record of 303 facts of which 298 are admitted, the documents at Annexure A to the notice to admit, non-party disclosure obtained under rule 64G, two notices to admit facts and a notice to admit documents, and the outlines of four witnesses served by the Respondent; and (b) the importance, difficulty and complexity of the matter: an appeal about a psychological injury under section 32(5)(a), which requires each pleaded circumstance to be classified, a finding on the reasonableness of each that is management action, and the weighing of the whole.</w:t>
+        <w:t xml:space="preserve">The Appellant will contend that the amounts under section 191(2)(a) are inadequate and will seek, for any period in which he is legally represented, up to 1.5 times those amounts under section 191(3), having regard to the work involved (a record of 303 facts, 298 of them admitted; the documents at Annexure A to the notice to admit; non-party disclosure under rule 64G; two notices to admit facts and a notice to admit documents; and the four outlines served by the Respondent) and to the importance, difficulty and complexity of an appeal about a psychological injury under section 32(5)(a), which requires each pleaded circumstance to be classified, each management action assessed for reasonableness, and the whole weighed.</w:t>
       </w:r>
     </w:p>
     <w:p>

</xml_diff>

<commit_message>
Change 47: B.3.1 restores the 7 Apr 2026 pleading's post-injury items (a)-(c); set rebuilt and checked
Co-Authored-By: Claude Fable 5.1 <noreply@anthropic.com>
Claude-Session: https://claude.ai/code/session_01PbSZiMB1koFR46V5hQyVcy
</commit_message>
<xml_diff>
--- a/wc2024227/drafts/second-amended-9A/2026-10_SECOND_AMENDED_9A_FINAL.docx
+++ b/wc2024227/drafts/second-amended-9A/2026-10_SECOND_AMENDED_9A_FINAL.docx
@@ -3444,15 +3444,15 @@
           <w:sz w:val="20"/>
           <w:szCs w:val="20"/>
         </w:rPr>
-        <w:t xml:space="preserve">3.1 After the injury - context only, not cause. </w:t>
-      </w:r>
-      <w:r>
-        <w:rPr>
-          <w:rFonts w:ascii="Arial" w:hAnsi="Arial" w:cs="Arial"/>
-          <w:sz w:val="20"/>
-          <w:szCs w:val="20"/>
-        </w:rPr>
-        <w:t xml:space="preserve">The work capacity certificates certify no functional capacity from 1 July to 6 October 2024. Matters after the date of injury are not relied on as causes of it; those stated in this paragraph are stated for context and continuing effect only. The Employee Capability Checklist completed by Dr Day Hong Ma on 3 July 2026 records current capacity and restrictions and the continuing effect of the injury, including "symptom exacerbation on exposure to the identified workplace stressors" [Tab M7]; it is relied on for the effect of the injury and for capacity only, not for cause. The Appellant's present position is this. On 2 July 2026 the employer advised that he could not return to work until a completed Employee Capability Checklist was provided; Dr Ma completed it on 3 July 2026, certifying him fit with restrictions, and the employer has directed him not to attend work since that date, pending its request of 31 July 2026 for further medical information. He has received no wages since 13 July 2026. On 24 August 2026 he authorised the treating psychiatrist to communicate with the employer on his capacity for work. The psychiatrist wrote to the employer on 13 August 2026 and, on 19 August 2026, asked the basis of the request; as at 5 September 2026 that enquiry had not been answered. These are the Appellant's own evidence and are not relied on as causes of the injury.</w:t>
+        <w:t xml:space="preserve">3.1 After the injury - subsequent conduct, relied on for context and continuing effect, not as cause. </w:t>
+      </w:r>
+      <w:r>
+        <w:rPr>
+          <w:rFonts w:ascii="Arial" w:hAnsi="Arial" w:cs="Arial"/>
+          <w:sz w:val="20"/>
+          <w:szCs w:val="20"/>
+        </w:rPr>
+        <w:t xml:space="preserve">The work capacity certificates certify no functional capacity from 1 July to 6 October 2024. Matters after the date of injury are not relied on as causes of it; those stated in this paragraph are stated for context and continuing effect only, as they were at Part B.3 of the Amended Statement filed 7 April 2026. (a) On 12 and 16 July 2024, while on certified leave, the Appellant was required to attend meetings convened by management. (b) On 8 October 2024 the employer terminated his employment on the basis of abandonment of employment, while he held continuous medical certificates; he applied for reinstatement (TD/2024/110) and was reinstated. (c) The Respondent obtained the Appellant's medical records under the Form 29 signed 4 July 2025 without serving that notice on him; on 18 February 2026 it admitted that it did not serve it (Form 24, paragraph 25). Those are the records relied on at Part B.1. The Respondent's amended statement of 13 May 2026 says of (a) to (c) that they post-date the injury and are not relevant; the Appellant relies on them as stated above, and on (c) for the provenance of the medical record. (d) The Employee Capability Checklist completed by Dr Day Hong Ma on 3 July 2026 records current capacity and restrictions and the continuing effect of the injury, including "symptom exacerbation on exposure to the identified workplace stressors" [Tab M7]; it is relied on for the effect of the injury and for capacity only, not for cause. (e) The Appellant's present position is this. On 2 July 2026 the employer advised that he could not return to work until a completed Employee Capability Checklist was provided; Dr Ma completed it on 3 July 2026, certifying him fit with restrictions, and the employer has directed him not to attend work since that date, pending its request of 31 July 2026 for further medical information. He has received no wages since 13 July 2026. On 24 August 2026 he authorised the treating psychiatrist to communicate with the employer on his capacity for work. The psychiatrist wrote to the employer on 13 August 2026 and, on 19 August 2026, asked the basis of the request; as at 5 September 2026 that enquiry had not been answered. These are the Appellant's own evidence and are not relied on as causes of the injury.</w:t>
       </w:r>
     </w:p>
     <w:p>

</xml_diff>